<commit_message>
req doc updates, status notes and phase 2(ex phs 3) summary
</commit_message>
<xml_diff>
--- a/Meta Analysis_NewV1.docx
+++ b/Meta Analysis_NewV1.docx
@@ -1,6 +1,6 @@
 
 <file path=word/document.xml><?xml version="1.0" encoding="utf-8"?>
-<w:document xmlns:wpc="http://schemas.microsoft.com/office/word/2010/wordprocessingCanvas" xmlns:cx="http://schemas.microsoft.com/office/drawing/2014/chartex" xmlns:cx1="http://schemas.microsoft.com/office/drawing/2015/9/8/chartex" xmlns:cx2="http://schemas.microsoft.com/office/drawing/2015/10/21/chartex" xmlns:cx3="http://schemas.microsoft.com/office/drawing/2016/5/9/chartex" xmlns:cx4="http://schemas.microsoft.com/office/drawing/2016/5/10/chartex" xmlns:cx5="http://schemas.microsoft.com/office/drawing/2016/5/11/chartex" xmlns:cx6="http://schemas.microsoft.com/office/drawing/2016/5/12/chartex" xmlns:cx7="http://schemas.microsoft.com/office/drawing/2016/5/13/chartex" xmlns:cx8="http://schemas.microsoft.com/office/drawing/2016/5/14/chartex" xmlns:mc="http://schemas.openxmlformats.org/markup-compatibility/2006" xmlns:aink="http://schemas.microsoft.com/office/drawing/2016/ink" xmlns:am3d="http://schemas.microsoft.com/office/drawing/2017/model3d" xmlns:o="urn:schemas-microsoft-com:office:office" xmlns:oel="http://schemas.microsoft.com/office/2019/extlst" xmlns:r="http://schemas.openxmlformats.org/officeDocument/2006/relationships" xmlns:m="http://schemas.openxmlformats.org/officeDocument/2006/math" xmlns:v="urn:schemas-microsoft-com:vml" xmlns:wp14="http://schemas.microsoft.com/office/word/2010/wordprocessingDrawing" xmlns:wp="http://schemas.openxmlformats.org/drawingml/2006/wordprocessingDrawing" xmlns:w10="urn:schemas-microsoft-com:office:word" xmlns:w="http://schemas.openxmlformats.org/wordprocessingml/2006/main" xmlns:w14="http://schemas.microsoft.com/office/word/2010/wordml" xmlns:w15="http://schemas.microsoft.com/office/word/2012/wordml" xmlns:w16cex="http://schemas.microsoft.com/office/word/2018/wordml/cex" xmlns:w16cid="http://schemas.microsoft.com/office/word/2016/wordml/cid" xmlns:w16="http://schemas.microsoft.com/office/word/2018/wordml" xmlns:w16du="http://schemas.microsoft.com/office/word/2023/wordml/word16du" xmlns:w16sdtdh="http://schemas.microsoft.com/office/word/2020/wordml/sdtdatahash" xmlns:w16sdtfl="http://schemas.microsoft.com/office/word/2024/wordml/sdtformatlock" xmlns:w16se="http://schemas.microsoft.com/office/word/2015/wordml/symex" xmlns:wpg="http://schemas.microsoft.com/office/word/2010/wordprocessingGroup" xmlns:wpi="http://schemas.microsoft.com/office/word/2010/wordprocessingInk" xmlns:wne="http://schemas.microsoft.com/office/word/2006/wordml" xmlns:wps="http://schemas.microsoft.com/office/word/2010/wordprocessingShape" mc:Ignorable="w14 w15 w16se w16cid w16 w16cex w16sdtdh w16sdtfl w16du wp14">
+<w:document xmlns:wpc="http://schemas.microsoft.com/office/word/2010/wordprocessingCanvas" xmlns:cx="http://schemas.microsoft.com/office/drawing/2014/chartex" xmlns:cx1="http://schemas.microsoft.com/office/drawing/2015/9/8/chartex" xmlns:cx2="http://schemas.microsoft.com/office/drawing/2015/10/21/chartex" xmlns:cx3="http://schemas.microsoft.com/office/drawing/2016/5/9/chartex" xmlns:cx4="http://schemas.microsoft.com/office/drawing/2016/5/10/chartex" xmlns:cx5="http://schemas.microsoft.com/office/drawing/2016/5/11/chartex" xmlns:cx6="http://schemas.microsoft.com/office/drawing/2016/5/12/chartex" xmlns:cx7="http://schemas.microsoft.com/office/drawing/2016/5/13/chartex" xmlns:cx8="http://schemas.microsoft.com/office/drawing/2016/5/14/chartex" xmlns:mc="http://schemas.openxmlformats.org/markup-compatibility/2006" xmlns:aink="http://schemas.microsoft.com/office/drawing/2016/ink" xmlns:am3d="http://schemas.microsoft.com/office/drawing/2017/model3d" xmlns:o="urn:schemas-microsoft-com:office:office" xmlns:oel="http://schemas.microsoft.com/office/2019/extlst" xmlns:r="http://schemas.openxmlformats.org/officeDocument/2006/relationships" xmlns:m="http://schemas.openxmlformats.org/officeDocument/2006/math" xmlns:v="urn:schemas-microsoft-com:vml" xmlns:wp14="http://schemas.microsoft.com/office/word/2010/wordprocessingDrawing" xmlns:wp="http://schemas.openxmlformats.org/drawingml/2006/wordprocessingDrawing" xmlns:w10="urn:schemas-microsoft-com:office:word" xmlns:w="http://schemas.openxmlformats.org/wordprocessingml/2006/main" xmlns:w14="http://schemas.microsoft.com/office/word/2010/wordml" xmlns:w15="http://schemas.microsoft.com/office/word/2012/wordml" xmlns:w16cei="http://schemas.microsoft.com/office/word/2026/wordml/cei" xmlns:w16cex="http://schemas.microsoft.com/office/word/2018/wordml/cex" xmlns:w16cid="http://schemas.microsoft.com/office/word/2016/wordml/cid" xmlns:w16="http://schemas.microsoft.com/office/word/2018/wordml" xmlns:w16du="http://schemas.microsoft.com/office/word/2023/wordml/word16du" xmlns:w16sdtdh="http://schemas.microsoft.com/office/word/2020/wordml/sdtdatahash" xmlns:w16sdtfl="http://schemas.microsoft.com/office/word/2024/wordml/sdtformatlock" xmlns:w16se="http://schemas.microsoft.com/office/word/2015/wordml/symex" xmlns:wpg="http://schemas.microsoft.com/office/word/2010/wordprocessingGroup" xmlns:wpi="http://schemas.microsoft.com/office/word/2010/wordprocessingInk" xmlns:wne="http://schemas.microsoft.com/office/word/2006/wordml" xmlns:wps="http://schemas.microsoft.com/office/word/2010/wordprocessingShape" mc:Ignorable="w14 w15 w16se w16cid w16 w16cex w16sdtdh w16sdtfl w16du wp14">
   <w:body>
     <w:p>
       <w:pPr>
@@ -376,7 +376,11 @@
           </w:tcPr>
           <w:p>
             <w:r>
-              <w:t>Create Additional Matrix for Meta analysis</w:t>
+              <w:t xml:space="preserve">Create Additional Matrix for </w:t>
+            </w:r>
+            <w:r>
+              <w:lastRenderedPageBreak/>
+              <w:t>Meta analysis</w:t>
             </w:r>
           </w:p>
         </w:tc>
@@ -387,6 +391,7 @@
           </w:tcPr>
           <w:p>
             <w:r>
+              <w:lastRenderedPageBreak/>
               <w:t xml:space="preserve">Find reports or data for adding more metrics for analysis, and this depends on the scope of the Meta study., </w:t>
             </w:r>
             <w:r>
@@ -405,6 +410,7 @@
               </w:numPr>
             </w:pPr>
             <w:r>
+              <w:lastRenderedPageBreak/>
               <w:t xml:space="preserve">Total Campaign cost </w:t>
             </w:r>
           </w:p>
@@ -477,6 +483,7 @@
           </w:tcPr>
           <w:p>
             <w:r>
+              <w:lastRenderedPageBreak/>
               <w:t xml:space="preserve">~ </w:t>
             </w:r>
             <w:r>
@@ -691,19 +698,15 @@
     <w:p/>
     <w:p>
       <w:r>
-        <w:rPr/>
         <w:t xml:space="preserve"> </w:t>
       </w:r>
       <w:r>
-        <w:rPr/>
         <w:t xml:space="preserve">Stage 2 is semi-automated, but that too specific to one </w:t>
       </w:r>
       <w:r>
-        <w:rPr/>
         <w:t>client,</w:t>
       </w:r>
       <w:r>
-        <w:rPr/>
         <w:t xml:space="preserve"> here is the new proposal to enhance the experience of working on Meta studies</w:t>
       </w:r>
     </w:p>
@@ -958,7 +961,10 @@
         <w:ind w:left="1080"/>
       </w:pPr>
       <w:r>
-        <w:t>Create a copy of the file in the output location.</w:t>
+        <w:t>Create a copy of the file in the output location</w:t>
+      </w:r>
+      <w:r>
+        <w:t xml:space="preserve"> // cool note it </w:t>
       </w:r>
     </w:p>
     <w:p>
@@ -994,6 +1000,9 @@
       <w:r>
         <w:t>Add a new column called Study Name.</w:t>
       </w:r>
+      <w:r>
+        <w:t xml:space="preserve"> // added at the end of the chart </w:t>
+      </w:r>
     </w:p>
     <w:p>
       <w:pPr>
@@ -1011,6 +1020,9 @@
       <w:r>
         <w:t>Populate the Study Name column with the source file name.</w:t>
       </w:r>
+      <w:r>
+        <w:t xml:space="preserve">// got it </w:t>
+      </w:r>
     </w:p>
     <w:p>
       <w:pPr>
@@ -1027,6 +1039,15 @@
       </w:pPr>
       <w:r>
         <w:t>Store the file structure as the reference schema for future validation.</w:t>
+      </w:r>
+      <w:r>
+        <w:t xml:space="preserve"> // </w:t>
+      </w:r>
+      <w:r>
+        <w:t xml:space="preserve">keep the schema of that file </w:t>
+      </w:r>
+      <w:r>
+        <w:t xml:space="preserve">// every file will have the exact same structure </w:t>
       </w:r>
     </w:p>
     <w:p>
@@ -1074,6 +1095,9 @@
       <w:r>
         <w:t>Automatically add the Study Name column.</w:t>
       </w:r>
+      <w:r>
+        <w:t>/// added at the end of the chart</w:t>
+      </w:r>
     </w:p>
     <w:p>
       <w:pPr>
@@ -1091,6 +1115,30 @@
       <w:r>
         <w:t>Validate the file structure against the Master file.</w:t>
       </w:r>
+      <w:r>
+        <w:t xml:space="preserve"> // perform a qc process </w:t>
+      </w:r>
+      <w:r>
+        <w:t xml:space="preserve">// </w:t>
+      </w:r>
+    </w:p>
+    <w:p>
+      <w:pPr>
+        <w:numPr>
+          <w:ilvl w:val="1"/>
+          <w:numId w:val="47"/>
+        </w:numPr>
+        <w:tabs>
+          <w:tab w:val="num" w:pos="1080"/>
+        </w:tabs>
+        <w:spacing w:after="0" w:line="240" w:lineRule="auto"/>
+      </w:pPr>
+      <w:r>
+        <w:t xml:space="preserve">If it fails it should not stop it should skip to the next file and pop up saying this file “xxxx” was not appended correctly </w:t>
+      </w:r>
+      <w:r>
+        <w:t xml:space="preserve">// but it shouldn’t interrupts the process </w:t>
+      </w:r>
     </w:p>
     <w:p>
       <w:pPr>
@@ -1106,7 +1154,19 @@
         <w:ind w:left="1080"/>
       </w:pPr>
       <w:r>
-        <w:t>Append valid files to the Master dataset.</w:t>
+        <w:t>Append valid files to the Master dataset</w:t>
+      </w:r>
+      <w:r>
+        <w:t xml:space="preserve"> // </w:t>
+      </w:r>
+      <w:r>
+        <w:t xml:space="preserve"> </w:t>
+      </w:r>
+      <w:r>
+        <w:t xml:space="preserve">it has to </w:t>
+      </w:r>
+      <w:r>
+        <w:t>read the headers but schema has to follow as per the masters</w:t>
       </w:r>
     </w:p>
     <w:p>
@@ -1124,6 +1184,12 @@
       </w:pPr>
       <w:r>
         <w:t>Generate an exception report for files that fail validation.</w:t>
+      </w:r>
+      <w:r>
+        <w:t xml:space="preserve"> // ok noted, if It fails create a report an downloadable report log </w:t>
+      </w:r>
+      <w:r>
+        <w:t xml:space="preserve">for files that fail validation // </w:t>
       </w:r>
     </w:p>
     <w:p>
@@ -1146,6 +1212,20 @@
         </w:rPr>
         <w:t>Resume Existing Projects</w:t>
       </w:r>
+      <w:r>
+        <w:rPr>
+          <w:b/>
+          <w:bCs/>
+        </w:rPr>
+        <w:t xml:space="preserve"> // </w:t>
+      </w:r>
+      <w:r>
+        <w:rPr>
+          <w:b/>
+          <w:bCs/>
+        </w:rPr>
+        <w:t xml:space="preserve">differences between the NEW project or Existing project </w:t>
+      </w:r>
     </w:p>
     <w:p>
       <w:pPr>
@@ -1180,6 +1260,9 @@
       </w:pPr>
       <w:r>
         <w:t>The system should recognize it as an existing Master file.</w:t>
+      </w:r>
+      <w:r>
+        <w:t xml:space="preserve"> </w:t>
       </w:r>
     </w:p>
     <w:p>
@@ -1256,6 +1339,13 @@
         </w:rPr>
         <w:t>Bulk Folder Processing</w:t>
       </w:r>
+      <w:r>
+        <w:rPr>
+          <w:b/>
+          <w:bCs/>
+        </w:rPr>
+        <w:t xml:space="preserve"> // it should process the full folder with files</w:t>
+      </w:r>
     </w:p>
     <w:p>
       <w:pPr>
@@ -1289,7 +1379,88 @@
         <w:ind w:left="1440"/>
       </w:pPr>
       <w:r>
-        <w:t>Automatically identify the first valid file and create the Master file.</w:t>
+        <w:t>Automatically identify the first valid file and create the Master file</w:t>
+      </w:r>
+      <w:r>
+        <w:t xml:space="preserve"> // </w:t>
+      </w:r>
+    </w:p>
+    <w:p>
+      <w:pPr>
+        <w:numPr>
+          <w:ilvl w:val="2"/>
+          <w:numId w:val="15"/>
+        </w:numPr>
+        <w:tabs>
+          <w:tab w:val="num" w:pos="1440"/>
+        </w:tabs>
+        <w:spacing w:after="0" w:line="240" w:lineRule="auto"/>
+      </w:pPr>
+      <w:r>
+        <w:t>Specify:</w:t>
+      </w:r>
+    </w:p>
+    <w:p>
+      <w:pPr>
+        <w:numPr>
+          <w:ilvl w:val="3"/>
+          <w:numId w:val="15"/>
+        </w:numPr>
+        <w:tabs>
+          <w:tab w:val="num" w:pos="1440"/>
+        </w:tabs>
+        <w:spacing w:after="0" w:line="240" w:lineRule="auto"/>
+      </w:pPr>
+      <w:r>
+        <w:t>Output folder</w:t>
+      </w:r>
+    </w:p>
+    <w:p>
+      <w:pPr>
+        <w:numPr>
+          <w:ilvl w:val="3"/>
+          <w:numId w:val="15"/>
+        </w:numPr>
+        <w:tabs>
+          <w:tab w:val="num" w:pos="1440"/>
+        </w:tabs>
+        <w:spacing w:after="0" w:line="240" w:lineRule="auto"/>
+      </w:pPr>
+      <w:r>
+        <w:t>Input folder</w:t>
+      </w:r>
+    </w:p>
+    <w:p>
+      <w:pPr>
+        <w:numPr>
+          <w:ilvl w:val="3"/>
+          <w:numId w:val="15"/>
+        </w:numPr>
+        <w:tabs>
+          <w:tab w:val="num" w:pos="1440"/>
+        </w:tabs>
+        <w:spacing w:after="0" w:line="240" w:lineRule="auto"/>
+      </w:pPr>
+      <w:r>
+        <w:t xml:space="preserve">Client name </w:t>
+      </w:r>
+    </w:p>
+    <w:p>
+      <w:pPr>
+        <w:numPr>
+          <w:ilvl w:val="3"/>
+          <w:numId w:val="15"/>
+        </w:numPr>
+        <w:tabs>
+          <w:tab w:val="num" w:pos="1440"/>
+        </w:tabs>
+        <w:spacing w:after="0" w:line="240" w:lineRule="auto"/>
+      </w:pPr>
+      <w:r>
+        <w:t xml:space="preserve">User must identify the first file </w:t>
+      </w:r>
+      <w:r>
+        <w:t xml:space="preserve"> </w:t>
       </w:r>
     </w:p>
     <w:p>
@@ -1306,7 +1477,13 @@
         <w:ind w:left="1440"/>
       </w:pPr>
       <w:r>
-        <w:t>Add the Study Name column to each file.</w:t>
+        <w:t>Automatically a</w:t>
+      </w:r>
+      <w:r>
+        <w:t>dd the Study Name column to each file</w:t>
+      </w:r>
+      <w:r>
+        <w:t xml:space="preserve"> // good</w:t>
       </w:r>
     </w:p>
     <w:p>
@@ -1323,7 +1500,10 @@
         <w:ind w:left="1440"/>
       </w:pPr>
       <w:r>
-        <w:t>Append all compatible files automatically.</w:t>
+        <w:t>Append all compatible files automatically</w:t>
+      </w:r>
+      <w:r>
+        <w:t xml:space="preserve"> from In input folder // good </w:t>
       </w:r>
     </w:p>
     <w:p>
@@ -1340,7 +1520,16 @@
         <w:ind w:left="1440"/>
       </w:pPr>
       <w:r>
-        <w:t>Create the final consolidated dataset with no additional user intervention.</w:t>
+        <w:t>Create the final consolidated dataset with no additional user intervention</w:t>
+      </w:r>
+      <w:r>
+        <w:t xml:space="preserve"> // </w:t>
+      </w:r>
+      <w:r>
+        <w:t>cool</w:t>
+      </w:r>
+      <w:r>
+        <w:t>.</w:t>
       </w:r>
     </w:p>
     <w:p>
@@ -1372,6 +1561,9 @@
       <w:r>
         <w:t>The automation should validate each incoming file against the Master structure.</w:t>
       </w:r>
+      <w:r>
+        <w:t xml:space="preserve"> // makes sense </w:t>
+      </w:r>
     </w:p>
     <w:p>
       <w:pPr>
@@ -1414,6 +1606,12 @@
       </w:pPr>
       <w:r>
         <w:t>Identify missing or additional columns.</w:t>
+      </w:r>
+      <w:r>
+        <w:t xml:space="preserve"> // if there are different </w:t>
+      </w:r>
+      <w:r>
+        <w:t>capture the missing or additional column</w:t>
       </w:r>
     </w:p>
     <w:p>
@@ -3239,7 +3437,7 @@
       </w:pPr>
     </w:p>
     <w:sectPr>
-      <w:pgSz w:w="12240" w:h="15840" w:orient="portrait"/>
+      <w:pgSz w:w="12240" w:h="15840"/>
       <w:pgMar w:top="1440" w:right="1440" w:bottom="1440" w:left="1440" w:header="720" w:footer="720" w:gutter="0"/>
       <w:cols w:space="720"/>
       <w:docGrid w:linePitch="360"/>
@@ -3249,7 +3447,7 @@
 </file>
 
 <file path=word/numbering.xml><?xml version="1.0" encoding="utf-8"?>
-<w:numbering xmlns:wpc="http://schemas.microsoft.com/office/word/2010/wordprocessingCanvas" xmlns:cx="http://schemas.microsoft.com/office/drawing/2014/chartex" xmlns:cx1="http://schemas.microsoft.com/office/drawing/2015/9/8/chartex" xmlns:cx2="http://schemas.microsoft.com/office/drawing/2015/10/21/chartex" xmlns:cx3="http://schemas.microsoft.com/office/drawing/2016/5/9/chartex" xmlns:cx4="http://schemas.microsoft.com/office/drawing/2016/5/10/chartex" xmlns:cx5="http://schemas.microsoft.com/office/drawing/2016/5/11/chartex" xmlns:cx6="http://schemas.microsoft.com/office/drawing/2016/5/12/chartex" xmlns:cx7="http://schemas.microsoft.com/office/drawing/2016/5/13/chartex" xmlns:cx8="http://schemas.microsoft.com/office/drawing/2016/5/14/chartex" xmlns:mc="http://schemas.openxmlformats.org/markup-compatibility/2006" xmlns:aink="http://schemas.microsoft.com/office/drawing/2016/ink" xmlns:am3d="http://schemas.microsoft.com/office/drawing/2017/model3d" xmlns:o="urn:schemas-microsoft-com:office:office" xmlns:oel="http://schemas.microsoft.com/office/2019/extlst" xmlns:r="http://schemas.openxmlformats.org/officeDocument/2006/relationships" xmlns:m="http://schemas.openxmlformats.org/officeDocument/2006/math" xmlns:v="urn:schemas-microsoft-com:vml" xmlns:wp14="http://schemas.microsoft.com/office/word/2010/wordprocessingDrawing" xmlns:wp="http://schemas.openxmlformats.org/drawingml/2006/wordprocessingDrawing" xmlns:w10="urn:schemas-microsoft-com:office:word" xmlns:w="http://schemas.openxmlformats.org/wordprocessingml/2006/main" xmlns:w14="http://schemas.microsoft.com/office/word/2010/wordml" xmlns:w15="http://schemas.microsoft.com/office/word/2012/wordml" xmlns:w16cex="http://schemas.microsoft.com/office/word/2018/wordml/cex" xmlns:w16cid="http://schemas.microsoft.com/office/word/2016/wordml/cid" xmlns:w16="http://schemas.microsoft.com/office/word/2018/wordml" xmlns:w16du="http://schemas.microsoft.com/office/word/2023/wordml/word16du" xmlns:w16sdtdh="http://schemas.microsoft.com/office/word/2020/wordml/sdtdatahash" xmlns:w16sdtfl="http://schemas.microsoft.com/office/word/2024/wordml/sdtformatlock" xmlns:w16se="http://schemas.microsoft.com/office/word/2015/wordml/symex" xmlns:wpg="http://schemas.microsoft.com/office/word/2010/wordprocessingGroup" xmlns:wpi="http://schemas.microsoft.com/office/word/2010/wordprocessingInk" xmlns:wne="http://schemas.microsoft.com/office/word/2006/wordml" xmlns:wps="http://schemas.microsoft.com/office/word/2010/wordprocessingShape" mc:Ignorable="w14 w15 w16se w16cid w16 w16cex w16sdtdh w16sdtfl w16du wp14">
+<w:numbering xmlns:wpc="http://schemas.microsoft.com/office/word/2010/wordprocessingCanvas" xmlns:cx="http://schemas.microsoft.com/office/drawing/2014/chartex" xmlns:cx1="http://schemas.microsoft.com/office/drawing/2015/9/8/chartex" xmlns:cx2="http://schemas.microsoft.com/office/drawing/2015/10/21/chartex" xmlns:cx3="http://schemas.microsoft.com/office/drawing/2016/5/9/chartex" xmlns:cx4="http://schemas.microsoft.com/office/drawing/2016/5/10/chartex" xmlns:cx5="http://schemas.microsoft.com/office/drawing/2016/5/11/chartex" xmlns:cx6="http://schemas.microsoft.com/office/drawing/2016/5/12/chartex" xmlns:cx7="http://schemas.microsoft.com/office/drawing/2016/5/13/chartex" xmlns:cx8="http://schemas.microsoft.com/office/drawing/2016/5/14/chartex" xmlns:mc="http://schemas.openxmlformats.org/markup-compatibility/2006" xmlns:aink="http://schemas.microsoft.com/office/drawing/2016/ink" xmlns:am3d="http://schemas.microsoft.com/office/drawing/2017/model3d" xmlns:o="urn:schemas-microsoft-com:office:office" xmlns:oel="http://schemas.microsoft.com/office/2019/extlst" xmlns:r="http://schemas.openxmlformats.org/officeDocument/2006/relationships" xmlns:m="http://schemas.openxmlformats.org/officeDocument/2006/math" xmlns:v="urn:schemas-microsoft-com:vml" xmlns:wp14="http://schemas.microsoft.com/office/word/2010/wordprocessingDrawing" xmlns:wp="http://schemas.openxmlformats.org/drawingml/2006/wordprocessingDrawing" xmlns:w10="urn:schemas-microsoft-com:office:word" xmlns:w="http://schemas.openxmlformats.org/wordprocessingml/2006/main" xmlns:w14="http://schemas.microsoft.com/office/word/2010/wordml" xmlns:w15="http://schemas.microsoft.com/office/word/2012/wordml" xmlns:w16cei="http://schemas.microsoft.com/office/word/2026/wordml/cei" xmlns:w16cex="http://schemas.microsoft.com/office/word/2018/wordml/cex" xmlns:w16cid="http://schemas.microsoft.com/office/word/2016/wordml/cid" xmlns:w16="http://schemas.microsoft.com/office/word/2018/wordml" xmlns:w16du="http://schemas.microsoft.com/office/word/2023/wordml/word16du" xmlns:w16sdtdh="http://schemas.microsoft.com/office/word/2020/wordml/sdtdatahash" xmlns:w16sdtfl="http://schemas.microsoft.com/office/word/2024/wordml/sdtformatlock" xmlns:w16se="http://schemas.microsoft.com/office/word/2015/wordml/symex" xmlns:wpg="http://schemas.microsoft.com/office/word/2010/wordprocessingGroup" xmlns:wpi="http://schemas.microsoft.com/office/word/2010/wordprocessingInk" xmlns:wne="http://schemas.microsoft.com/office/word/2006/wordml" xmlns:wps="http://schemas.microsoft.com/office/word/2010/wordprocessingShape" mc:Ignorable="w14 w15 w16se w16cid w16 w16cex w16sdtdh w16sdtfl w16du wp14">
   <w:abstractNum w:abstractNumId="0" w15:restartNumberingAfterBreak="0">
     <w:nsid w:val="01542A94"/>
     <w:multiLevelType w:val="multilevel"/>
@@ -3266,7 +3464,7 @@
         <w:ind w:left="720" w:hanging="360"/>
       </w:pPr>
       <w:rPr>
-        <w:rFonts w:hint="default" w:ascii="Symbol" w:hAnsi="Symbol"/>
+        <w:rFonts w:ascii="Symbol" w:hAnsi="Symbol" w:hint="default"/>
         <w:sz w:val="20"/>
       </w:rPr>
     </w:lvl>
@@ -3282,7 +3480,7 @@
         <w:ind w:left="1440" w:hanging="360"/>
       </w:pPr>
       <w:rPr>
-        <w:rFonts w:hint="default" w:ascii="Symbol" w:hAnsi="Symbol"/>
+        <w:rFonts w:ascii="Symbol" w:hAnsi="Symbol" w:hint="default"/>
         <w:sz w:val="20"/>
       </w:rPr>
     </w:lvl>
@@ -3298,7 +3496,7 @@
         <w:ind w:left="2160" w:hanging="360"/>
       </w:pPr>
       <w:rPr>
-        <w:rFonts w:hint="default" w:ascii="Symbol" w:hAnsi="Symbol"/>
+        <w:rFonts w:ascii="Symbol" w:hAnsi="Symbol" w:hint="default"/>
         <w:sz w:val="20"/>
       </w:rPr>
     </w:lvl>
@@ -3314,7 +3512,7 @@
         <w:ind w:left="2880" w:hanging="360"/>
       </w:pPr>
       <w:rPr>
-        <w:rFonts w:hint="default" w:ascii="Symbol" w:hAnsi="Symbol"/>
+        <w:rFonts w:ascii="Symbol" w:hAnsi="Symbol" w:hint="default"/>
         <w:sz w:val="20"/>
       </w:rPr>
     </w:lvl>
@@ -3330,7 +3528,7 @@
         <w:ind w:left="3600" w:hanging="360"/>
       </w:pPr>
       <w:rPr>
-        <w:rFonts w:hint="default" w:ascii="Symbol" w:hAnsi="Symbol"/>
+        <w:rFonts w:ascii="Symbol" w:hAnsi="Symbol" w:hint="default"/>
         <w:sz w:val="20"/>
       </w:rPr>
     </w:lvl>
@@ -3346,7 +3544,7 @@
         <w:ind w:left="4320" w:hanging="360"/>
       </w:pPr>
       <w:rPr>
-        <w:rFonts w:hint="default" w:ascii="Symbol" w:hAnsi="Symbol"/>
+        <w:rFonts w:ascii="Symbol" w:hAnsi="Symbol" w:hint="default"/>
         <w:sz w:val="20"/>
       </w:rPr>
     </w:lvl>
@@ -3362,7 +3560,7 @@
         <w:ind w:left="5040" w:hanging="360"/>
       </w:pPr>
       <w:rPr>
-        <w:rFonts w:hint="default" w:ascii="Symbol" w:hAnsi="Symbol"/>
+        <w:rFonts w:ascii="Symbol" w:hAnsi="Symbol" w:hint="default"/>
         <w:sz w:val="20"/>
       </w:rPr>
     </w:lvl>
@@ -3378,7 +3576,7 @@
         <w:ind w:left="5760" w:hanging="360"/>
       </w:pPr>
       <w:rPr>
-        <w:rFonts w:hint="default" w:ascii="Symbol" w:hAnsi="Symbol"/>
+        <w:rFonts w:ascii="Symbol" w:hAnsi="Symbol" w:hint="default"/>
         <w:sz w:val="20"/>
       </w:rPr>
     </w:lvl>
@@ -3394,7 +3592,7 @@
         <w:ind w:left="6480" w:hanging="360"/>
       </w:pPr>
       <w:rPr>
-        <w:rFonts w:hint="default" w:ascii="Symbol" w:hAnsi="Symbol"/>
+        <w:rFonts w:ascii="Symbol" w:hAnsi="Symbol" w:hint="default"/>
         <w:sz w:val="20"/>
       </w:rPr>
     </w:lvl>
@@ -3415,7 +3613,7 @@
         <w:ind w:left="720" w:hanging="360"/>
       </w:pPr>
       <w:rPr>
-        <w:rFonts w:hint="default" w:ascii="Symbol" w:hAnsi="Symbol"/>
+        <w:rFonts w:ascii="Symbol" w:hAnsi="Symbol" w:hint="default"/>
         <w:sz w:val="20"/>
       </w:rPr>
     </w:lvl>
@@ -3431,7 +3629,7 @@
         <w:ind w:left="1440" w:hanging="360"/>
       </w:pPr>
       <w:rPr>
-        <w:rFonts w:hint="default" w:ascii="Courier New" w:hAnsi="Courier New"/>
+        <w:rFonts w:ascii="Courier New" w:hAnsi="Courier New" w:hint="default"/>
         <w:sz w:val="20"/>
       </w:rPr>
     </w:lvl>
@@ -3447,7 +3645,7 @@
         <w:ind w:left="2160" w:hanging="360"/>
       </w:pPr>
       <w:rPr>
-        <w:rFonts w:hint="default" w:ascii="Wingdings" w:hAnsi="Wingdings"/>
+        <w:rFonts w:ascii="Wingdings" w:hAnsi="Wingdings" w:hint="default"/>
         <w:sz w:val="20"/>
       </w:rPr>
     </w:lvl>
@@ -3463,7 +3661,7 @@
         <w:ind w:left="2880" w:hanging="360"/>
       </w:pPr>
       <w:rPr>
-        <w:rFonts w:hint="default" w:ascii="Wingdings" w:hAnsi="Wingdings"/>
+        <w:rFonts w:ascii="Wingdings" w:hAnsi="Wingdings" w:hint="default"/>
         <w:sz w:val="20"/>
       </w:rPr>
     </w:lvl>
@@ -3479,7 +3677,7 @@
         <w:ind w:left="3600" w:hanging="360"/>
       </w:pPr>
       <w:rPr>
-        <w:rFonts w:hint="default" w:ascii="Wingdings" w:hAnsi="Wingdings"/>
+        <w:rFonts w:ascii="Wingdings" w:hAnsi="Wingdings" w:hint="default"/>
         <w:sz w:val="20"/>
       </w:rPr>
     </w:lvl>
@@ -3495,7 +3693,7 @@
         <w:ind w:left="4320" w:hanging="360"/>
       </w:pPr>
       <w:rPr>
-        <w:rFonts w:hint="default" w:ascii="Wingdings" w:hAnsi="Wingdings"/>
+        <w:rFonts w:ascii="Wingdings" w:hAnsi="Wingdings" w:hint="default"/>
         <w:sz w:val="20"/>
       </w:rPr>
     </w:lvl>
@@ -3511,7 +3709,7 @@
         <w:ind w:left="5040" w:hanging="360"/>
       </w:pPr>
       <w:rPr>
-        <w:rFonts w:hint="default" w:ascii="Wingdings" w:hAnsi="Wingdings"/>
+        <w:rFonts w:ascii="Wingdings" w:hAnsi="Wingdings" w:hint="default"/>
         <w:sz w:val="20"/>
       </w:rPr>
     </w:lvl>
@@ -3527,7 +3725,7 @@
         <w:ind w:left="5760" w:hanging="360"/>
       </w:pPr>
       <w:rPr>
-        <w:rFonts w:hint="default" w:ascii="Wingdings" w:hAnsi="Wingdings"/>
+        <w:rFonts w:ascii="Wingdings" w:hAnsi="Wingdings" w:hint="default"/>
         <w:sz w:val="20"/>
       </w:rPr>
     </w:lvl>
@@ -3543,7 +3741,7 @@
         <w:ind w:left="6480" w:hanging="360"/>
       </w:pPr>
       <w:rPr>
-        <w:rFonts w:hint="default" w:ascii="Wingdings" w:hAnsi="Wingdings"/>
+        <w:rFonts w:ascii="Wingdings" w:hAnsi="Wingdings" w:hint="default"/>
         <w:sz w:val="20"/>
       </w:rPr>
     </w:lvl>
@@ -3564,7 +3762,7 @@
         <w:ind w:left="720" w:hanging="360"/>
       </w:pPr>
       <w:rPr>
-        <w:rFonts w:hint="default" w:ascii="Symbol" w:hAnsi="Symbol"/>
+        <w:rFonts w:ascii="Symbol" w:hAnsi="Symbol" w:hint="default"/>
         <w:sz w:val="20"/>
       </w:rPr>
     </w:lvl>
@@ -3580,7 +3778,7 @@
         <w:ind w:left="1440" w:hanging="360"/>
       </w:pPr>
       <w:rPr>
-        <w:rFonts w:hint="default" w:ascii="Symbol" w:hAnsi="Symbol"/>
+        <w:rFonts w:ascii="Symbol" w:hAnsi="Symbol" w:hint="default"/>
         <w:sz w:val="20"/>
       </w:rPr>
     </w:lvl>
@@ -3596,7 +3794,7 @@
         <w:ind w:left="2160" w:hanging="360"/>
       </w:pPr>
       <w:rPr>
-        <w:rFonts w:hint="default" w:ascii="Symbol" w:hAnsi="Symbol"/>
+        <w:rFonts w:ascii="Symbol" w:hAnsi="Symbol" w:hint="default"/>
         <w:sz w:val="20"/>
       </w:rPr>
     </w:lvl>
@@ -3612,7 +3810,7 @@
         <w:ind w:left="2880" w:hanging="360"/>
       </w:pPr>
       <w:rPr>
-        <w:rFonts w:hint="default" w:ascii="Symbol" w:hAnsi="Symbol"/>
+        <w:rFonts w:ascii="Symbol" w:hAnsi="Symbol" w:hint="default"/>
         <w:sz w:val="20"/>
       </w:rPr>
     </w:lvl>
@@ -3628,7 +3826,7 @@
         <w:ind w:left="3600" w:hanging="360"/>
       </w:pPr>
       <w:rPr>
-        <w:rFonts w:hint="default" w:ascii="Symbol" w:hAnsi="Symbol"/>
+        <w:rFonts w:ascii="Symbol" w:hAnsi="Symbol" w:hint="default"/>
         <w:sz w:val="20"/>
       </w:rPr>
     </w:lvl>
@@ -3644,7 +3842,7 @@
         <w:ind w:left="4320" w:hanging="360"/>
       </w:pPr>
       <w:rPr>
-        <w:rFonts w:hint="default" w:ascii="Symbol" w:hAnsi="Symbol"/>
+        <w:rFonts w:ascii="Symbol" w:hAnsi="Symbol" w:hint="default"/>
         <w:sz w:val="20"/>
       </w:rPr>
     </w:lvl>
@@ -3660,7 +3858,7 @@
         <w:ind w:left="5040" w:hanging="360"/>
       </w:pPr>
       <w:rPr>
-        <w:rFonts w:hint="default" w:ascii="Symbol" w:hAnsi="Symbol"/>
+        <w:rFonts w:ascii="Symbol" w:hAnsi="Symbol" w:hint="default"/>
         <w:sz w:val="20"/>
       </w:rPr>
     </w:lvl>
@@ -3676,7 +3874,7 @@
         <w:ind w:left="5760" w:hanging="360"/>
       </w:pPr>
       <w:rPr>
-        <w:rFonts w:hint="default" w:ascii="Symbol" w:hAnsi="Symbol"/>
+        <w:rFonts w:ascii="Symbol" w:hAnsi="Symbol" w:hint="default"/>
         <w:sz w:val="20"/>
       </w:rPr>
     </w:lvl>
@@ -3692,7 +3890,7 @@
         <w:ind w:left="6480" w:hanging="360"/>
       </w:pPr>
       <w:rPr>
-        <w:rFonts w:hint="default" w:ascii="Symbol" w:hAnsi="Symbol"/>
+        <w:rFonts w:ascii="Symbol" w:hAnsi="Symbol" w:hint="default"/>
         <w:sz w:val="20"/>
       </w:rPr>
     </w:lvl>
@@ -3713,7 +3911,7 @@
         <w:ind w:left="720" w:hanging="360"/>
       </w:pPr>
       <w:rPr>
-        <w:rFonts w:hint="default" w:ascii="Symbol" w:hAnsi="Symbol"/>
+        <w:rFonts w:ascii="Symbol" w:hAnsi="Symbol" w:hint="default"/>
         <w:sz w:val="20"/>
       </w:rPr>
     </w:lvl>
@@ -3729,7 +3927,7 @@
         <w:ind w:left="1440" w:hanging="360"/>
       </w:pPr>
       <w:rPr>
-        <w:rFonts w:hint="default" w:ascii="Courier New" w:hAnsi="Courier New"/>
+        <w:rFonts w:ascii="Courier New" w:hAnsi="Courier New" w:hint="default"/>
         <w:sz w:val="20"/>
       </w:rPr>
     </w:lvl>
@@ -3745,7 +3943,7 @@
         <w:ind w:left="2160" w:hanging="360"/>
       </w:pPr>
       <w:rPr>
-        <w:rFonts w:hint="default" w:ascii="Wingdings" w:hAnsi="Wingdings"/>
+        <w:rFonts w:ascii="Wingdings" w:hAnsi="Wingdings" w:hint="default"/>
         <w:sz w:val="20"/>
       </w:rPr>
     </w:lvl>
@@ -3761,7 +3959,7 @@
         <w:ind w:left="2880" w:hanging="360"/>
       </w:pPr>
       <w:rPr>
-        <w:rFonts w:hint="default" w:ascii="Wingdings" w:hAnsi="Wingdings"/>
+        <w:rFonts w:ascii="Wingdings" w:hAnsi="Wingdings" w:hint="default"/>
         <w:sz w:val="20"/>
       </w:rPr>
     </w:lvl>
@@ -3777,7 +3975,7 @@
         <w:ind w:left="3600" w:hanging="360"/>
       </w:pPr>
       <w:rPr>
-        <w:rFonts w:hint="default" w:ascii="Wingdings" w:hAnsi="Wingdings"/>
+        <w:rFonts w:ascii="Wingdings" w:hAnsi="Wingdings" w:hint="default"/>
         <w:sz w:val="20"/>
       </w:rPr>
     </w:lvl>
@@ -3793,7 +3991,7 @@
         <w:ind w:left="4320" w:hanging="360"/>
       </w:pPr>
       <w:rPr>
-        <w:rFonts w:hint="default" w:ascii="Wingdings" w:hAnsi="Wingdings"/>
+        <w:rFonts w:ascii="Wingdings" w:hAnsi="Wingdings" w:hint="default"/>
         <w:sz w:val="20"/>
       </w:rPr>
     </w:lvl>
@@ -3809,7 +4007,7 @@
         <w:ind w:left="5040" w:hanging="360"/>
       </w:pPr>
       <w:rPr>
-        <w:rFonts w:hint="default" w:ascii="Wingdings" w:hAnsi="Wingdings"/>
+        <w:rFonts w:ascii="Wingdings" w:hAnsi="Wingdings" w:hint="default"/>
         <w:sz w:val="20"/>
       </w:rPr>
     </w:lvl>
@@ -3825,7 +4023,7 @@
         <w:ind w:left="5760" w:hanging="360"/>
       </w:pPr>
       <w:rPr>
-        <w:rFonts w:hint="default" w:ascii="Wingdings" w:hAnsi="Wingdings"/>
+        <w:rFonts w:ascii="Wingdings" w:hAnsi="Wingdings" w:hint="default"/>
         <w:sz w:val="20"/>
       </w:rPr>
     </w:lvl>
@@ -3841,7 +4039,7 @@
         <w:ind w:left="6480" w:hanging="360"/>
       </w:pPr>
       <w:rPr>
-        <w:rFonts w:hint="default" w:ascii="Wingdings" w:hAnsi="Wingdings"/>
+        <w:rFonts w:ascii="Wingdings" w:hAnsi="Wingdings" w:hint="default"/>
         <w:sz w:val="20"/>
       </w:rPr>
     </w:lvl>
@@ -3859,7 +4057,7 @@
         <w:ind w:left="720" w:hanging="360"/>
       </w:pPr>
       <w:rPr>
-        <w:rFonts w:hint="default" w:ascii="Symbol" w:hAnsi="Symbol"/>
+        <w:rFonts w:ascii="Symbol" w:hAnsi="Symbol" w:hint="default"/>
       </w:rPr>
     </w:lvl>
     <w:lvl w:ilvl="1" w:tplc="04090003">
@@ -3871,7 +4069,7 @@
         <w:ind w:left="1440" w:hanging="360"/>
       </w:pPr>
       <w:rPr>
-        <w:rFonts w:hint="default" w:ascii="Courier New" w:hAnsi="Courier New" w:cs="Courier New"/>
+        <w:rFonts w:ascii="Courier New" w:hAnsi="Courier New" w:cs="Courier New" w:hint="default"/>
       </w:rPr>
     </w:lvl>
     <w:lvl w:ilvl="2" w:tplc="04090005">
@@ -3883,7 +4081,7 @@
         <w:ind w:left="2160" w:hanging="360"/>
       </w:pPr>
       <w:rPr>
-        <w:rFonts w:hint="default" w:ascii="Wingdings" w:hAnsi="Wingdings"/>
+        <w:rFonts w:ascii="Wingdings" w:hAnsi="Wingdings" w:hint="default"/>
       </w:rPr>
     </w:lvl>
     <w:lvl w:ilvl="3" w:tplc="04090001" w:tentative="1">
@@ -3895,7 +4093,7 @@
         <w:ind w:left="2880" w:hanging="360"/>
       </w:pPr>
       <w:rPr>
-        <w:rFonts w:hint="default" w:ascii="Symbol" w:hAnsi="Symbol"/>
+        <w:rFonts w:ascii="Symbol" w:hAnsi="Symbol" w:hint="default"/>
       </w:rPr>
     </w:lvl>
     <w:lvl w:ilvl="4" w:tplc="04090003" w:tentative="1">
@@ -3907,7 +4105,7 @@
         <w:ind w:left="3600" w:hanging="360"/>
       </w:pPr>
       <w:rPr>
-        <w:rFonts w:hint="default" w:ascii="Courier New" w:hAnsi="Courier New" w:cs="Courier New"/>
+        <w:rFonts w:ascii="Courier New" w:hAnsi="Courier New" w:cs="Courier New" w:hint="default"/>
       </w:rPr>
     </w:lvl>
     <w:lvl w:ilvl="5" w:tplc="04090005" w:tentative="1">
@@ -3919,7 +4117,7 @@
         <w:ind w:left="4320" w:hanging="360"/>
       </w:pPr>
       <w:rPr>
-        <w:rFonts w:hint="default" w:ascii="Wingdings" w:hAnsi="Wingdings"/>
+        <w:rFonts w:ascii="Wingdings" w:hAnsi="Wingdings" w:hint="default"/>
       </w:rPr>
     </w:lvl>
     <w:lvl w:ilvl="6" w:tplc="04090001" w:tentative="1">
@@ -3931,7 +4129,7 @@
         <w:ind w:left="5040" w:hanging="360"/>
       </w:pPr>
       <w:rPr>
-        <w:rFonts w:hint="default" w:ascii="Symbol" w:hAnsi="Symbol"/>
+        <w:rFonts w:ascii="Symbol" w:hAnsi="Symbol" w:hint="default"/>
       </w:rPr>
     </w:lvl>
     <w:lvl w:ilvl="7" w:tplc="04090003" w:tentative="1">
@@ -3943,7 +4141,7 @@
         <w:ind w:left="5760" w:hanging="360"/>
       </w:pPr>
       <w:rPr>
-        <w:rFonts w:hint="default" w:ascii="Courier New" w:hAnsi="Courier New" w:cs="Courier New"/>
+        <w:rFonts w:ascii="Courier New" w:hAnsi="Courier New" w:cs="Courier New" w:hint="default"/>
       </w:rPr>
     </w:lvl>
     <w:lvl w:ilvl="8" w:tplc="04090005" w:tentative="1">
@@ -3955,7 +4153,7 @@
         <w:ind w:left="6480" w:hanging="360"/>
       </w:pPr>
       <w:rPr>
-        <w:rFonts w:hint="default" w:ascii="Wingdings" w:hAnsi="Wingdings"/>
+        <w:rFonts w:ascii="Wingdings" w:hAnsi="Wingdings" w:hint="default"/>
       </w:rPr>
     </w:lvl>
   </w:abstractNum>
@@ -3975,7 +4173,7 @@
         <w:ind w:left="720" w:hanging="360"/>
       </w:pPr>
       <w:rPr>
-        <w:rFonts w:hint="default" w:ascii="Symbol" w:hAnsi="Symbol"/>
+        <w:rFonts w:ascii="Symbol" w:hAnsi="Symbol" w:hint="default"/>
         <w:sz w:val="20"/>
       </w:rPr>
     </w:lvl>
@@ -3991,7 +4189,7 @@
         <w:ind w:left="1440" w:hanging="360"/>
       </w:pPr>
       <w:rPr>
-        <w:rFonts w:hint="default" w:ascii="Symbol" w:hAnsi="Symbol"/>
+        <w:rFonts w:ascii="Symbol" w:hAnsi="Symbol" w:hint="default"/>
         <w:sz w:val="20"/>
       </w:rPr>
     </w:lvl>
@@ -4007,7 +4205,7 @@
         <w:ind w:left="2160" w:hanging="360"/>
       </w:pPr>
       <w:rPr>
-        <w:rFonts w:hint="default" w:ascii="Symbol" w:hAnsi="Symbol"/>
+        <w:rFonts w:ascii="Symbol" w:hAnsi="Symbol" w:hint="default"/>
         <w:sz w:val="20"/>
       </w:rPr>
     </w:lvl>
@@ -4023,7 +4221,7 @@
         <w:ind w:left="2880" w:hanging="360"/>
       </w:pPr>
       <w:rPr>
-        <w:rFonts w:hint="default" w:ascii="Symbol" w:hAnsi="Symbol"/>
+        <w:rFonts w:ascii="Symbol" w:hAnsi="Symbol" w:hint="default"/>
         <w:sz w:val="20"/>
       </w:rPr>
     </w:lvl>
@@ -4039,7 +4237,7 @@
         <w:ind w:left="3600" w:hanging="360"/>
       </w:pPr>
       <w:rPr>
-        <w:rFonts w:hint="default" w:ascii="Symbol" w:hAnsi="Symbol"/>
+        <w:rFonts w:ascii="Symbol" w:hAnsi="Symbol" w:hint="default"/>
         <w:sz w:val="20"/>
       </w:rPr>
     </w:lvl>
@@ -4055,7 +4253,7 @@
         <w:ind w:left="4320" w:hanging="360"/>
       </w:pPr>
       <w:rPr>
-        <w:rFonts w:hint="default" w:ascii="Symbol" w:hAnsi="Symbol"/>
+        <w:rFonts w:ascii="Symbol" w:hAnsi="Symbol" w:hint="default"/>
         <w:sz w:val="20"/>
       </w:rPr>
     </w:lvl>
@@ -4071,7 +4269,7 @@
         <w:ind w:left="5040" w:hanging="360"/>
       </w:pPr>
       <w:rPr>
-        <w:rFonts w:hint="default" w:ascii="Symbol" w:hAnsi="Symbol"/>
+        <w:rFonts w:ascii="Symbol" w:hAnsi="Symbol" w:hint="default"/>
         <w:sz w:val="20"/>
       </w:rPr>
     </w:lvl>
@@ -4087,7 +4285,7 @@
         <w:ind w:left="5760" w:hanging="360"/>
       </w:pPr>
       <w:rPr>
-        <w:rFonts w:hint="default" w:ascii="Symbol" w:hAnsi="Symbol"/>
+        <w:rFonts w:ascii="Symbol" w:hAnsi="Symbol" w:hint="default"/>
         <w:sz w:val="20"/>
       </w:rPr>
     </w:lvl>
@@ -4103,7 +4301,7 @@
         <w:ind w:left="6480" w:hanging="360"/>
       </w:pPr>
       <w:rPr>
-        <w:rFonts w:hint="default" w:ascii="Symbol" w:hAnsi="Symbol"/>
+        <w:rFonts w:ascii="Symbol" w:hAnsi="Symbol" w:hint="default"/>
         <w:sz w:val="20"/>
       </w:rPr>
     </w:lvl>
@@ -4124,7 +4322,7 @@
         <w:ind w:left="720" w:hanging="360"/>
       </w:pPr>
       <w:rPr>
-        <w:rFonts w:hint="default" w:ascii="Symbol" w:hAnsi="Symbol"/>
+        <w:rFonts w:ascii="Symbol" w:hAnsi="Symbol" w:hint="default"/>
         <w:sz w:val="20"/>
       </w:rPr>
     </w:lvl>
@@ -4140,7 +4338,7 @@
         <w:ind w:left="1440" w:hanging="360"/>
       </w:pPr>
       <w:rPr>
-        <w:rFonts w:hint="default" w:ascii="Courier New" w:hAnsi="Courier New"/>
+        <w:rFonts w:ascii="Courier New" w:hAnsi="Courier New" w:hint="default"/>
         <w:sz w:val="20"/>
       </w:rPr>
     </w:lvl>
@@ -4156,7 +4354,7 @@
         <w:ind w:left="2160" w:hanging="360"/>
       </w:pPr>
       <w:rPr>
-        <w:rFonts w:hint="default" w:ascii="Wingdings" w:hAnsi="Wingdings"/>
+        <w:rFonts w:ascii="Wingdings" w:hAnsi="Wingdings" w:hint="default"/>
         <w:sz w:val="20"/>
       </w:rPr>
     </w:lvl>
@@ -4172,7 +4370,7 @@
         <w:ind w:left="2880" w:hanging="360"/>
       </w:pPr>
       <w:rPr>
-        <w:rFonts w:hint="default" w:ascii="Wingdings" w:hAnsi="Wingdings"/>
+        <w:rFonts w:ascii="Wingdings" w:hAnsi="Wingdings" w:hint="default"/>
         <w:sz w:val="20"/>
       </w:rPr>
     </w:lvl>
@@ -4188,7 +4386,7 @@
         <w:ind w:left="3600" w:hanging="360"/>
       </w:pPr>
       <w:rPr>
-        <w:rFonts w:hint="default" w:ascii="Wingdings" w:hAnsi="Wingdings"/>
+        <w:rFonts w:ascii="Wingdings" w:hAnsi="Wingdings" w:hint="default"/>
         <w:sz w:val="20"/>
       </w:rPr>
     </w:lvl>
@@ -4204,7 +4402,7 @@
         <w:ind w:left="4320" w:hanging="360"/>
       </w:pPr>
       <w:rPr>
-        <w:rFonts w:hint="default" w:ascii="Wingdings" w:hAnsi="Wingdings"/>
+        <w:rFonts w:ascii="Wingdings" w:hAnsi="Wingdings" w:hint="default"/>
         <w:sz w:val="20"/>
       </w:rPr>
     </w:lvl>
@@ -4220,7 +4418,7 @@
         <w:ind w:left="5040" w:hanging="360"/>
       </w:pPr>
       <w:rPr>
-        <w:rFonts w:hint="default" w:ascii="Wingdings" w:hAnsi="Wingdings"/>
+        <w:rFonts w:ascii="Wingdings" w:hAnsi="Wingdings" w:hint="default"/>
         <w:sz w:val="20"/>
       </w:rPr>
     </w:lvl>
@@ -4236,7 +4434,7 @@
         <w:ind w:left="5760" w:hanging="360"/>
       </w:pPr>
       <w:rPr>
-        <w:rFonts w:hint="default" w:ascii="Wingdings" w:hAnsi="Wingdings"/>
+        <w:rFonts w:ascii="Wingdings" w:hAnsi="Wingdings" w:hint="default"/>
         <w:sz w:val="20"/>
       </w:rPr>
     </w:lvl>
@@ -4252,7 +4450,7 @@
         <w:ind w:left="6480" w:hanging="360"/>
       </w:pPr>
       <w:rPr>
-        <w:rFonts w:hint="default" w:ascii="Wingdings" w:hAnsi="Wingdings"/>
+        <w:rFonts w:ascii="Wingdings" w:hAnsi="Wingdings" w:hint="default"/>
         <w:sz w:val="20"/>
       </w:rPr>
     </w:lvl>
@@ -4273,7 +4471,7 @@
         <w:ind w:left="720" w:hanging="360"/>
       </w:pPr>
       <w:rPr>
-        <w:rFonts w:hint="default" w:ascii="Symbol" w:hAnsi="Symbol"/>
+        <w:rFonts w:ascii="Symbol" w:hAnsi="Symbol" w:hint="default"/>
         <w:sz w:val="20"/>
       </w:rPr>
     </w:lvl>
@@ -4289,7 +4487,7 @@
         <w:ind w:left="1440" w:hanging="360"/>
       </w:pPr>
       <w:rPr>
-        <w:rFonts w:hint="default" w:ascii="Symbol" w:hAnsi="Symbol"/>
+        <w:rFonts w:ascii="Symbol" w:hAnsi="Symbol" w:hint="default"/>
         <w:sz w:val="20"/>
       </w:rPr>
     </w:lvl>
@@ -4305,7 +4503,7 @@
         <w:ind w:left="2160" w:hanging="360"/>
       </w:pPr>
       <w:rPr>
-        <w:rFonts w:hint="default" w:ascii="Symbol" w:hAnsi="Symbol"/>
+        <w:rFonts w:ascii="Symbol" w:hAnsi="Symbol" w:hint="default"/>
         <w:sz w:val="20"/>
       </w:rPr>
     </w:lvl>
@@ -4321,7 +4519,7 @@
         <w:ind w:left="2880" w:hanging="360"/>
       </w:pPr>
       <w:rPr>
-        <w:rFonts w:hint="default" w:ascii="Symbol" w:hAnsi="Symbol"/>
+        <w:rFonts w:ascii="Symbol" w:hAnsi="Symbol" w:hint="default"/>
         <w:sz w:val="20"/>
       </w:rPr>
     </w:lvl>
@@ -4337,7 +4535,7 @@
         <w:ind w:left="3600" w:hanging="360"/>
       </w:pPr>
       <w:rPr>
-        <w:rFonts w:hint="default" w:ascii="Symbol" w:hAnsi="Symbol"/>
+        <w:rFonts w:ascii="Symbol" w:hAnsi="Symbol" w:hint="default"/>
         <w:sz w:val="20"/>
       </w:rPr>
     </w:lvl>
@@ -4353,7 +4551,7 @@
         <w:ind w:left="4320" w:hanging="360"/>
       </w:pPr>
       <w:rPr>
-        <w:rFonts w:hint="default" w:ascii="Symbol" w:hAnsi="Symbol"/>
+        <w:rFonts w:ascii="Symbol" w:hAnsi="Symbol" w:hint="default"/>
         <w:sz w:val="20"/>
       </w:rPr>
     </w:lvl>
@@ -4369,7 +4567,7 @@
         <w:ind w:left="5040" w:hanging="360"/>
       </w:pPr>
       <w:rPr>
-        <w:rFonts w:hint="default" w:ascii="Symbol" w:hAnsi="Symbol"/>
+        <w:rFonts w:ascii="Symbol" w:hAnsi="Symbol" w:hint="default"/>
         <w:sz w:val="20"/>
       </w:rPr>
     </w:lvl>
@@ -4385,7 +4583,7 @@
         <w:ind w:left="5760" w:hanging="360"/>
       </w:pPr>
       <w:rPr>
-        <w:rFonts w:hint="default" w:ascii="Symbol" w:hAnsi="Symbol"/>
+        <w:rFonts w:ascii="Symbol" w:hAnsi="Symbol" w:hint="default"/>
         <w:sz w:val="20"/>
       </w:rPr>
     </w:lvl>
@@ -4401,7 +4599,7 @@
         <w:ind w:left="6480" w:hanging="360"/>
       </w:pPr>
       <w:rPr>
-        <w:rFonts w:hint="default" w:ascii="Symbol" w:hAnsi="Symbol"/>
+        <w:rFonts w:ascii="Symbol" w:hAnsi="Symbol" w:hint="default"/>
         <w:sz w:val="20"/>
       </w:rPr>
     </w:lvl>
@@ -4422,7 +4620,7 @@
         <w:ind w:left="720" w:hanging="360"/>
       </w:pPr>
       <w:rPr>
-        <w:rFonts w:hint="default" w:ascii="Symbol" w:hAnsi="Symbol"/>
+        <w:rFonts w:ascii="Symbol" w:hAnsi="Symbol" w:hint="default"/>
         <w:sz w:val="20"/>
       </w:rPr>
     </w:lvl>
@@ -4438,7 +4636,7 @@
         <w:ind w:left="1440" w:hanging="360"/>
       </w:pPr>
       <w:rPr>
-        <w:rFonts w:hint="default" w:ascii="Symbol" w:hAnsi="Symbol"/>
+        <w:rFonts w:ascii="Symbol" w:hAnsi="Symbol" w:hint="default"/>
         <w:sz w:val="20"/>
       </w:rPr>
     </w:lvl>
@@ -4454,7 +4652,7 @@
         <w:ind w:left="2160" w:hanging="360"/>
       </w:pPr>
       <w:rPr>
-        <w:rFonts w:hint="default" w:ascii="Symbol" w:hAnsi="Symbol"/>
+        <w:rFonts w:ascii="Symbol" w:hAnsi="Symbol" w:hint="default"/>
         <w:sz w:val="20"/>
       </w:rPr>
     </w:lvl>
@@ -4470,7 +4668,7 @@
         <w:ind w:left="2880" w:hanging="360"/>
       </w:pPr>
       <w:rPr>
-        <w:rFonts w:hint="default" w:ascii="Symbol" w:hAnsi="Symbol"/>
+        <w:rFonts w:ascii="Symbol" w:hAnsi="Symbol" w:hint="default"/>
         <w:sz w:val="20"/>
       </w:rPr>
     </w:lvl>
@@ -4486,7 +4684,7 @@
         <w:ind w:left="3600" w:hanging="360"/>
       </w:pPr>
       <w:rPr>
-        <w:rFonts w:hint="default" w:ascii="Symbol" w:hAnsi="Symbol"/>
+        <w:rFonts w:ascii="Symbol" w:hAnsi="Symbol" w:hint="default"/>
         <w:sz w:val="20"/>
       </w:rPr>
     </w:lvl>
@@ -4502,7 +4700,7 @@
         <w:ind w:left="4320" w:hanging="360"/>
       </w:pPr>
       <w:rPr>
-        <w:rFonts w:hint="default" w:ascii="Symbol" w:hAnsi="Symbol"/>
+        <w:rFonts w:ascii="Symbol" w:hAnsi="Symbol" w:hint="default"/>
         <w:sz w:val="20"/>
       </w:rPr>
     </w:lvl>
@@ -4518,7 +4716,7 @@
         <w:ind w:left="5040" w:hanging="360"/>
       </w:pPr>
       <w:rPr>
-        <w:rFonts w:hint="default" w:ascii="Symbol" w:hAnsi="Symbol"/>
+        <w:rFonts w:ascii="Symbol" w:hAnsi="Symbol" w:hint="default"/>
         <w:sz w:val="20"/>
       </w:rPr>
     </w:lvl>
@@ -4534,7 +4732,7 @@
         <w:ind w:left="5760" w:hanging="360"/>
       </w:pPr>
       <w:rPr>
-        <w:rFonts w:hint="default" w:ascii="Symbol" w:hAnsi="Symbol"/>
+        <w:rFonts w:ascii="Symbol" w:hAnsi="Symbol" w:hint="default"/>
         <w:sz w:val="20"/>
       </w:rPr>
     </w:lvl>
@@ -4550,7 +4748,7 @@
         <w:ind w:left="6480" w:hanging="360"/>
       </w:pPr>
       <w:rPr>
-        <w:rFonts w:hint="default" w:ascii="Symbol" w:hAnsi="Symbol"/>
+        <w:rFonts w:ascii="Symbol" w:hAnsi="Symbol" w:hint="default"/>
         <w:sz w:val="20"/>
       </w:rPr>
     </w:lvl>
@@ -4571,7 +4769,7 @@
         <w:ind w:left="720" w:hanging="360"/>
       </w:pPr>
       <w:rPr>
-        <w:rFonts w:hint="default" w:ascii="Symbol" w:hAnsi="Symbol"/>
+        <w:rFonts w:ascii="Symbol" w:hAnsi="Symbol" w:hint="default"/>
         <w:sz w:val="20"/>
       </w:rPr>
     </w:lvl>
@@ -4587,7 +4785,7 @@
         <w:ind w:left="1440" w:hanging="360"/>
       </w:pPr>
       <w:rPr>
-        <w:rFonts w:hint="default" w:ascii="Symbol" w:hAnsi="Symbol"/>
+        <w:rFonts w:ascii="Symbol" w:hAnsi="Symbol" w:hint="default"/>
         <w:sz w:val="20"/>
       </w:rPr>
     </w:lvl>
@@ -4603,7 +4801,7 @@
         <w:ind w:left="2160" w:hanging="360"/>
       </w:pPr>
       <w:rPr>
-        <w:rFonts w:hint="default" w:ascii="Symbol" w:hAnsi="Symbol"/>
+        <w:rFonts w:ascii="Symbol" w:hAnsi="Symbol" w:hint="default"/>
         <w:sz w:val="20"/>
       </w:rPr>
     </w:lvl>
@@ -4619,7 +4817,7 @@
         <w:ind w:left="2880" w:hanging="360"/>
       </w:pPr>
       <w:rPr>
-        <w:rFonts w:hint="default" w:ascii="Symbol" w:hAnsi="Symbol"/>
+        <w:rFonts w:ascii="Symbol" w:hAnsi="Symbol" w:hint="default"/>
         <w:sz w:val="20"/>
       </w:rPr>
     </w:lvl>
@@ -4635,7 +4833,7 @@
         <w:ind w:left="3600" w:hanging="360"/>
       </w:pPr>
       <w:rPr>
-        <w:rFonts w:hint="default" w:ascii="Symbol" w:hAnsi="Symbol"/>
+        <w:rFonts w:ascii="Symbol" w:hAnsi="Symbol" w:hint="default"/>
         <w:sz w:val="20"/>
       </w:rPr>
     </w:lvl>
@@ -4651,7 +4849,7 @@
         <w:ind w:left="4320" w:hanging="360"/>
       </w:pPr>
       <w:rPr>
-        <w:rFonts w:hint="default" w:ascii="Symbol" w:hAnsi="Symbol"/>
+        <w:rFonts w:ascii="Symbol" w:hAnsi="Symbol" w:hint="default"/>
         <w:sz w:val="20"/>
       </w:rPr>
     </w:lvl>
@@ -4667,7 +4865,7 @@
         <w:ind w:left="5040" w:hanging="360"/>
       </w:pPr>
       <w:rPr>
-        <w:rFonts w:hint="default" w:ascii="Symbol" w:hAnsi="Symbol"/>
+        <w:rFonts w:ascii="Symbol" w:hAnsi="Symbol" w:hint="default"/>
         <w:sz w:val="20"/>
       </w:rPr>
     </w:lvl>
@@ -4683,7 +4881,7 @@
         <w:ind w:left="5760" w:hanging="360"/>
       </w:pPr>
       <w:rPr>
-        <w:rFonts w:hint="default" w:ascii="Symbol" w:hAnsi="Symbol"/>
+        <w:rFonts w:ascii="Symbol" w:hAnsi="Symbol" w:hint="default"/>
         <w:sz w:val="20"/>
       </w:rPr>
     </w:lvl>
@@ -4699,7 +4897,7 @@
         <w:ind w:left="6480" w:hanging="360"/>
       </w:pPr>
       <w:rPr>
-        <w:rFonts w:hint="default" w:ascii="Symbol" w:hAnsi="Symbol"/>
+        <w:rFonts w:ascii="Symbol" w:hAnsi="Symbol" w:hint="default"/>
         <w:sz w:val="20"/>
       </w:rPr>
     </w:lvl>
@@ -4720,7 +4918,7 @@
         <w:ind w:left="720" w:hanging="360"/>
       </w:pPr>
       <w:rPr>
-        <w:rFonts w:hint="default" w:ascii="Symbol" w:hAnsi="Symbol"/>
+        <w:rFonts w:ascii="Symbol" w:hAnsi="Symbol" w:hint="default"/>
         <w:sz w:val="20"/>
       </w:rPr>
     </w:lvl>
@@ -4736,7 +4934,7 @@
         <w:ind w:left="1440" w:hanging="360"/>
       </w:pPr>
       <w:rPr>
-        <w:rFonts w:hint="default" w:ascii="Symbol" w:hAnsi="Symbol"/>
+        <w:rFonts w:ascii="Symbol" w:hAnsi="Symbol" w:hint="default"/>
         <w:sz w:val="20"/>
       </w:rPr>
     </w:lvl>
@@ -4752,7 +4950,7 @@
         <w:ind w:left="2160" w:hanging="360"/>
       </w:pPr>
       <w:rPr>
-        <w:rFonts w:hint="default" w:ascii="Symbol" w:hAnsi="Symbol"/>
+        <w:rFonts w:ascii="Symbol" w:hAnsi="Symbol" w:hint="default"/>
         <w:sz w:val="20"/>
       </w:rPr>
     </w:lvl>
@@ -4768,7 +4966,7 @@
         <w:ind w:left="2880" w:hanging="360"/>
       </w:pPr>
       <w:rPr>
-        <w:rFonts w:hint="default" w:ascii="Symbol" w:hAnsi="Symbol"/>
+        <w:rFonts w:ascii="Symbol" w:hAnsi="Symbol" w:hint="default"/>
         <w:sz w:val="20"/>
       </w:rPr>
     </w:lvl>
@@ -4784,7 +4982,7 @@
         <w:ind w:left="3600" w:hanging="360"/>
       </w:pPr>
       <w:rPr>
-        <w:rFonts w:hint="default" w:ascii="Symbol" w:hAnsi="Symbol"/>
+        <w:rFonts w:ascii="Symbol" w:hAnsi="Symbol" w:hint="default"/>
         <w:sz w:val="20"/>
       </w:rPr>
     </w:lvl>
@@ -4800,7 +4998,7 @@
         <w:ind w:left="4320" w:hanging="360"/>
       </w:pPr>
       <w:rPr>
-        <w:rFonts w:hint="default" w:ascii="Symbol" w:hAnsi="Symbol"/>
+        <w:rFonts w:ascii="Symbol" w:hAnsi="Symbol" w:hint="default"/>
         <w:sz w:val="20"/>
       </w:rPr>
     </w:lvl>
@@ -4816,7 +5014,7 @@
         <w:ind w:left="5040" w:hanging="360"/>
       </w:pPr>
       <w:rPr>
-        <w:rFonts w:hint="default" w:ascii="Symbol" w:hAnsi="Symbol"/>
+        <w:rFonts w:ascii="Symbol" w:hAnsi="Symbol" w:hint="default"/>
         <w:sz w:val="20"/>
       </w:rPr>
     </w:lvl>
@@ -4832,7 +5030,7 @@
         <w:ind w:left="5760" w:hanging="360"/>
       </w:pPr>
       <w:rPr>
-        <w:rFonts w:hint="default" w:ascii="Symbol" w:hAnsi="Symbol"/>
+        <w:rFonts w:ascii="Symbol" w:hAnsi="Symbol" w:hint="default"/>
         <w:sz w:val="20"/>
       </w:rPr>
     </w:lvl>
@@ -4848,7 +5046,7 @@
         <w:ind w:left="6480" w:hanging="360"/>
       </w:pPr>
       <w:rPr>
-        <w:rFonts w:hint="default" w:ascii="Symbol" w:hAnsi="Symbol"/>
+        <w:rFonts w:ascii="Symbol" w:hAnsi="Symbol" w:hint="default"/>
         <w:sz w:val="20"/>
       </w:rPr>
     </w:lvl>
@@ -4869,7 +5067,7 @@
         <w:ind w:left="720" w:hanging="360"/>
       </w:pPr>
       <w:rPr>
-        <w:rFonts w:hint="default" w:ascii="Symbol" w:hAnsi="Symbol"/>
+        <w:rFonts w:ascii="Symbol" w:hAnsi="Symbol" w:hint="default"/>
         <w:sz w:val="20"/>
       </w:rPr>
     </w:lvl>
@@ -4885,7 +5083,7 @@
         <w:ind w:left="1440" w:hanging="360"/>
       </w:pPr>
       <w:rPr>
-        <w:rFonts w:hint="default" w:ascii="Symbol" w:hAnsi="Symbol"/>
+        <w:rFonts w:ascii="Symbol" w:hAnsi="Symbol" w:hint="default"/>
         <w:sz w:val="20"/>
       </w:rPr>
     </w:lvl>
@@ -4901,7 +5099,7 @@
         <w:ind w:left="2160" w:hanging="360"/>
       </w:pPr>
       <w:rPr>
-        <w:rFonts w:hint="default" w:ascii="Symbol" w:hAnsi="Symbol"/>
+        <w:rFonts w:ascii="Symbol" w:hAnsi="Symbol" w:hint="default"/>
         <w:sz w:val="20"/>
       </w:rPr>
     </w:lvl>
@@ -4917,7 +5115,7 @@
         <w:ind w:left="2880" w:hanging="360"/>
       </w:pPr>
       <w:rPr>
-        <w:rFonts w:hint="default" w:ascii="Symbol" w:hAnsi="Symbol"/>
+        <w:rFonts w:ascii="Symbol" w:hAnsi="Symbol" w:hint="default"/>
         <w:sz w:val="20"/>
       </w:rPr>
     </w:lvl>
@@ -4933,7 +5131,7 @@
         <w:ind w:left="3600" w:hanging="360"/>
       </w:pPr>
       <w:rPr>
-        <w:rFonts w:hint="default" w:ascii="Symbol" w:hAnsi="Symbol"/>
+        <w:rFonts w:ascii="Symbol" w:hAnsi="Symbol" w:hint="default"/>
         <w:sz w:val="20"/>
       </w:rPr>
     </w:lvl>
@@ -4949,7 +5147,7 @@
         <w:ind w:left="4320" w:hanging="360"/>
       </w:pPr>
       <w:rPr>
-        <w:rFonts w:hint="default" w:ascii="Symbol" w:hAnsi="Symbol"/>
+        <w:rFonts w:ascii="Symbol" w:hAnsi="Symbol" w:hint="default"/>
         <w:sz w:val="20"/>
       </w:rPr>
     </w:lvl>
@@ -4965,7 +5163,7 @@
         <w:ind w:left="5040" w:hanging="360"/>
       </w:pPr>
       <w:rPr>
-        <w:rFonts w:hint="default" w:ascii="Symbol" w:hAnsi="Symbol"/>
+        <w:rFonts w:ascii="Symbol" w:hAnsi="Symbol" w:hint="default"/>
         <w:sz w:val="20"/>
       </w:rPr>
     </w:lvl>
@@ -4981,7 +5179,7 @@
         <w:ind w:left="5760" w:hanging="360"/>
       </w:pPr>
       <w:rPr>
-        <w:rFonts w:hint="default" w:ascii="Symbol" w:hAnsi="Symbol"/>
+        <w:rFonts w:ascii="Symbol" w:hAnsi="Symbol" w:hint="default"/>
         <w:sz w:val="20"/>
       </w:rPr>
     </w:lvl>
@@ -4997,7 +5195,7 @@
         <w:ind w:left="6480" w:hanging="360"/>
       </w:pPr>
       <w:rPr>
-        <w:rFonts w:hint="default" w:ascii="Symbol" w:hAnsi="Symbol"/>
+        <w:rFonts w:ascii="Symbol" w:hAnsi="Symbol" w:hint="default"/>
         <w:sz w:val="20"/>
       </w:rPr>
     </w:lvl>
@@ -5018,7 +5216,7 @@
         <w:ind w:left="720" w:hanging="360"/>
       </w:pPr>
       <w:rPr>
-        <w:rFonts w:hint="default" w:ascii="Symbol" w:hAnsi="Symbol"/>
+        <w:rFonts w:ascii="Symbol" w:hAnsi="Symbol" w:hint="default"/>
         <w:sz w:val="20"/>
       </w:rPr>
     </w:lvl>
@@ -5034,7 +5232,7 @@
         <w:ind w:left="1440" w:hanging="360"/>
       </w:pPr>
       <w:rPr>
-        <w:rFonts w:hint="default" w:ascii="Symbol" w:hAnsi="Symbol"/>
+        <w:rFonts w:ascii="Symbol" w:hAnsi="Symbol" w:hint="default"/>
         <w:sz w:val="20"/>
       </w:rPr>
     </w:lvl>
@@ -5050,7 +5248,7 @@
         <w:ind w:left="2160" w:hanging="360"/>
       </w:pPr>
       <w:rPr>
-        <w:rFonts w:hint="default" w:ascii="Symbol" w:hAnsi="Symbol"/>
+        <w:rFonts w:ascii="Symbol" w:hAnsi="Symbol" w:hint="default"/>
         <w:sz w:val="20"/>
       </w:rPr>
     </w:lvl>
@@ -5066,7 +5264,7 @@
         <w:ind w:left="2880" w:hanging="360"/>
       </w:pPr>
       <w:rPr>
-        <w:rFonts w:hint="default" w:ascii="Symbol" w:hAnsi="Symbol"/>
+        <w:rFonts w:ascii="Symbol" w:hAnsi="Symbol" w:hint="default"/>
         <w:sz w:val="20"/>
       </w:rPr>
     </w:lvl>
@@ -5082,7 +5280,7 @@
         <w:ind w:left="3600" w:hanging="360"/>
       </w:pPr>
       <w:rPr>
-        <w:rFonts w:hint="default" w:ascii="Symbol" w:hAnsi="Symbol"/>
+        <w:rFonts w:ascii="Symbol" w:hAnsi="Symbol" w:hint="default"/>
         <w:sz w:val="20"/>
       </w:rPr>
     </w:lvl>
@@ -5098,7 +5296,7 @@
         <w:ind w:left="4320" w:hanging="360"/>
       </w:pPr>
       <w:rPr>
-        <w:rFonts w:hint="default" w:ascii="Symbol" w:hAnsi="Symbol"/>
+        <w:rFonts w:ascii="Symbol" w:hAnsi="Symbol" w:hint="default"/>
         <w:sz w:val="20"/>
       </w:rPr>
     </w:lvl>
@@ -5114,7 +5312,7 @@
         <w:ind w:left="5040" w:hanging="360"/>
       </w:pPr>
       <w:rPr>
-        <w:rFonts w:hint="default" w:ascii="Symbol" w:hAnsi="Symbol"/>
+        <w:rFonts w:ascii="Symbol" w:hAnsi="Symbol" w:hint="default"/>
         <w:sz w:val="20"/>
       </w:rPr>
     </w:lvl>
@@ -5130,7 +5328,7 @@
         <w:ind w:left="5760" w:hanging="360"/>
       </w:pPr>
       <w:rPr>
-        <w:rFonts w:hint="default" w:ascii="Symbol" w:hAnsi="Symbol"/>
+        <w:rFonts w:ascii="Symbol" w:hAnsi="Symbol" w:hint="default"/>
         <w:sz w:val="20"/>
       </w:rPr>
     </w:lvl>
@@ -5146,7 +5344,7 @@
         <w:ind w:left="6480" w:hanging="360"/>
       </w:pPr>
       <w:rPr>
-        <w:rFonts w:hint="default" w:ascii="Symbol" w:hAnsi="Symbol"/>
+        <w:rFonts w:ascii="Symbol" w:hAnsi="Symbol" w:hint="default"/>
         <w:sz w:val="20"/>
       </w:rPr>
     </w:lvl>
@@ -5167,7 +5365,7 @@
         <w:ind w:left="720" w:hanging="360"/>
       </w:pPr>
       <w:rPr>
-        <w:rFonts w:hint="default" w:ascii="Symbol" w:hAnsi="Symbol"/>
+        <w:rFonts w:ascii="Symbol" w:hAnsi="Symbol" w:hint="default"/>
         <w:sz w:val="20"/>
       </w:rPr>
     </w:lvl>
@@ -5183,7 +5381,7 @@
         <w:ind w:left="1440" w:hanging="360"/>
       </w:pPr>
       <w:rPr>
-        <w:rFonts w:hint="default" w:ascii="Symbol" w:hAnsi="Symbol"/>
+        <w:rFonts w:ascii="Symbol" w:hAnsi="Symbol" w:hint="default"/>
         <w:sz w:val="20"/>
       </w:rPr>
     </w:lvl>
@@ -5199,7 +5397,7 @@
         <w:ind w:left="2160" w:hanging="360"/>
       </w:pPr>
       <w:rPr>
-        <w:rFonts w:hint="default" w:ascii="Symbol" w:hAnsi="Symbol"/>
+        <w:rFonts w:ascii="Symbol" w:hAnsi="Symbol" w:hint="default"/>
         <w:sz w:val="20"/>
       </w:rPr>
     </w:lvl>
@@ -5215,7 +5413,7 @@
         <w:ind w:left="2880" w:hanging="360"/>
       </w:pPr>
       <w:rPr>
-        <w:rFonts w:hint="default" w:ascii="Symbol" w:hAnsi="Symbol"/>
+        <w:rFonts w:ascii="Symbol" w:hAnsi="Symbol" w:hint="default"/>
         <w:sz w:val="20"/>
       </w:rPr>
     </w:lvl>
@@ -5231,7 +5429,7 @@
         <w:ind w:left="3600" w:hanging="360"/>
       </w:pPr>
       <w:rPr>
-        <w:rFonts w:hint="default" w:ascii="Symbol" w:hAnsi="Symbol"/>
+        <w:rFonts w:ascii="Symbol" w:hAnsi="Symbol" w:hint="default"/>
         <w:sz w:val="20"/>
       </w:rPr>
     </w:lvl>
@@ -5247,7 +5445,7 @@
         <w:ind w:left="4320" w:hanging="360"/>
       </w:pPr>
       <w:rPr>
-        <w:rFonts w:hint="default" w:ascii="Symbol" w:hAnsi="Symbol"/>
+        <w:rFonts w:ascii="Symbol" w:hAnsi="Symbol" w:hint="default"/>
         <w:sz w:val="20"/>
       </w:rPr>
     </w:lvl>
@@ -5263,7 +5461,7 @@
         <w:ind w:left="5040" w:hanging="360"/>
       </w:pPr>
       <w:rPr>
-        <w:rFonts w:hint="default" w:ascii="Symbol" w:hAnsi="Symbol"/>
+        <w:rFonts w:ascii="Symbol" w:hAnsi="Symbol" w:hint="default"/>
         <w:sz w:val="20"/>
       </w:rPr>
     </w:lvl>
@@ -5279,7 +5477,7 @@
         <w:ind w:left="5760" w:hanging="360"/>
       </w:pPr>
       <w:rPr>
-        <w:rFonts w:hint="default" w:ascii="Symbol" w:hAnsi="Symbol"/>
+        <w:rFonts w:ascii="Symbol" w:hAnsi="Symbol" w:hint="default"/>
         <w:sz w:val="20"/>
       </w:rPr>
     </w:lvl>
@@ -5295,7 +5493,7 @@
         <w:ind w:left="6480" w:hanging="360"/>
       </w:pPr>
       <w:rPr>
-        <w:rFonts w:hint="default" w:ascii="Symbol" w:hAnsi="Symbol"/>
+        <w:rFonts w:ascii="Symbol" w:hAnsi="Symbol" w:hint="default"/>
         <w:sz w:val="20"/>
       </w:rPr>
     </w:lvl>
@@ -5316,7 +5514,7 @@
         <w:ind w:left="720" w:hanging="360"/>
       </w:pPr>
       <w:rPr>
-        <w:rFonts w:hint="default" w:ascii="Symbol" w:hAnsi="Symbol"/>
+        <w:rFonts w:ascii="Symbol" w:hAnsi="Symbol" w:hint="default"/>
         <w:sz w:val="20"/>
       </w:rPr>
     </w:lvl>
@@ -5332,7 +5530,7 @@
         <w:ind w:left="1440" w:hanging="360"/>
       </w:pPr>
       <w:rPr>
-        <w:rFonts w:hint="default" w:ascii="Symbol" w:hAnsi="Symbol"/>
+        <w:rFonts w:ascii="Symbol" w:hAnsi="Symbol" w:hint="default"/>
         <w:sz w:val="20"/>
       </w:rPr>
     </w:lvl>
@@ -5348,7 +5546,7 @@
         <w:ind w:left="2160" w:hanging="360"/>
       </w:pPr>
       <w:rPr>
-        <w:rFonts w:hint="default" w:ascii="Symbol" w:hAnsi="Symbol"/>
+        <w:rFonts w:ascii="Symbol" w:hAnsi="Symbol" w:hint="default"/>
         <w:sz w:val="20"/>
       </w:rPr>
     </w:lvl>
@@ -5364,7 +5562,7 @@
         <w:ind w:left="2880" w:hanging="360"/>
       </w:pPr>
       <w:rPr>
-        <w:rFonts w:hint="default" w:ascii="Symbol" w:hAnsi="Symbol"/>
+        <w:rFonts w:ascii="Symbol" w:hAnsi="Symbol" w:hint="default"/>
         <w:sz w:val="20"/>
       </w:rPr>
     </w:lvl>
@@ -5380,7 +5578,7 @@
         <w:ind w:left="3600" w:hanging="360"/>
       </w:pPr>
       <w:rPr>
-        <w:rFonts w:hint="default" w:ascii="Symbol" w:hAnsi="Symbol"/>
+        <w:rFonts w:ascii="Symbol" w:hAnsi="Symbol" w:hint="default"/>
         <w:sz w:val="20"/>
       </w:rPr>
     </w:lvl>
@@ -5396,7 +5594,7 @@
         <w:ind w:left="4320" w:hanging="360"/>
       </w:pPr>
       <w:rPr>
-        <w:rFonts w:hint="default" w:ascii="Symbol" w:hAnsi="Symbol"/>
+        <w:rFonts w:ascii="Symbol" w:hAnsi="Symbol" w:hint="default"/>
         <w:sz w:val="20"/>
       </w:rPr>
     </w:lvl>
@@ -5412,7 +5610,7 @@
         <w:ind w:left="5040" w:hanging="360"/>
       </w:pPr>
       <w:rPr>
-        <w:rFonts w:hint="default" w:ascii="Symbol" w:hAnsi="Symbol"/>
+        <w:rFonts w:ascii="Symbol" w:hAnsi="Symbol" w:hint="default"/>
         <w:sz w:val="20"/>
       </w:rPr>
     </w:lvl>
@@ -5428,7 +5626,7 @@
         <w:ind w:left="5760" w:hanging="360"/>
       </w:pPr>
       <w:rPr>
-        <w:rFonts w:hint="default" w:ascii="Symbol" w:hAnsi="Symbol"/>
+        <w:rFonts w:ascii="Symbol" w:hAnsi="Symbol" w:hint="default"/>
         <w:sz w:val="20"/>
       </w:rPr>
     </w:lvl>
@@ -5444,7 +5642,7 @@
         <w:ind w:left="6480" w:hanging="360"/>
       </w:pPr>
       <w:rPr>
-        <w:rFonts w:hint="default" w:ascii="Symbol" w:hAnsi="Symbol"/>
+        <w:rFonts w:ascii="Symbol" w:hAnsi="Symbol" w:hint="default"/>
         <w:sz w:val="20"/>
       </w:rPr>
     </w:lvl>
@@ -5465,7 +5663,7 @@
         <w:ind w:left="720" w:hanging="360"/>
       </w:pPr>
       <w:rPr>
-        <w:rFonts w:hint="default" w:ascii="Symbol" w:hAnsi="Symbol"/>
+        <w:rFonts w:ascii="Symbol" w:hAnsi="Symbol" w:hint="default"/>
         <w:sz w:val="20"/>
       </w:rPr>
     </w:lvl>
@@ -5481,7 +5679,7 @@
         <w:ind w:left="1440" w:hanging="360"/>
       </w:pPr>
       <w:rPr>
-        <w:rFonts w:hint="default" w:ascii="Courier New" w:hAnsi="Courier New"/>
+        <w:rFonts w:ascii="Courier New" w:hAnsi="Courier New" w:hint="default"/>
         <w:sz w:val="20"/>
       </w:rPr>
     </w:lvl>
@@ -5497,7 +5695,7 @@
         <w:ind w:left="2160" w:hanging="360"/>
       </w:pPr>
       <w:rPr>
-        <w:rFonts w:hint="default" w:ascii="Wingdings" w:hAnsi="Wingdings"/>
+        <w:rFonts w:ascii="Wingdings" w:hAnsi="Wingdings" w:hint="default"/>
         <w:sz w:val="20"/>
       </w:rPr>
     </w:lvl>
@@ -5513,7 +5711,7 @@
         <w:ind w:left="2880" w:hanging="360"/>
       </w:pPr>
       <w:rPr>
-        <w:rFonts w:hint="default" w:ascii="Wingdings" w:hAnsi="Wingdings"/>
+        <w:rFonts w:ascii="Wingdings" w:hAnsi="Wingdings" w:hint="default"/>
         <w:sz w:val="20"/>
       </w:rPr>
     </w:lvl>
@@ -5529,7 +5727,7 @@
         <w:ind w:left="3600" w:hanging="360"/>
       </w:pPr>
       <w:rPr>
-        <w:rFonts w:hint="default" w:ascii="Wingdings" w:hAnsi="Wingdings"/>
+        <w:rFonts w:ascii="Wingdings" w:hAnsi="Wingdings" w:hint="default"/>
         <w:sz w:val="20"/>
       </w:rPr>
     </w:lvl>
@@ -5545,7 +5743,7 @@
         <w:ind w:left="4320" w:hanging="360"/>
       </w:pPr>
       <w:rPr>
-        <w:rFonts w:hint="default" w:ascii="Wingdings" w:hAnsi="Wingdings"/>
+        <w:rFonts w:ascii="Wingdings" w:hAnsi="Wingdings" w:hint="default"/>
         <w:sz w:val="20"/>
       </w:rPr>
     </w:lvl>
@@ -5561,7 +5759,7 @@
         <w:ind w:left="5040" w:hanging="360"/>
       </w:pPr>
       <w:rPr>
-        <w:rFonts w:hint="default" w:ascii="Wingdings" w:hAnsi="Wingdings"/>
+        <w:rFonts w:ascii="Wingdings" w:hAnsi="Wingdings" w:hint="default"/>
         <w:sz w:val="20"/>
       </w:rPr>
     </w:lvl>
@@ -5577,7 +5775,7 @@
         <w:ind w:left="5760" w:hanging="360"/>
       </w:pPr>
       <w:rPr>
-        <w:rFonts w:hint="default" w:ascii="Wingdings" w:hAnsi="Wingdings"/>
+        <w:rFonts w:ascii="Wingdings" w:hAnsi="Wingdings" w:hint="default"/>
         <w:sz w:val="20"/>
       </w:rPr>
     </w:lvl>
@@ -5593,7 +5791,7 @@
         <w:ind w:left="6480" w:hanging="360"/>
       </w:pPr>
       <w:rPr>
-        <w:rFonts w:hint="default" w:ascii="Wingdings" w:hAnsi="Wingdings"/>
+        <w:rFonts w:ascii="Wingdings" w:hAnsi="Wingdings" w:hint="default"/>
         <w:sz w:val="20"/>
       </w:rPr>
     </w:lvl>
@@ -5614,7 +5812,7 @@
         <w:ind w:left="720" w:hanging="360"/>
       </w:pPr>
       <w:rPr>
-        <w:rFonts w:hint="default" w:ascii="Symbol" w:hAnsi="Symbol"/>
+        <w:rFonts w:ascii="Symbol" w:hAnsi="Symbol" w:hint="default"/>
         <w:sz w:val="20"/>
       </w:rPr>
     </w:lvl>
@@ -5630,7 +5828,7 @@
         <w:ind w:left="1440" w:hanging="360"/>
       </w:pPr>
       <w:rPr>
-        <w:rFonts w:hint="default" w:ascii="Symbol" w:hAnsi="Symbol"/>
+        <w:rFonts w:ascii="Symbol" w:hAnsi="Symbol" w:hint="default"/>
         <w:sz w:val="20"/>
       </w:rPr>
     </w:lvl>
@@ -5646,7 +5844,7 @@
         <w:ind w:left="2160" w:hanging="360"/>
       </w:pPr>
       <w:rPr>
-        <w:rFonts w:hint="default" w:ascii="Symbol" w:hAnsi="Symbol"/>
+        <w:rFonts w:ascii="Symbol" w:hAnsi="Symbol" w:hint="default"/>
         <w:sz w:val="20"/>
       </w:rPr>
     </w:lvl>
@@ -5662,7 +5860,7 @@
         <w:ind w:left="2880" w:hanging="360"/>
       </w:pPr>
       <w:rPr>
-        <w:rFonts w:hint="default" w:ascii="Symbol" w:hAnsi="Symbol"/>
+        <w:rFonts w:ascii="Symbol" w:hAnsi="Symbol" w:hint="default"/>
         <w:sz w:val="20"/>
       </w:rPr>
     </w:lvl>
@@ -5678,7 +5876,7 @@
         <w:ind w:left="3600" w:hanging="360"/>
       </w:pPr>
       <w:rPr>
-        <w:rFonts w:hint="default" w:ascii="Symbol" w:hAnsi="Symbol"/>
+        <w:rFonts w:ascii="Symbol" w:hAnsi="Symbol" w:hint="default"/>
         <w:sz w:val="20"/>
       </w:rPr>
     </w:lvl>
@@ -5694,7 +5892,7 @@
         <w:ind w:left="4320" w:hanging="360"/>
       </w:pPr>
       <w:rPr>
-        <w:rFonts w:hint="default" w:ascii="Symbol" w:hAnsi="Symbol"/>
+        <w:rFonts w:ascii="Symbol" w:hAnsi="Symbol" w:hint="default"/>
         <w:sz w:val="20"/>
       </w:rPr>
     </w:lvl>
@@ -5710,7 +5908,7 @@
         <w:ind w:left="5040" w:hanging="360"/>
       </w:pPr>
       <w:rPr>
-        <w:rFonts w:hint="default" w:ascii="Symbol" w:hAnsi="Symbol"/>
+        <w:rFonts w:ascii="Symbol" w:hAnsi="Symbol" w:hint="default"/>
         <w:sz w:val="20"/>
       </w:rPr>
     </w:lvl>
@@ -5726,7 +5924,7 @@
         <w:ind w:left="5760" w:hanging="360"/>
       </w:pPr>
       <w:rPr>
-        <w:rFonts w:hint="default" w:ascii="Symbol" w:hAnsi="Symbol"/>
+        <w:rFonts w:ascii="Symbol" w:hAnsi="Symbol" w:hint="default"/>
         <w:sz w:val="20"/>
       </w:rPr>
     </w:lvl>
@@ -5742,7 +5940,7 @@
         <w:ind w:left="6480" w:hanging="360"/>
       </w:pPr>
       <w:rPr>
-        <w:rFonts w:hint="default" w:ascii="Symbol" w:hAnsi="Symbol"/>
+        <w:rFonts w:ascii="Symbol" w:hAnsi="Symbol" w:hint="default"/>
         <w:sz w:val="20"/>
       </w:rPr>
     </w:lvl>
@@ -5763,7 +5961,7 @@
         <w:ind w:left="720" w:hanging="360"/>
       </w:pPr>
       <w:rPr>
-        <w:rFonts w:hint="default" w:ascii="Symbol" w:hAnsi="Symbol"/>
+        <w:rFonts w:ascii="Symbol" w:hAnsi="Symbol" w:hint="default"/>
         <w:sz w:val="20"/>
       </w:rPr>
     </w:lvl>
@@ -5779,7 +5977,7 @@
         <w:ind w:left="1440" w:hanging="360"/>
       </w:pPr>
       <w:rPr>
-        <w:rFonts w:hint="default" w:ascii="Symbol" w:hAnsi="Symbol"/>
+        <w:rFonts w:ascii="Symbol" w:hAnsi="Symbol" w:hint="default"/>
         <w:sz w:val="20"/>
       </w:rPr>
     </w:lvl>
@@ -5795,7 +5993,7 @@
         <w:ind w:left="2160" w:hanging="360"/>
       </w:pPr>
       <w:rPr>
-        <w:rFonts w:hint="default" w:ascii="Symbol" w:hAnsi="Symbol"/>
+        <w:rFonts w:ascii="Symbol" w:hAnsi="Symbol" w:hint="default"/>
         <w:sz w:val="20"/>
       </w:rPr>
     </w:lvl>
@@ -5811,7 +6009,7 @@
         <w:ind w:left="2880" w:hanging="360"/>
       </w:pPr>
       <w:rPr>
-        <w:rFonts w:hint="default" w:ascii="Symbol" w:hAnsi="Symbol"/>
+        <w:rFonts w:ascii="Symbol" w:hAnsi="Symbol" w:hint="default"/>
         <w:sz w:val="20"/>
       </w:rPr>
     </w:lvl>
@@ -5827,7 +6025,7 @@
         <w:ind w:left="3600" w:hanging="360"/>
       </w:pPr>
       <w:rPr>
-        <w:rFonts w:hint="default" w:ascii="Symbol" w:hAnsi="Symbol"/>
+        <w:rFonts w:ascii="Symbol" w:hAnsi="Symbol" w:hint="default"/>
         <w:sz w:val="20"/>
       </w:rPr>
     </w:lvl>
@@ -5843,7 +6041,7 @@
         <w:ind w:left="4320" w:hanging="360"/>
       </w:pPr>
       <w:rPr>
-        <w:rFonts w:hint="default" w:ascii="Symbol" w:hAnsi="Symbol"/>
+        <w:rFonts w:ascii="Symbol" w:hAnsi="Symbol" w:hint="default"/>
         <w:sz w:val="20"/>
       </w:rPr>
     </w:lvl>
@@ -5859,7 +6057,7 @@
         <w:ind w:left="5040" w:hanging="360"/>
       </w:pPr>
       <w:rPr>
-        <w:rFonts w:hint="default" w:ascii="Symbol" w:hAnsi="Symbol"/>
+        <w:rFonts w:ascii="Symbol" w:hAnsi="Symbol" w:hint="default"/>
         <w:sz w:val="20"/>
       </w:rPr>
     </w:lvl>
@@ -5875,7 +6073,7 @@
         <w:ind w:left="5760" w:hanging="360"/>
       </w:pPr>
       <w:rPr>
-        <w:rFonts w:hint="default" w:ascii="Symbol" w:hAnsi="Symbol"/>
+        <w:rFonts w:ascii="Symbol" w:hAnsi="Symbol" w:hint="default"/>
         <w:sz w:val="20"/>
       </w:rPr>
     </w:lvl>
@@ -5891,7 +6089,7 @@
         <w:ind w:left="6480" w:hanging="360"/>
       </w:pPr>
       <w:rPr>
-        <w:rFonts w:hint="default" w:ascii="Symbol" w:hAnsi="Symbol"/>
+        <w:rFonts w:ascii="Symbol" w:hAnsi="Symbol" w:hint="default"/>
         <w:sz w:val="20"/>
       </w:rPr>
     </w:lvl>
@@ -5912,7 +6110,7 @@
         <w:ind w:left="720" w:hanging="360"/>
       </w:pPr>
       <w:rPr>
-        <w:rFonts w:hint="default" w:ascii="Symbol" w:hAnsi="Symbol"/>
+        <w:rFonts w:ascii="Symbol" w:hAnsi="Symbol" w:hint="default"/>
         <w:sz w:val="20"/>
       </w:rPr>
     </w:lvl>
@@ -5928,7 +6126,7 @@
         <w:ind w:left="1440" w:hanging="360"/>
       </w:pPr>
       <w:rPr>
-        <w:rFonts w:hint="default" w:ascii="Courier New" w:hAnsi="Courier New"/>
+        <w:rFonts w:ascii="Courier New" w:hAnsi="Courier New" w:hint="default"/>
         <w:sz w:val="20"/>
       </w:rPr>
     </w:lvl>
@@ -5944,7 +6142,7 @@
         <w:ind w:left="2160" w:hanging="360"/>
       </w:pPr>
       <w:rPr>
-        <w:rFonts w:hint="default" w:ascii="Wingdings" w:hAnsi="Wingdings"/>
+        <w:rFonts w:ascii="Wingdings" w:hAnsi="Wingdings" w:hint="default"/>
         <w:sz w:val="20"/>
       </w:rPr>
     </w:lvl>
@@ -5960,7 +6158,7 @@
         <w:ind w:left="2880" w:hanging="360"/>
       </w:pPr>
       <w:rPr>
-        <w:rFonts w:hint="default" w:ascii="Wingdings" w:hAnsi="Wingdings"/>
+        <w:rFonts w:ascii="Wingdings" w:hAnsi="Wingdings" w:hint="default"/>
         <w:sz w:val="20"/>
       </w:rPr>
     </w:lvl>
@@ -5976,7 +6174,7 @@
         <w:ind w:left="3600" w:hanging="360"/>
       </w:pPr>
       <w:rPr>
-        <w:rFonts w:hint="default" w:ascii="Wingdings" w:hAnsi="Wingdings"/>
+        <w:rFonts w:ascii="Wingdings" w:hAnsi="Wingdings" w:hint="default"/>
         <w:sz w:val="20"/>
       </w:rPr>
     </w:lvl>
@@ -5992,7 +6190,7 @@
         <w:ind w:left="4320" w:hanging="360"/>
       </w:pPr>
       <w:rPr>
-        <w:rFonts w:hint="default" w:ascii="Wingdings" w:hAnsi="Wingdings"/>
+        <w:rFonts w:ascii="Wingdings" w:hAnsi="Wingdings" w:hint="default"/>
         <w:sz w:val="20"/>
       </w:rPr>
     </w:lvl>
@@ -6008,7 +6206,7 @@
         <w:ind w:left="5040" w:hanging="360"/>
       </w:pPr>
       <w:rPr>
-        <w:rFonts w:hint="default" w:ascii="Wingdings" w:hAnsi="Wingdings"/>
+        <w:rFonts w:ascii="Wingdings" w:hAnsi="Wingdings" w:hint="default"/>
         <w:sz w:val="20"/>
       </w:rPr>
     </w:lvl>
@@ -6024,7 +6222,7 @@
         <w:ind w:left="5760" w:hanging="360"/>
       </w:pPr>
       <w:rPr>
-        <w:rFonts w:hint="default" w:ascii="Wingdings" w:hAnsi="Wingdings"/>
+        <w:rFonts w:ascii="Wingdings" w:hAnsi="Wingdings" w:hint="default"/>
         <w:sz w:val="20"/>
       </w:rPr>
     </w:lvl>
@@ -6040,7 +6238,7 @@
         <w:ind w:left="6480" w:hanging="360"/>
       </w:pPr>
       <w:rPr>
-        <w:rFonts w:hint="default" w:ascii="Wingdings" w:hAnsi="Wingdings"/>
+        <w:rFonts w:ascii="Wingdings" w:hAnsi="Wingdings" w:hint="default"/>
         <w:sz w:val="20"/>
       </w:rPr>
     </w:lvl>
@@ -6061,7 +6259,7 @@
         <w:ind w:left="720" w:hanging="360"/>
       </w:pPr>
       <w:rPr>
-        <w:rFonts w:hint="default" w:ascii="Symbol" w:hAnsi="Symbol"/>
+        <w:rFonts w:ascii="Symbol" w:hAnsi="Symbol" w:hint="default"/>
         <w:sz w:val="20"/>
       </w:rPr>
     </w:lvl>
@@ -6077,7 +6275,7 @@
         <w:ind w:left="1440" w:hanging="360"/>
       </w:pPr>
       <w:rPr>
-        <w:rFonts w:hint="default" w:ascii="Symbol" w:hAnsi="Symbol"/>
+        <w:rFonts w:ascii="Symbol" w:hAnsi="Symbol" w:hint="default"/>
         <w:sz w:val="20"/>
       </w:rPr>
     </w:lvl>
@@ -6093,7 +6291,7 @@
         <w:ind w:left="2160" w:hanging="360"/>
       </w:pPr>
       <w:rPr>
-        <w:rFonts w:hint="default" w:ascii="Symbol" w:hAnsi="Symbol"/>
+        <w:rFonts w:ascii="Symbol" w:hAnsi="Symbol" w:hint="default"/>
         <w:sz w:val="20"/>
       </w:rPr>
     </w:lvl>
@@ -6109,7 +6307,7 @@
         <w:ind w:left="2880" w:hanging="360"/>
       </w:pPr>
       <w:rPr>
-        <w:rFonts w:hint="default" w:ascii="Symbol" w:hAnsi="Symbol"/>
+        <w:rFonts w:ascii="Symbol" w:hAnsi="Symbol" w:hint="default"/>
         <w:sz w:val="20"/>
       </w:rPr>
     </w:lvl>
@@ -6125,7 +6323,7 @@
         <w:ind w:left="3600" w:hanging="360"/>
       </w:pPr>
       <w:rPr>
-        <w:rFonts w:hint="default" w:ascii="Symbol" w:hAnsi="Symbol"/>
+        <w:rFonts w:ascii="Symbol" w:hAnsi="Symbol" w:hint="default"/>
         <w:sz w:val="20"/>
       </w:rPr>
     </w:lvl>
@@ -6141,7 +6339,7 @@
         <w:ind w:left="4320" w:hanging="360"/>
       </w:pPr>
       <w:rPr>
-        <w:rFonts w:hint="default" w:ascii="Symbol" w:hAnsi="Symbol"/>
+        <w:rFonts w:ascii="Symbol" w:hAnsi="Symbol" w:hint="default"/>
         <w:sz w:val="20"/>
       </w:rPr>
     </w:lvl>
@@ -6157,7 +6355,7 @@
         <w:ind w:left="5040" w:hanging="360"/>
       </w:pPr>
       <w:rPr>
-        <w:rFonts w:hint="default" w:ascii="Symbol" w:hAnsi="Symbol"/>
+        <w:rFonts w:ascii="Symbol" w:hAnsi="Symbol" w:hint="default"/>
         <w:sz w:val="20"/>
       </w:rPr>
     </w:lvl>
@@ -6173,7 +6371,7 @@
         <w:ind w:left="5760" w:hanging="360"/>
       </w:pPr>
       <w:rPr>
-        <w:rFonts w:hint="default" w:ascii="Symbol" w:hAnsi="Symbol"/>
+        <w:rFonts w:ascii="Symbol" w:hAnsi="Symbol" w:hint="default"/>
         <w:sz w:val="20"/>
       </w:rPr>
     </w:lvl>
@@ -6189,7 +6387,7 @@
         <w:ind w:left="6480" w:hanging="360"/>
       </w:pPr>
       <w:rPr>
-        <w:rFonts w:hint="default" w:ascii="Symbol" w:hAnsi="Symbol"/>
+        <w:rFonts w:ascii="Symbol" w:hAnsi="Symbol" w:hint="default"/>
         <w:sz w:val="20"/>
       </w:rPr>
     </w:lvl>
@@ -6210,7 +6408,7 @@
         <w:ind w:left="720" w:hanging="360"/>
       </w:pPr>
       <w:rPr>
-        <w:rFonts w:hint="default" w:ascii="Symbol" w:hAnsi="Symbol"/>
+        <w:rFonts w:ascii="Symbol" w:hAnsi="Symbol" w:hint="default"/>
         <w:sz w:val="20"/>
       </w:rPr>
     </w:lvl>
@@ -6226,7 +6424,7 @@
         <w:ind w:left="1440" w:hanging="360"/>
       </w:pPr>
       <w:rPr>
-        <w:rFonts w:hint="default" w:ascii="Symbol" w:hAnsi="Symbol"/>
+        <w:rFonts w:ascii="Symbol" w:hAnsi="Symbol" w:hint="default"/>
         <w:sz w:val="20"/>
       </w:rPr>
     </w:lvl>
@@ -6242,7 +6440,7 @@
         <w:ind w:left="2160" w:hanging="360"/>
       </w:pPr>
       <w:rPr>
-        <w:rFonts w:hint="default" w:ascii="Symbol" w:hAnsi="Symbol"/>
+        <w:rFonts w:ascii="Symbol" w:hAnsi="Symbol" w:hint="default"/>
         <w:sz w:val="20"/>
       </w:rPr>
     </w:lvl>
@@ -6258,7 +6456,7 @@
         <w:ind w:left="2880" w:hanging="360"/>
       </w:pPr>
       <w:rPr>
-        <w:rFonts w:hint="default" w:ascii="Symbol" w:hAnsi="Symbol"/>
+        <w:rFonts w:ascii="Symbol" w:hAnsi="Symbol" w:hint="default"/>
         <w:sz w:val="20"/>
       </w:rPr>
     </w:lvl>
@@ -6274,7 +6472,7 @@
         <w:ind w:left="3600" w:hanging="360"/>
       </w:pPr>
       <w:rPr>
-        <w:rFonts w:hint="default" w:ascii="Symbol" w:hAnsi="Symbol"/>
+        <w:rFonts w:ascii="Symbol" w:hAnsi="Symbol" w:hint="default"/>
         <w:sz w:val="20"/>
       </w:rPr>
     </w:lvl>
@@ -6290,7 +6488,7 @@
         <w:ind w:left="4320" w:hanging="360"/>
       </w:pPr>
       <w:rPr>
-        <w:rFonts w:hint="default" w:ascii="Symbol" w:hAnsi="Symbol"/>
+        <w:rFonts w:ascii="Symbol" w:hAnsi="Symbol" w:hint="default"/>
         <w:sz w:val="20"/>
       </w:rPr>
     </w:lvl>
@@ -6306,7 +6504,7 @@
         <w:ind w:left="5040" w:hanging="360"/>
       </w:pPr>
       <w:rPr>
-        <w:rFonts w:hint="default" w:ascii="Symbol" w:hAnsi="Symbol"/>
+        <w:rFonts w:ascii="Symbol" w:hAnsi="Symbol" w:hint="default"/>
         <w:sz w:val="20"/>
       </w:rPr>
     </w:lvl>
@@ -6322,7 +6520,7 @@
         <w:ind w:left="5760" w:hanging="360"/>
       </w:pPr>
       <w:rPr>
-        <w:rFonts w:hint="default" w:ascii="Symbol" w:hAnsi="Symbol"/>
+        <w:rFonts w:ascii="Symbol" w:hAnsi="Symbol" w:hint="default"/>
         <w:sz w:val="20"/>
       </w:rPr>
     </w:lvl>
@@ -6338,7 +6536,7 @@
         <w:ind w:left="6480" w:hanging="360"/>
       </w:pPr>
       <w:rPr>
-        <w:rFonts w:hint="default" w:ascii="Symbol" w:hAnsi="Symbol"/>
+        <w:rFonts w:ascii="Symbol" w:hAnsi="Symbol" w:hint="default"/>
         <w:sz w:val="20"/>
       </w:rPr>
     </w:lvl>
@@ -6359,7 +6557,7 @@
         <w:ind w:left="720" w:hanging="360"/>
       </w:pPr>
       <w:rPr>
-        <w:rFonts w:hint="default" w:ascii="Symbol" w:hAnsi="Symbol"/>
+        <w:rFonts w:ascii="Symbol" w:hAnsi="Symbol" w:hint="default"/>
         <w:sz w:val="20"/>
       </w:rPr>
     </w:lvl>
@@ -6375,7 +6573,7 @@
         <w:ind w:left="1440" w:hanging="360"/>
       </w:pPr>
       <w:rPr>
-        <w:rFonts w:hint="default" w:ascii="Courier New" w:hAnsi="Courier New"/>
+        <w:rFonts w:ascii="Courier New" w:hAnsi="Courier New" w:hint="default"/>
         <w:sz w:val="20"/>
       </w:rPr>
     </w:lvl>
@@ -6391,7 +6589,7 @@
         <w:ind w:left="2160" w:hanging="360"/>
       </w:pPr>
       <w:rPr>
-        <w:rFonts w:hint="default" w:ascii="Wingdings" w:hAnsi="Wingdings"/>
+        <w:rFonts w:ascii="Wingdings" w:hAnsi="Wingdings" w:hint="default"/>
         <w:sz w:val="20"/>
       </w:rPr>
     </w:lvl>
@@ -6407,7 +6605,7 @@
         <w:ind w:left="2880" w:hanging="360"/>
       </w:pPr>
       <w:rPr>
-        <w:rFonts w:hint="default" w:ascii="Wingdings" w:hAnsi="Wingdings"/>
+        <w:rFonts w:ascii="Wingdings" w:hAnsi="Wingdings" w:hint="default"/>
         <w:sz w:val="20"/>
       </w:rPr>
     </w:lvl>
@@ -6423,7 +6621,7 @@
         <w:ind w:left="3600" w:hanging="360"/>
       </w:pPr>
       <w:rPr>
-        <w:rFonts w:hint="default" w:ascii="Wingdings" w:hAnsi="Wingdings"/>
+        <w:rFonts w:ascii="Wingdings" w:hAnsi="Wingdings" w:hint="default"/>
         <w:sz w:val="20"/>
       </w:rPr>
     </w:lvl>
@@ -6439,7 +6637,7 @@
         <w:ind w:left="4320" w:hanging="360"/>
       </w:pPr>
       <w:rPr>
-        <w:rFonts w:hint="default" w:ascii="Wingdings" w:hAnsi="Wingdings"/>
+        <w:rFonts w:ascii="Wingdings" w:hAnsi="Wingdings" w:hint="default"/>
         <w:sz w:val="20"/>
       </w:rPr>
     </w:lvl>
@@ -6455,7 +6653,7 @@
         <w:ind w:left="5040" w:hanging="360"/>
       </w:pPr>
       <w:rPr>
-        <w:rFonts w:hint="default" w:ascii="Wingdings" w:hAnsi="Wingdings"/>
+        <w:rFonts w:ascii="Wingdings" w:hAnsi="Wingdings" w:hint="default"/>
         <w:sz w:val="20"/>
       </w:rPr>
     </w:lvl>
@@ -6471,7 +6669,7 @@
         <w:ind w:left="5760" w:hanging="360"/>
       </w:pPr>
       <w:rPr>
-        <w:rFonts w:hint="default" w:ascii="Wingdings" w:hAnsi="Wingdings"/>
+        <w:rFonts w:ascii="Wingdings" w:hAnsi="Wingdings" w:hint="default"/>
         <w:sz w:val="20"/>
       </w:rPr>
     </w:lvl>
@@ -6487,7 +6685,7 @@
         <w:ind w:left="6480" w:hanging="360"/>
       </w:pPr>
       <w:rPr>
-        <w:rFonts w:hint="default" w:ascii="Wingdings" w:hAnsi="Wingdings"/>
+        <w:rFonts w:ascii="Wingdings" w:hAnsi="Wingdings" w:hint="default"/>
         <w:sz w:val="20"/>
       </w:rPr>
     </w:lvl>
@@ -6508,7 +6706,7 @@
         <w:ind w:left="720" w:hanging="360"/>
       </w:pPr>
       <w:rPr>
-        <w:rFonts w:hint="default" w:ascii="Symbol" w:hAnsi="Symbol"/>
+        <w:rFonts w:ascii="Symbol" w:hAnsi="Symbol" w:hint="default"/>
         <w:sz w:val="20"/>
       </w:rPr>
     </w:lvl>
@@ -6524,7 +6722,7 @@
         <w:ind w:left="1440" w:hanging="360"/>
       </w:pPr>
       <w:rPr>
-        <w:rFonts w:hint="default" w:ascii="Courier New" w:hAnsi="Courier New"/>
+        <w:rFonts w:ascii="Courier New" w:hAnsi="Courier New" w:hint="default"/>
         <w:sz w:val="20"/>
       </w:rPr>
     </w:lvl>
@@ -6540,7 +6738,7 @@
         <w:ind w:left="2160" w:hanging="360"/>
       </w:pPr>
       <w:rPr>
-        <w:rFonts w:hint="default" w:ascii="Wingdings" w:hAnsi="Wingdings"/>
+        <w:rFonts w:ascii="Wingdings" w:hAnsi="Wingdings" w:hint="default"/>
         <w:sz w:val="20"/>
       </w:rPr>
     </w:lvl>
@@ -6556,7 +6754,7 @@
         <w:ind w:left="2880" w:hanging="360"/>
       </w:pPr>
       <w:rPr>
-        <w:rFonts w:hint="default" w:ascii="Wingdings" w:hAnsi="Wingdings"/>
+        <w:rFonts w:ascii="Wingdings" w:hAnsi="Wingdings" w:hint="default"/>
         <w:sz w:val="20"/>
       </w:rPr>
     </w:lvl>
@@ -6572,7 +6770,7 @@
         <w:ind w:left="3600" w:hanging="360"/>
       </w:pPr>
       <w:rPr>
-        <w:rFonts w:hint="default" w:ascii="Wingdings" w:hAnsi="Wingdings"/>
+        <w:rFonts w:ascii="Wingdings" w:hAnsi="Wingdings" w:hint="default"/>
         <w:sz w:val="20"/>
       </w:rPr>
     </w:lvl>
@@ -6588,7 +6786,7 @@
         <w:ind w:left="4320" w:hanging="360"/>
       </w:pPr>
       <w:rPr>
-        <w:rFonts w:hint="default" w:ascii="Wingdings" w:hAnsi="Wingdings"/>
+        <w:rFonts w:ascii="Wingdings" w:hAnsi="Wingdings" w:hint="default"/>
         <w:sz w:val="20"/>
       </w:rPr>
     </w:lvl>
@@ -6604,7 +6802,7 @@
         <w:ind w:left="5040" w:hanging="360"/>
       </w:pPr>
       <w:rPr>
-        <w:rFonts w:hint="default" w:ascii="Wingdings" w:hAnsi="Wingdings"/>
+        <w:rFonts w:ascii="Wingdings" w:hAnsi="Wingdings" w:hint="default"/>
         <w:sz w:val="20"/>
       </w:rPr>
     </w:lvl>
@@ -6620,7 +6818,7 @@
         <w:ind w:left="5760" w:hanging="360"/>
       </w:pPr>
       <w:rPr>
-        <w:rFonts w:hint="default" w:ascii="Wingdings" w:hAnsi="Wingdings"/>
+        <w:rFonts w:ascii="Wingdings" w:hAnsi="Wingdings" w:hint="default"/>
         <w:sz w:val="20"/>
       </w:rPr>
     </w:lvl>
@@ -6636,7 +6834,7 @@
         <w:ind w:left="6480" w:hanging="360"/>
       </w:pPr>
       <w:rPr>
-        <w:rFonts w:hint="default" w:ascii="Wingdings" w:hAnsi="Wingdings"/>
+        <w:rFonts w:ascii="Wingdings" w:hAnsi="Wingdings" w:hint="default"/>
         <w:sz w:val="20"/>
       </w:rPr>
     </w:lvl>
@@ -6657,7 +6855,7 @@
         <w:ind w:left="720" w:hanging="360"/>
       </w:pPr>
       <w:rPr>
-        <w:rFonts w:hint="default" w:ascii="Symbol" w:hAnsi="Symbol"/>
+        <w:rFonts w:ascii="Symbol" w:hAnsi="Symbol" w:hint="default"/>
         <w:sz w:val="20"/>
       </w:rPr>
     </w:lvl>
@@ -6673,7 +6871,7 @@
         <w:ind w:left="1440" w:hanging="360"/>
       </w:pPr>
       <w:rPr>
-        <w:rFonts w:hint="default" w:ascii="Courier New" w:hAnsi="Courier New"/>
+        <w:rFonts w:ascii="Courier New" w:hAnsi="Courier New" w:hint="default"/>
         <w:sz w:val="20"/>
       </w:rPr>
     </w:lvl>
@@ -6689,7 +6887,7 @@
         <w:ind w:left="2160" w:hanging="360"/>
       </w:pPr>
       <w:rPr>
-        <w:rFonts w:hint="default" w:ascii="Wingdings" w:hAnsi="Wingdings"/>
+        <w:rFonts w:ascii="Wingdings" w:hAnsi="Wingdings" w:hint="default"/>
         <w:sz w:val="20"/>
       </w:rPr>
     </w:lvl>
@@ -6705,7 +6903,7 @@
         <w:ind w:left="2880" w:hanging="360"/>
       </w:pPr>
       <w:rPr>
-        <w:rFonts w:hint="default" w:ascii="Wingdings" w:hAnsi="Wingdings"/>
+        <w:rFonts w:ascii="Wingdings" w:hAnsi="Wingdings" w:hint="default"/>
         <w:sz w:val="20"/>
       </w:rPr>
     </w:lvl>
@@ -6721,7 +6919,7 @@
         <w:ind w:left="3600" w:hanging="360"/>
       </w:pPr>
       <w:rPr>
-        <w:rFonts w:hint="default" w:ascii="Wingdings" w:hAnsi="Wingdings"/>
+        <w:rFonts w:ascii="Wingdings" w:hAnsi="Wingdings" w:hint="default"/>
         <w:sz w:val="20"/>
       </w:rPr>
     </w:lvl>
@@ -6737,7 +6935,7 @@
         <w:ind w:left="4320" w:hanging="360"/>
       </w:pPr>
       <w:rPr>
-        <w:rFonts w:hint="default" w:ascii="Wingdings" w:hAnsi="Wingdings"/>
+        <w:rFonts w:ascii="Wingdings" w:hAnsi="Wingdings" w:hint="default"/>
         <w:sz w:val="20"/>
       </w:rPr>
     </w:lvl>
@@ -6753,7 +6951,7 @@
         <w:ind w:left="5040" w:hanging="360"/>
       </w:pPr>
       <w:rPr>
-        <w:rFonts w:hint="default" w:ascii="Wingdings" w:hAnsi="Wingdings"/>
+        <w:rFonts w:ascii="Wingdings" w:hAnsi="Wingdings" w:hint="default"/>
         <w:sz w:val="20"/>
       </w:rPr>
     </w:lvl>
@@ -6769,7 +6967,7 @@
         <w:ind w:left="5760" w:hanging="360"/>
       </w:pPr>
       <w:rPr>
-        <w:rFonts w:hint="default" w:ascii="Wingdings" w:hAnsi="Wingdings"/>
+        <w:rFonts w:ascii="Wingdings" w:hAnsi="Wingdings" w:hint="default"/>
         <w:sz w:val="20"/>
       </w:rPr>
     </w:lvl>
@@ -6785,7 +6983,7 @@
         <w:ind w:left="6480" w:hanging="360"/>
       </w:pPr>
       <w:rPr>
-        <w:rFonts w:hint="default" w:ascii="Wingdings" w:hAnsi="Wingdings"/>
+        <w:rFonts w:ascii="Wingdings" w:hAnsi="Wingdings" w:hint="default"/>
         <w:sz w:val="20"/>
       </w:rPr>
     </w:lvl>
@@ -6803,7 +7001,7 @@
         <w:ind w:left="720" w:hanging="360"/>
       </w:pPr>
       <w:rPr>
-        <w:rFonts w:hint="default" w:ascii="Symbol" w:hAnsi="Symbol"/>
+        <w:rFonts w:ascii="Symbol" w:hAnsi="Symbol" w:hint="default"/>
       </w:rPr>
     </w:lvl>
     <w:lvl w:ilvl="1" w:tplc="04090003" w:tentative="1">
@@ -6815,7 +7013,7 @@
         <w:ind w:left="1440" w:hanging="360"/>
       </w:pPr>
       <w:rPr>
-        <w:rFonts w:hint="default" w:ascii="Courier New" w:hAnsi="Courier New" w:cs="Courier New"/>
+        <w:rFonts w:ascii="Courier New" w:hAnsi="Courier New" w:cs="Courier New" w:hint="default"/>
       </w:rPr>
     </w:lvl>
     <w:lvl w:ilvl="2" w:tplc="04090005" w:tentative="1">
@@ -6827,7 +7025,7 @@
         <w:ind w:left="2160" w:hanging="360"/>
       </w:pPr>
       <w:rPr>
-        <w:rFonts w:hint="default" w:ascii="Wingdings" w:hAnsi="Wingdings"/>
+        <w:rFonts w:ascii="Wingdings" w:hAnsi="Wingdings" w:hint="default"/>
       </w:rPr>
     </w:lvl>
     <w:lvl w:ilvl="3" w:tplc="04090001" w:tentative="1">
@@ -6839,7 +7037,7 @@
         <w:ind w:left="2880" w:hanging="360"/>
       </w:pPr>
       <w:rPr>
-        <w:rFonts w:hint="default" w:ascii="Symbol" w:hAnsi="Symbol"/>
+        <w:rFonts w:ascii="Symbol" w:hAnsi="Symbol" w:hint="default"/>
       </w:rPr>
     </w:lvl>
     <w:lvl w:ilvl="4" w:tplc="04090003" w:tentative="1">
@@ -6851,7 +7049,7 @@
         <w:ind w:left="3600" w:hanging="360"/>
       </w:pPr>
       <w:rPr>
-        <w:rFonts w:hint="default" w:ascii="Courier New" w:hAnsi="Courier New" w:cs="Courier New"/>
+        <w:rFonts w:ascii="Courier New" w:hAnsi="Courier New" w:cs="Courier New" w:hint="default"/>
       </w:rPr>
     </w:lvl>
     <w:lvl w:ilvl="5" w:tplc="04090005" w:tentative="1">
@@ -6863,7 +7061,7 @@
         <w:ind w:left="4320" w:hanging="360"/>
       </w:pPr>
       <w:rPr>
-        <w:rFonts w:hint="default" w:ascii="Wingdings" w:hAnsi="Wingdings"/>
+        <w:rFonts w:ascii="Wingdings" w:hAnsi="Wingdings" w:hint="default"/>
       </w:rPr>
     </w:lvl>
     <w:lvl w:ilvl="6" w:tplc="04090001" w:tentative="1">
@@ -6875,7 +7073,7 @@
         <w:ind w:left="5040" w:hanging="360"/>
       </w:pPr>
       <w:rPr>
-        <w:rFonts w:hint="default" w:ascii="Symbol" w:hAnsi="Symbol"/>
+        <w:rFonts w:ascii="Symbol" w:hAnsi="Symbol" w:hint="default"/>
       </w:rPr>
     </w:lvl>
     <w:lvl w:ilvl="7" w:tplc="04090003" w:tentative="1">
@@ -6887,7 +7085,7 @@
         <w:ind w:left="5760" w:hanging="360"/>
       </w:pPr>
       <w:rPr>
-        <w:rFonts w:hint="default" w:ascii="Courier New" w:hAnsi="Courier New" w:cs="Courier New"/>
+        <w:rFonts w:ascii="Courier New" w:hAnsi="Courier New" w:cs="Courier New" w:hint="default"/>
       </w:rPr>
     </w:lvl>
     <w:lvl w:ilvl="8" w:tplc="04090005" w:tentative="1">
@@ -6899,7 +7097,7 @@
         <w:ind w:left="6480" w:hanging="360"/>
       </w:pPr>
       <w:rPr>
-        <w:rFonts w:hint="default" w:ascii="Wingdings" w:hAnsi="Wingdings"/>
+        <w:rFonts w:ascii="Wingdings" w:hAnsi="Wingdings" w:hint="default"/>
       </w:rPr>
     </w:lvl>
   </w:abstractNum>
@@ -6919,11 +7117,11 @@
         <w:ind w:left="720" w:hanging="360"/>
       </w:pPr>
       <w:rPr>
-        <w:rFonts w:hint="default" w:ascii="Symbol" w:hAnsi="Symbol"/>
-        <w:sz w:val="20"/>
-      </w:rPr>
-    </w:lvl>
-    <w:lvl w:ilvl="1" w:tentative="1">
+        <w:rFonts w:ascii="Symbol" w:hAnsi="Symbol" w:hint="default"/>
+        <w:sz w:val="20"/>
+      </w:rPr>
+    </w:lvl>
+    <w:lvl w:ilvl="1">
       <w:start w:val="1"/>
       <w:numFmt w:val="bullet"/>
       <w:lvlText w:val="o"/>
@@ -6935,7 +7133,7 @@
         <w:ind w:left="1440" w:hanging="360"/>
       </w:pPr>
       <w:rPr>
-        <w:rFonts w:hint="default" w:ascii="Courier New" w:hAnsi="Courier New"/>
+        <w:rFonts w:ascii="Courier New" w:hAnsi="Courier New" w:hint="default"/>
         <w:sz w:val="20"/>
       </w:rPr>
     </w:lvl>
@@ -6951,7 +7149,7 @@
         <w:ind w:left="2160" w:hanging="360"/>
       </w:pPr>
       <w:rPr>
-        <w:rFonts w:hint="default" w:ascii="Wingdings" w:hAnsi="Wingdings"/>
+        <w:rFonts w:ascii="Wingdings" w:hAnsi="Wingdings" w:hint="default"/>
         <w:sz w:val="20"/>
       </w:rPr>
     </w:lvl>
@@ -6967,7 +7165,7 @@
         <w:ind w:left="2880" w:hanging="360"/>
       </w:pPr>
       <w:rPr>
-        <w:rFonts w:hint="default" w:ascii="Wingdings" w:hAnsi="Wingdings"/>
+        <w:rFonts w:ascii="Wingdings" w:hAnsi="Wingdings" w:hint="default"/>
         <w:sz w:val="20"/>
       </w:rPr>
     </w:lvl>
@@ -6983,7 +7181,7 @@
         <w:ind w:left="3600" w:hanging="360"/>
       </w:pPr>
       <w:rPr>
-        <w:rFonts w:hint="default" w:ascii="Wingdings" w:hAnsi="Wingdings"/>
+        <w:rFonts w:ascii="Wingdings" w:hAnsi="Wingdings" w:hint="default"/>
         <w:sz w:val="20"/>
       </w:rPr>
     </w:lvl>
@@ -6999,7 +7197,7 @@
         <w:ind w:left="4320" w:hanging="360"/>
       </w:pPr>
       <w:rPr>
-        <w:rFonts w:hint="default" w:ascii="Wingdings" w:hAnsi="Wingdings"/>
+        <w:rFonts w:ascii="Wingdings" w:hAnsi="Wingdings" w:hint="default"/>
         <w:sz w:val="20"/>
       </w:rPr>
     </w:lvl>
@@ -7015,7 +7213,7 @@
         <w:ind w:left="5040" w:hanging="360"/>
       </w:pPr>
       <w:rPr>
-        <w:rFonts w:hint="default" w:ascii="Wingdings" w:hAnsi="Wingdings"/>
+        <w:rFonts w:ascii="Wingdings" w:hAnsi="Wingdings" w:hint="default"/>
         <w:sz w:val="20"/>
       </w:rPr>
     </w:lvl>
@@ -7031,7 +7229,7 @@
         <w:ind w:left="5760" w:hanging="360"/>
       </w:pPr>
       <w:rPr>
-        <w:rFonts w:hint="default" w:ascii="Wingdings" w:hAnsi="Wingdings"/>
+        <w:rFonts w:ascii="Wingdings" w:hAnsi="Wingdings" w:hint="default"/>
         <w:sz w:val="20"/>
       </w:rPr>
     </w:lvl>
@@ -7047,7 +7245,7 @@
         <w:ind w:left="6480" w:hanging="360"/>
       </w:pPr>
       <w:rPr>
-        <w:rFonts w:hint="default" w:ascii="Wingdings" w:hAnsi="Wingdings"/>
+        <w:rFonts w:ascii="Wingdings" w:hAnsi="Wingdings" w:hint="default"/>
         <w:sz w:val="20"/>
       </w:rPr>
     </w:lvl>
@@ -7068,7 +7266,7 @@
         <w:ind w:left="720" w:hanging="360"/>
       </w:pPr>
       <w:rPr>
-        <w:rFonts w:hint="default" w:ascii="Symbol" w:hAnsi="Symbol"/>
+        <w:rFonts w:ascii="Symbol" w:hAnsi="Symbol" w:hint="default"/>
         <w:sz w:val="20"/>
       </w:rPr>
     </w:lvl>
@@ -7084,7 +7282,7 @@
         <w:ind w:left="1440" w:hanging="360"/>
       </w:pPr>
       <w:rPr>
-        <w:rFonts w:hint="default" w:ascii="Courier New" w:hAnsi="Courier New"/>
+        <w:rFonts w:ascii="Courier New" w:hAnsi="Courier New" w:hint="default"/>
         <w:sz w:val="20"/>
       </w:rPr>
     </w:lvl>
@@ -7100,7 +7298,7 @@
         <w:ind w:left="2160" w:hanging="360"/>
       </w:pPr>
       <w:rPr>
-        <w:rFonts w:hint="default" w:ascii="Wingdings" w:hAnsi="Wingdings"/>
+        <w:rFonts w:ascii="Wingdings" w:hAnsi="Wingdings" w:hint="default"/>
         <w:sz w:val="20"/>
       </w:rPr>
     </w:lvl>
@@ -7116,7 +7314,7 @@
         <w:ind w:left="2880" w:hanging="360"/>
       </w:pPr>
       <w:rPr>
-        <w:rFonts w:hint="default" w:ascii="Wingdings" w:hAnsi="Wingdings"/>
+        <w:rFonts w:ascii="Wingdings" w:hAnsi="Wingdings" w:hint="default"/>
         <w:sz w:val="20"/>
       </w:rPr>
     </w:lvl>
@@ -7132,7 +7330,7 @@
         <w:ind w:left="3600" w:hanging="360"/>
       </w:pPr>
       <w:rPr>
-        <w:rFonts w:hint="default" w:ascii="Wingdings" w:hAnsi="Wingdings"/>
+        <w:rFonts w:ascii="Wingdings" w:hAnsi="Wingdings" w:hint="default"/>
         <w:sz w:val="20"/>
       </w:rPr>
     </w:lvl>
@@ -7148,7 +7346,7 @@
         <w:ind w:left="4320" w:hanging="360"/>
       </w:pPr>
       <w:rPr>
-        <w:rFonts w:hint="default" w:ascii="Wingdings" w:hAnsi="Wingdings"/>
+        <w:rFonts w:ascii="Wingdings" w:hAnsi="Wingdings" w:hint="default"/>
         <w:sz w:val="20"/>
       </w:rPr>
     </w:lvl>
@@ -7164,7 +7362,7 @@
         <w:ind w:left="5040" w:hanging="360"/>
       </w:pPr>
       <w:rPr>
-        <w:rFonts w:hint="default" w:ascii="Wingdings" w:hAnsi="Wingdings"/>
+        <w:rFonts w:ascii="Wingdings" w:hAnsi="Wingdings" w:hint="default"/>
         <w:sz w:val="20"/>
       </w:rPr>
     </w:lvl>
@@ -7180,7 +7378,7 @@
         <w:ind w:left="5760" w:hanging="360"/>
       </w:pPr>
       <w:rPr>
-        <w:rFonts w:hint="default" w:ascii="Wingdings" w:hAnsi="Wingdings"/>
+        <w:rFonts w:ascii="Wingdings" w:hAnsi="Wingdings" w:hint="default"/>
         <w:sz w:val="20"/>
       </w:rPr>
     </w:lvl>
@@ -7196,7 +7394,7 @@
         <w:ind w:left="6480" w:hanging="360"/>
       </w:pPr>
       <w:rPr>
-        <w:rFonts w:hint="default" w:ascii="Wingdings" w:hAnsi="Wingdings"/>
+        <w:rFonts w:ascii="Wingdings" w:hAnsi="Wingdings" w:hint="default"/>
         <w:sz w:val="20"/>
       </w:rPr>
     </w:lvl>
@@ -7217,11 +7415,11 @@
         <w:ind w:left="720" w:hanging="360"/>
       </w:pPr>
       <w:rPr>
-        <w:rFonts w:hint="default" w:ascii="Symbol" w:hAnsi="Symbol"/>
-        <w:sz w:val="20"/>
-      </w:rPr>
-    </w:lvl>
-    <w:lvl w:ilvl="1" w:tentative="1">
+        <w:rFonts w:ascii="Symbol" w:hAnsi="Symbol" w:hint="default"/>
+        <w:sz w:val="20"/>
+      </w:rPr>
+    </w:lvl>
+    <w:lvl w:ilvl="1">
       <w:start w:val="1"/>
       <w:numFmt w:val="bullet"/>
       <w:lvlText w:val="o"/>
@@ -7233,11 +7431,11 @@
         <w:ind w:left="1440" w:hanging="360"/>
       </w:pPr>
       <w:rPr>
-        <w:rFonts w:hint="default" w:ascii="Courier New" w:hAnsi="Courier New"/>
-        <w:sz w:val="20"/>
-      </w:rPr>
-    </w:lvl>
-    <w:lvl w:ilvl="2" w:tentative="1">
+        <w:rFonts w:ascii="Courier New" w:hAnsi="Courier New" w:hint="default"/>
+        <w:sz w:val="20"/>
+      </w:rPr>
+    </w:lvl>
+    <w:lvl w:ilvl="2">
       <w:start w:val="1"/>
       <w:numFmt w:val="bullet"/>
       <w:lvlText w:val=""/>
@@ -7249,11 +7447,11 @@
         <w:ind w:left="2160" w:hanging="360"/>
       </w:pPr>
       <w:rPr>
-        <w:rFonts w:hint="default" w:ascii="Wingdings" w:hAnsi="Wingdings"/>
-        <w:sz w:val="20"/>
-      </w:rPr>
-    </w:lvl>
-    <w:lvl w:ilvl="3" w:tentative="1">
+        <w:rFonts w:ascii="Wingdings" w:hAnsi="Wingdings" w:hint="default"/>
+        <w:sz w:val="20"/>
+      </w:rPr>
+    </w:lvl>
+    <w:lvl w:ilvl="3">
       <w:start w:val="1"/>
       <w:numFmt w:val="bullet"/>
       <w:lvlText w:val=""/>
@@ -7265,7 +7463,7 @@
         <w:ind w:left="2880" w:hanging="360"/>
       </w:pPr>
       <w:rPr>
-        <w:rFonts w:hint="default" w:ascii="Wingdings" w:hAnsi="Wingdings"/>
+        <w:rFonts w:ascii="Wingdings" w:hAnsi="Wingdings" w:hint="default"/>
         <w:sz w:val="20"/>
       </w:rPr>
     </w:lvl>
@@ -7281,7 +7479,7 @@
         <w:ind w:left="3600" w:hanging="360"/>
       </w:pPr>
       <w:rPr>
-        <w:rFonts w:hint="default" w:ascii="Wingdings" w:hAnsi="Wingdings"/>
+        <w:rFonts w:ascii="Wingdings" w:hAnsi="Wingdings" w:hint="default"/>
         <w:sz w:val="20"/>
       </w:rPr>
     </w:lvl>
@@ -7297,7 +7495,7 @@
         <w:ind w:left="4320" w:hanging="360"/>
       </w:pPr>
       <w:rPr>
-        <w:rFonts w:hint="default" w:ascii="Wingdings" w:hAnsi="Wingdings"/>
+        <w:rFonts w:ascii="Wingdings" w:hAnsi="Wingdings" w:hint="default"/>
         <w:sz w:val="20"/>
       </w:rPr>
     </w:lvl>
@@ -7313,7 +7511,7 @@
         <w:ind w:left="5040" w:hanging="360"/>
       </w:pPr>
       <w:rPr>
-        <w:rFonts w:hint="default" w:ascii="Wingdings" w:hAnsi="Wingdings"/>
+        <w:rFonts w:ascii="Wingdings" w:hAnsi="Wingdings" w:hint="default"/>
         <w:sz w:val="20"/>
       </w:rPr>
     </w:lvl>
@@ -7329,7 +7527,7 @@
         <w:ind w:left="5760" w:hanging="360"/>
       </w:pPr>
       <w:rPr>
-        <w:rFonts w:hint="default" w:ascii="Wingdings" w:hAnsi="Wingdings"/>
+        <w:rFonts w:ascii="Wingdings" w:hAnsi="Wingdings" w:hint="default"/>
         <w:sz w:val="20"/>
       </w:rPr>
     </w:lvl>
@@ -7345,7 +7543,7 @@
         <w:ind w:left="6480" w:hanging="360"/>
       </w:pPr>
       <w:rPr>
-        <w:rFonts w:hint="default" w:ascii="Wingdings" w:hAnsi="Wingdings"/>
+        <w:rFonts w:ascii="Wingdings" w:hAnsi="Wingdings" w:hint="default"/>
         <w:sz w:val="20"/>
       </w:rPr>
     </w:lvl>
@@ -7363,7 +7561,7 @@
         <w:ind w:left="720" w:hanging="360"/>
       </w:pPr>
       <w:rPr>
-        <w:rFonts w:hint="default" w:ascii="Symbol" w:hAnsi="Symbol"/>
+        <w:rFonts w:ascii="Symbol" w:hAnsi="Symbol" w:hint="default"/>
       </w:rPr>
     </w:lvl>
     <w:lvl w:ilvl="1" w:tplc="04090003" w:tentative="1">
@@ -7375,7 +7573,7 @@
         <w:ind w:left="1440" w:hanging="360"/>
       </w:pPr>
       <w:rPr>
-        <w:rFonts w:hint="default" w:ascii="Courier New" w:hAnsi="Courier New" w:cs="Courier New"/>
+        <w:rFonts w:ascii="Courier New" w:hAnsi="Courier New" w:cs="Courier New" w:hint="default"/>
       </w:rPr>
     </w:lvl>
     <w:lvl w:ilvl="2" w:tplc="04090005" w:tentative="1">
@@ -7387,7 +7585,7 @@
         <w:ind w:left="2160" w:hanging="360"/>
       </w:pPr>
       <w:rPr>
-        <w:rFonts w:hint="default" w:ascii="Wingdings" w:hAnsi="Wingdings"/>
+        <w:rFonts w:ascii="Wingdings" w:hAnsi="Wingdings" w:hint="default"/>
       </w:rPr>
     </w:lvl>
     <w:lvl w:ilvl="3" w:tplc="04090001" w:tentative="1">
@@ -7399,7 +7597,7 @@
         <w:ind w:left="2880" w:hanging="360"/>
       </w:pPr>
       <w:rPr>
-        <w:rFonts w:hint="default" w:ascii="Symbol" w:hAnsi="Symbol"/>
+        <w:rFonts w:ascii="Symbol" w:hAnsi="Symbol" w:hint="default"/>
       </w:rPr>
     </w:lvl>
     <w:lvl w:ilvl="4" w:tplc="04090003" w:tentative="1">
@@ -7411,7 +7609,7 @@
         <w:ind w:left="3600" w:hanging="360"/>
       </w:pPr>
       <w:rPr>
-        <w:rFonts w:hint="default" w:ascii="Courier New" w:hAnsi="Courier New" w:cs="Courier New"/>
+        <w:rFonts w:ascii="Courier New" w:hAnsi="Courier New" w:cs="Courier New" w:hint="default"/>
       </w:rPr>
     </w:lvl>
     <w:lvl w:ilvl="5" w:tplc="04090005" w:tentative="1">
@@ -7423,7 +7621,7 @@
         <w:ind w:left="4320" w:hanging="360"/>
       </w:pPr>
       <w:rPr>
-        <w:rFonts w:hint="default" w:ascii="Wingdings" w:hAnsi="Wingdings"/>
+        <w:rFonts w:ascii="Wingdings" w:hAnsi="Wingdings" w:hint="default"/>
       </w:rPr>
     </w:lvl>
     <w:lvl w:ilvl="6" w:tplc="04090001" w:tentative="1">
@@ -7435,7 +7633,7 @@
         <w:ind w:left="5040" w:hanging="360"/>
       </w:pPr>
       <w:rPr>
-        <w:rFonts w:hint="default" w:ascii="Symbol" w:hAnsi="Symbol"/>
+        <w:rFonts w:ascii="Symbol" w:hAnsi="Symbol" w:hint="default"/>
       </w:rPr>
     </w:lvl>
     <w:lvl w:ilvl="7" w:tplc="04090003" w:tentative="1">
@@ -7447,7 +7645,7 @@
         <w:ind w:left="5760" w:hanging="360"/>
       </w:pPr>
       <w:rPr>
-        <w:rFonts w:hint="default" w:ascii="Courier New" w:hAnsi="Courier New" w:cs="Courier New"/>
+        <w:rFonts w:ascii="Courier New" w:hAnsi="Courier New" w:cs="Courier New" w:hint="default"/>
       </w:rPr>
     </w:lvl>
     <w:lvl w:ilvl="8" w:tplc="04090005" w:tentative="1">
@@ -7459,7 +7657,7 @@
         <w:ind w:left="6480" w:hanging="360"/>
       </w:pPr>
       <w:rPr>
-        <w:rFonts w:hint="default" w:ascii="Wingdings" w:hAnsi="Wingdings"/>
+        <w:rFonts w:ascii="Wingdings" w:hAnsi="Wingdings" w:hint="default"/>
       </w:rPr>
     </w:lvl>
   </w:abstractNum>
@@ -7479,7 +7677,7 @@
         <w:ind w:left="720" w:hanging="360"/>
       </w:pPr>
       <w:rPr>
-        <w:rFonts w:hint="default" w:ascii="Symbol" w:hAnsi="Symbol"/>
+        <w:rFonts w:ascii="Symbol" w:hAnsi="Symbol" w:hint="default"/>
         <w:sz w:val="20"/>
       </w:rPr>
     </w:lvl>
@@ -7495,7 +7693,7 @@
         <w:ind w:left="1440" w:hanging="360"/>
       </w:pPr>
       <w:rPr>
-        <w:rFonts w:hint="default" w:ascii="Courier New" w:hAnsi="Courier New"/>
+        <w:rFonts w:ascii="Courier New" w:hAnsi="Courier New" w:hint="default"/>
         <w:sz w:val="20"/>
       </w:rPr>
     </w:lvl>
@@ -7511,7 +7709,7 @@
         <w:ind w:left="2160" w:hanging="360"/>
       </w:pPr>
       <w:rPr>
-        <w:rFonts w:hint="default" w:ascii="Wingdings" w:hAnsi="Wingdings"/>
+        <w:rFonts w:ascii="Wingdings" w:hAnsi="Wingdings" w:hint="default"/>
         <w:sz w:val="20"/>
       </w:rPr>
     </w:lvl>
@@ -7527,7 +7725,7 @@
         <w:ind w:left="2880" w:hanging="360"/>
       </w:pPr>
       <w:rPr>
-        <w:rFonts w:hint="default" w:ascii="Wingdings" w:hAnsi="Wingdings"/>
+        <w:rFonts w:ascii="Wingdings" w:hAnsi="Wingdings" w:hint="default"/>
         <w:sz w:val="20"/>
       </w:rPr>
     </w:lvl>
@@ -7543,7 +7741,7 @@
         <w:ind w:left="3600" w:hanging="360"/>
       </w:pPr>
       <w:rPr>
-        <w:rFonts w:hint="default" w:ascii="Wingdings" w:hAnsi="Wingdings"/>
+        <w:rFonts w:ascii="Wingdings" w:hAnsi="Wingdings" w:hint="default"/>
         <w:sz w:val="20"/>
       </w:rPr>
     </w:lvl>
@@ -7559,7 +7757,7 @@
         <w:ind w:left="4320" w:hanging="360"/>
       </w:pPr>
       <w:rPr>
-        <w:rFonts w:hint="default" w:ascii="Wingdings" w:hAnsi="Wingdings"/>
+        <w:rFonts w:ascii="Wingdings" w:hAnsi="Wingdings" w:hint="default"/>
         <w:sz w:val="20"/>
       </w:rPr>
     </w:lvl>
@@ -7575,7 +7773,7 @@
         <w:ind w:left="5040" w:hanging="360"/>
       </w:pPr>
       <w:rPr>
-        <w:rFonts w:hint="default" w:ascii="Wingdings" w:hAnsi="Wingdings"/>
+        <w:rFonts w:ascii="Wingdings" w:hAnsi="Wingdings" w:hint="default"/>
         <w:sz w:val="20"/>
       </w:rPr>
     </w:lvl>
@@ -7591,7 +7789,7 @@
         <w:ind w:left="5760" w:hanging="360"/>
       </w:pPr>
       <w:rPr>
-        <w:rFonts w:hint="default" w:ascii="Wingdings" w:hAnsi="Wingdings"/>
+        <w:rFonts w:ascii="Wingdings" w:hAnsi="Wingdings" w:hint="default"/>
         <w:sz w:val="20"/>
       </w:rPr>
     </w:lvl>
@@ -7607,7 +7805,7 @@
         <w:ind w:left="6480" w:hanging="360"/>
       </w:pPr>
       <w:rPr>
-        <w:rFonts w:hint="default" w:ascii="Wingdings" w:hAnsi="Wingdings"/>
+        <w:rFonts w:ascii="Wingdings" w:hAnsi="Wingdings" w:hint="default"/>
         <w:sz w:val="20"/>
       </w:rPr>
     </w:lvl>
@@ -7628,7 +7826,7 @@
         <w:ind w:left="720" w:hanging="360"/>
       </w:pPr>
       <w:rPr>
-        <w:rFonts w:hint="default" w:ascii="Symbol" w:hAnsi="Symbol"/>
+        <w:rFonts w:ascii="Symbol" w:hAnsi="Symbol" w:hint="default"/>
         <w:sz w:val="20"/>
       </w:rPr>
     </w:lvl>
@@ -7644,7 +7842,7 @@
         <w:ind w:left="1440" w:hanging="360"/>
       </w:pPr>
       <w:rPr>
-        <w:rFonts w:hint="default" w:ascii="Symbol" w:hAnsi="Symbol"/>
+        <w:rFonts w:ascii="Symbol" w:hAnsi="Symbol" w:hint="default"/>
         <w:sz w:val="20"/>
       </w:rPr>
     </w:lvl>
@@ -7660,7 +7858,7 @@
         <w:ind w:left="2160" w:hanging="360"/>
       </w:pPr>
       <w:rPr>
-        <w:rFonts w:hint="default" w:ascii="Symbol" w:hAnsi="Symbol"/>
+        <w:rFonts w:ascii="Symbol" w:hAnsi="Symbol" w:hint="default"/>
         <w:sz w:val="20"/>
       </w:rPr>
     </w:lvl>
@@ -7676,7 +7874,7 @@
         <w:ind w:left="2880" w:hanging="360"/>
       </w:pPr>
       <w:rPr>
-        <w:rFonts w:hint="default" w:ascii="Symbol" w:hAnsi="Symbol"/>
+        <w:rFonts w:ascii="Symbol" w:hAnsi="Symbol" w:hint="default"/>
         <w:sz w:val="20"/>
       </w:rPr>
     </w:lvl>
@@ -7692,7 +7890,7 @@
         <w:ind w:left="3600" w:hanging="360"/>
       </w:pPr>
       <w:rPr>
-        <w:rFonts w:hint="default" w:ascii="Symbol" w:hAnsi="Symbol"/>
+        <w:rFonts w:ascii="Symbol" w:hAnsi="Symbol" w:hint="default"/>
         <w:sz w:val="20"/>
       </w:rPr>
     </w:lvl>
@@ -7708,7 +7906,7 @@
         <w:ind w:left="4320" w:hanging="360"/>
       </w:pPr>
       <w:rPr>
-        <w:rFonts w:hint="default" w:ascii="Symbol" w:hAnsi="Symbol"/>
+        <w:rFonts w:ascii="Symbol" w:hAnsi="Symbol" w:hint="default"/>
         <w:sz w:val="20"/>
       </w:rPr>
     </w:lvl>
@@ -7724,7 +7922,7 @@
         <w:ind w:left="5040" w:hanging="360"/>
       </w:pPr>
       <w:rPr>
-        <w:rFonts w:hint="default" w:ascii="Symbol" w:hAnsi="Symbol"/>
+        <w:rFonts w:ascii="Symbol" w:hAnsi="Symbol" w:hint="default"/>
         <w:sz w:val="20"/>
       </w:rPr>
     </w:lvl>
@@ -7740,7 +7938,7 @@
         <w:ind w:left="5760" w:hanging="360"/>
       </w:pPr>
       <w:rPr>
-        <w:rFonts w:hint="default" w:ascii="Symbol" w:hAnsi="Symbol"/>
+        <w:rFonts w:ascii="Symbol" w:hAnsi="Symbol" w:hint="default"/>
         <w:sz w:val="20"/>
       </w:rPr>
     </w:lvl>
@@ -7756,7 +7954,7 @@
         <w:ind w:left="6480" w:hanging="360"/>
       </w:pPr>
       <w:rPr>
-        <w:rFonts w:hint="default" w:ascii="Symbol" w:hAnsi="Symbol"/>
+        <w:rFonts w:ascii="Symbol" w:hAnsi="Symbol" w:hint="default"/>
         <w:sz w:val="20"/>
       </w:rPr>
     </w:lvl>
@@ -7777,7 +7975,7 @@
         <w:ind w:left="720" w:hanging="360"/>
       </w:pPr>
       <w:rPr>
-        <w:rFonts w:hint="default" w:ascii="Symbol" w:hAnsi="Symbol"/>
+        <w:rFonts w:ascii="Symbol" w:hAnsi="Symbol" w:hint="default"/>
         <w:sz w:val="20"/>
       </w:rPr>
     </w:lvl>
@@ -7793,7 +7991,7 @@
         <w:ind w:left="1440" w:hanging="360"/>
       </w:pPr>
       <w:rPr>
-        <w:rFonts w:hint="default" w:ascii="Symbol" w:hAnsi="Symbol"/>
+        <w:rFonts w:ascii="Symbol" w:hAnsi="Symbol" w:hint="default"/>
         <w:sz w:val="20"/>
       </w:rPr>
     </w:lvl>
@@ -7809,7 +8007,7 @@
         <w:ind w:left="2160" w:hanging="360"/>
       </w:pPr>
       <w:rPr>
-        <w:rFonts w:hint="default" w:ascii="Symbol" w:hAnsi="Symbol"/>
+        <w:rFonts w:ascii="Symbol" w:hAnsi="Symbol" w:hint="default"/>
         <w:sz w:val="20"/>
       </w:rPr>
     </w:lvl>
@@ -7825,7 +8023,7 @@
         <w:ind w:left="2880" w:hanging="360"/>
       </w:pPr>
       <w:rPr>
-        <w:rFonts w:hint="default" w:ascii="Symbol" w:hAnsi="Symbol"/>
+        <w:rFonts w:ascii="Symbol" w:hAnsi="Symbol" w:hint="default"/>
         <w:sz w:val="20"/>
       </w:rPr>
     </w:lvl>
@@ -7841,7 +8039,7 @@
         <w:ind w:left="3600" w:hanging="360"/>
       </w:pPr>
       <w:rPr>
-        <w:rFonts w:hint="default" w:ascii="Symbol" w:hAnsi="Symbol"/>
+        <w:rFonts w:ascii="Symbol" w:hAnsi="Symbol" w:hint="default"/>
         <w:sz w:val="20"/>
       </w:rPr>
     </w:lvl>
@@ -7857,7 +8055,7 @@
         <w:ind w:left="4320" w:hanging="360"/>
       </w:pPr>
       <w:rPr>
-        <w:rFonts w:hint="default" w:ascii="Symbol" w:hAnsi="Symbol"/>
+        <w:rFonts w:ascii="Symbol" w:hAnsi="Symbol" w:hint="default"/>
         <w:sz w:val="20"/>
       </w:rPr>
     </w:lvl>
@@ -7873,7 +8071,7 @@
         <w:ind w:left="5040" w:hanging="360"/>
       </w:pPr>
       <w:rPr>
-        <w:rFonts w:hint="default" w:ascii="Symbol" w:hAnsi="Symbol"/>
+        <w:rFonts w:ascii="Symbol" w:hAnsi="Symbol" w:hint="default"/>
         <w:sz w:val="20"/>
       </w:rPr>
     </w:lvl>
@@ -7889,7 +8087,7 @@
         <w:ind w:left="5760" w:hanging="360"/>
       </w:pPr>
       <w:rPr>
-        <w:rFonts w:hint="default" w:ascii="Symbol" w:hAnsi="Symbol"/>
+        <w:rFonts w:ascii="Symbol" w:hAnsi="Symbol" w:hint="default"/>
         <w:sz w:val="20"/>
       </w:rPr>
     </w:lvl>
@@ -7905,7 +8103,7 @@
         <w:ind w:left="6480" w:hanging="360"/>
       </w:pPr>
       <w:rPr>
-        <w:rFonts w:hint="default" w:ascii="Symbol" w:hAnsi="Symbol"/>
+        <w:rFonts w:ascii="Symbol" w:hAnsi="Symbol" w:hint="default"/>
         <w:sz w:val="20"/>
       </w:rPr>
     </w:lvl>
@@ -7926,7 +8124,7 @@
         <w:ind w:left="720" w:hanging="360"/>
       </w:pPr>
       <w:rPr>
-        <w:rFonts w:hint="default" w:ascii="Symbol" w:hAnsi="Symbol"/>
+        <w:rFonts w:ascii="Symbol" w:hAnsi="Symbol" w:hint="default"/>
         <w:sz w:val="20"/>
       </w:rPr>
     </w:lvl>
@@ -7942,7 +8140,7 @@
         <w:ind w:left="1440" w:hanging="360"/>
       </w:pPr>
       <w:rPr>
-        <w:rFonts w:hint="default" w:ascii="Symbol" w:hAnsi="Symbol"/>
+        <w:rFonts w:ascii="Symbol" w:hAnsi="Symbol" w:hint="default"/>
         <w:sz w:val="20"/>
       </w:rPr>
     </w:lvl>
@@ -7958,7 +8156,7 @@
         <w:ind w:left="2160" w:hanging="360"/>
       </w:pPr>
       <w:rPr>
-        <w:rFonts w:hint="default" w:ascii="Symbol" w:hAnsi="Symbol"/>
+        <w:rFonts w:ascii="Symbol" w:hAnsi="Symbol" w:hint="default"/>
         <w:sz w:val="20"/>
       </w:rPr>
     </w:lvl>
@@ -7974,7 +8172,7 @@
         <w:ind w:left="2880" w:hanging="360"/>
       </w:pPr>
       <w:rPr>
-        <w:rFonts w:hint="default" w:ascii="Symbol" w:hAnsi="Symbol"/>
+        <w:rFonts w:ascii="Symbol" w:hAnsi="Symbol" w:hint="default"/>
         <w:sz w:val="20"/>
       </w:rPr>
     </w:lvl>
@@ -7990,7 +8188,7 @@
         <w:ind w:left="3600" w:hanging="360"/>
       </w:pPr>
       <w:rPr>
-        <w:rFonts w:hint="default" w:ascii="Symbol" w:hAnsi="Symbol"/>
+        <w:rFonts w:ascii="Symbol" w:hAnsi="Symbol" w:hint="default"/>
         <w:sz w:val="20"/>
       </w:rPr>
     </w:lvl>
@@ -8006,7 +8204,7 @@
         <w:ind w:left="4320" w:hanging="360"/>
       </w:pPr>
       <w:rPr>
-        <w:rFonts w:hint="default" w:ascii="Symbol" w:hAnsi="Symbol"/>
+        <w:rFonts w:ascii="Symbol" w:hAnsi="Symbol" w:hint="default"/>
         <w:sz w:val="20"/>
       </w:rPr>
     </w:lvl>
@@ -8022,7 +8220,7 @@
         <w:ind w:left="5040" w:hanging="360"/>
       </w:pPr>
       <w:rPr>
-        <w:rFonts w:hint="default" w:ascii="Symbol" w:hAnsi="Symbol"/>
+        <w:rFonts w:ascii="Symbol" w:hAnsi="Symbol" w:hint="default"/>
         <w:sz w:val="20"/>
       </w:rPr>
     </w:lvl>
@@ -8038,7 +8236,7 @@
         <w:ind w:left="5760" w:hanging="360"/>
       </w:pPr>
       <w:rPr>
-        <w:rFonts w:hint="default" w:ascii="Symbol" w:hAnsi="Symbol"/>
+        <w:rFonts w:ascii="Symbol" w:hAnsi="Symbol" w:hint="default"/>
         <w:sz w:val="20"/>
       </w:rPr>
     </w:lvl>
@@ -8054,7 +8252,7 @@
         <w:ind w:left="6480" w:hanging="360"/>
       </w:pPr>
       <w:rPr>
-        <w:rFonts w:hint="default" w:ascii="Symbol" w:hAnsi="Symbol"/>
+        <w:rFonts w:ascii="Symbol" w:hAnsi="Symbol" w:hint="default"/>
         <w:sz w:val="20"/>
       </w:rPr>
     </w:lvl>
@@ -8075,7 +8273,7 @@
         <w:ind w:left="720" w:hanging="360"/>
       </w:pPr>
       <w:rPr>
-        <w:rFonts w:hint="default" w:ascii="Symbol" w:hAnsi="Symbol"/>
+        <w:rFonts w:ascii="Symbol" w:hAnsi="Symbol" w:hint="default"/>
         <w:sz w:val="20"/>
       </w:rPr>
     </w:lvl>
@@ -8091,7 +8289,7 @@
         <w:ind w:left="1440" w:hanging="360"/>
       </w:pPr>
       <w:rPr>
-        <w:rFonts w:hint="default" w:ascii="Symbol" w:hAnsi="Symbol"/>
+        <w:rFonts w:ascii="Symbol" w:hAnsi="Symbol" w:hint="default"/>
         <w:sz w:val="20"/>
       </w:rPr>
     </w:lvl>
@@ -8107,7 +8305,7 @@
         <w:ind w:left="2160" w:hanging="360"/>
       </w:pPr>
       <w:rPr>
-        <w:rFonts w:hint="default" w:ascii="Symbol" w:hAnsi="Symbol"/>
+        <w:rFonts w:ascii="Symbol" w:hAnsi="Symbol" w:hint="default"/>
         <w:sz w:val="20"/>
       </w:rPr>
     </w:lvl>
@@ -8123,7 +8321,7 @@
         <w:ind w:left="2880" w:hanging="360"/>
       </w:pPr>
       <w:rPr>
-        <w:rFonts w:hint="default" w:ascii="Symbol" w:hAnsi="Symbol"/>
+        <w:rFonts w:ascii="Symbol" w:hAnsi="Symbol" w:hint="default"/>
         <w:sz w:val="20"/>
       </w:rPr>
     </w:lvl>
@@ -8139,7 +8337,7 @@
         <w:ind w:left="3600" w:hanging="360"/>
       </w:pPr>
       <w:rPr>
-        <w:rFonts w:hint="default" w:ascii="Symbol" w:hAnsi="Symbol"/>
+        <w:rFonts w:ascii="Symbol" w:hAnsi="Symbol" w:hint="default"/>
         <w:sz w:val="20"/>
       </w:rPr>
     </w:lvl>
@@ -8155,7 +8353,7 @@
         <w:ind w:left="4320" w:hanging="360"/>
       </w:pPr>
       <w:rPr>
-        <w:rFonts w:hint="default" w:ascii="Symbol" w:hAnsi="Symbol"/>
+        <w:rFonts w:ascii="Symbol" w:hAnsi="Symbol" w:hint="default"/>
         <w:sz w:val="20"/>
       </w:rPr>
     </w:lvl>
@@ -8171,7 +8369,7 @@
         <w:ind w:left="5040" w:hanging="360"/>
       </w:pPr>
       <w:rPr>
-        <w:rFonts w:hint="default" w:ascii="Symbol" w:hAnsi="Symbol"/>
+        <w:rFonts w:ascii="Symbol" w:hAnsi="Symbol" w:hint="default"/>
         <w:sz w:val="20"/>
       </w:rPr>
     </w:lvl>
@@ -8187,7 +8385,7 @@
         <w:ind w:left="5760" w:hanging="360"/>
       </w:pPr>
       <w:rPr>
-        <w:rFonts w:hint="default" w:ascii="Symbol" w:hAnsi="Symbol"/>
+        <w:rFonts w:ascii="Symbol" w:hAnsi="Symbol" w:hint="default"/>
         <w:sz w:val="20"/>
       </w:rPr>
     </w:lvl>
@@ -8203,7 +8401,7 @@
         <w:ind w:left="6480" w:hanging="360"/>
       </w:pPr>
       <w:rPr>
-        <w:rFonts w:hint="default" w:ascii="Symbol" w:hAnsi="Symbol"/>
+        <w:rFonts w:ascii="Symbol" w:hAnsi="Symbol" w:hint="default"/>
         <w:sz w:val="20"/>
       </w:rPr>
     </w:lvl>
@@ -8224,7 +8422,7 @@
         <w:ind w:left="720" w:hanging="360"/>
       </w:pPr>
       <w:rPr>
-        <w:rFonts w:hint="default" w:ascii="Symbol" w:hAnsi="Symbol"/>
+        <w:rFonts w:ascii="Symbol" w:hAnsi="Symbol" w:hint="default"/>
         <w:sz w:val="20"/>
       </w:rPr>
     </w:lvl>
@@ -8240,7 +8438,7 @@
         <w:ind w:left="1440" w:hanging="360"/>
       </w:pPr>
       <w:rPr>
-        <w:rFonts w:hint="default" w:ascii="Courier New" w:hAnsi="Courier New"/>
+        <w:rFonts w:ascii="Courier New" w:hAnsi="Courier New" w:hint="default"/>
         <w:sz w:val="20"/>
       </w:rPr>
     </w:lvl>
@@ -8256,7 +8454,7 @@
         <w:ind w:left="2160" w:hanging="360"/>
       </w:pPr>
       <w:rPr>
-        <w:rFonts w:hint="default" w:ascii="Wingdings" w:hAnsi="Wingdings"/>
+        <w:rFonts w:ascii="Wingdings" w:hAnsi="Wingdings" w:hint="default"/>
         <w:sz w:val="20"/>
       </w:rPr>
     </w:lvl>
@@ -8272,7 +8470,7 @@
         <w:ind w:left="2880" w:hanging="360"/>
       </w:pPr>
       <w:rPr>
-        <w:rFonts w:hint="default" w:ascii="Wingdings" w:hAnsi="Wingdings"/>
+        <w:rFonts w:ascii="Wingdings" w:hAnsi="Wingdings" w:hint="default"/>
         <w:sz w:val="20"/>
       </w:rPr>
     </w:lvl>
@@ -8288,7 +8486,7 @@
         <w:ind w:left="3600" w:hanging="360"/>
       </w:pPr>
       <w:rPr>
-        <w:rFonts w:hint="default" w:ascii="Wingdings" w:hAnsi="Wingdings"/>
+        <w:rFonts w:ascii="Wingdings" w:hAnsi="Wingdings" w:hint="default"/>
         <w:sz w:val="20"/>
       </w:rPr>
     </w:lvl>
@@ -8304,7 +8502,7 @@
         <w:ind w:left="4320" w:hanging="360"/>
       </w:pPr>
       <w:rPr>
-        <w:rFonts w:hint="default" w:ascii="Wingdings" w:hAnsi="Wingdings"/>
+        <w:rFonts w:ascii="Wingdings" w:hAnsi="Wingdings" w:hint="default"/>
         <w:sz w:val="20"/>
       </w:rPr>
     </w:lvl>
@@ -8320,7 +8518,7 @@
         <w:ind w:left="5040" w:hanging="360"/>
       </w:pPr>
       <w:rPr>
-        <w:rFonts w:hint="default" w:ascii="Wingdings" w:hAnsi="Wingdings"/>
+        <w:rFonts w:ascii="Wingdings" w:hAnsi="Wingdings" w:hint="default"/>
         <w:sz w:val="20"/>
       </w:rPr>
     </w:lvl>
@@ -8336,7 +8534,7 @@
         <w:ind w:left="5760" w:hanging="360"/>
       </w:pPr>
       <w:rPr>
-        <w:rFonts w:hint="default" w:ascii="Wingdings" w:hAnsi="Wingdings"/>
+        <w:rFonts w:ascii="Wingdings" w:hAnsi="Wingdings" w:hint="default"/>
         <w:sz w:val="20"/>
       </w:rPr>
     </w:lvl>
@@ -8352,7 +8550,7 @@
         <w:ind w:left="6480" w:hanging="360"/>
       </w:pPr>
       <w:rPr>
-        <w:rFonts w:hint="default" w:ascii="Wingdings" w:hAnsi="Wingdings"/>
+        <w:rFonts w:ascii="Wingdings" w:hAnsi="Wingdings" w:hint="default"/>
         <w:sz w:val="20"/>
       </w:rPr>
     </w:lvl>
@@ -8373,7 +8571,7 @@
         <w:ind w:left="720" w:hanging="360"/>
       </w:pPr>
       <w:rPr>
-        <w:rFonts w:hint="default" w:ascii="Symbol" w:hAnsi="Symbol"/>
+        <w:rFonts w:ascii="Symbol" w:hAnsi="Symbol" w:hint="default"/>
         <w:sz w:val="20"/>
       </w:rPr>
     </w:lvl>
@@ -8389,7 +8587,7 @@
         <w:ind w:left="1440" w:hanging="360"/>
       </w:pPr>
       <w:rPr>
-        <w:rFonts w:hint="default" w:ascii="Symbol" w:hAnsi="Symbol"/>
+        <w:rFonts w:ascii="Symbol" w:hAnsi="Symbol" w:hint="default"/>
         <w:sz w:val="20"/>
       </w:rPr>
     </w:lvl>
@@ -8405,7 +8603,7 @@
         <w:ind w:left="2160" w:hanging="360"/>
       </w:pPr>
       <w:rPr>
-        <w:rFonts w:hint="default" w:ascii="Symbol" w:hAnsi="Symbol"/>
+        <w:rFonts w:ascii="Symbol" w:hAnsi="Symbol" w:hint="default"/>
         <w:sz w:val="20"/>
       </w:rPr>
     </w:lvl>
@@ -8421,7 +8619,7 @@
         <w:ind w:left="2880" w:hanging="360"/>
       </w:pPr>
       <w:rPr>
-        <w:rFonts w:hint="default" w:ascii="Symbol" w:hAnsi="Symbol"/>
+        <w:rFonts w:ascii="Symbol" w:hAnsi="Symbol" w:hint="default"/>
         <w:sz w:val="20"/>
       </w:rPr>
     </w:lvl>
@@ -8437,7 +8635,7 @@
         <w:ind w:left="3600" w:hanging="360"/>
       </w:pPr>
       <w:rPr>
-        <w:rFonts w:hint="default" w:ascii="Symbol" w:hAnsi="Symbol"/>
+        <w:rFonts w:ascii="Symbol" w:hAnsi="Symbol" w:hint="default"/>
         <w:sz w:val="20"/>
       </w:rPr>
     </w:lvl>
@@ -8453,7 +8651,7 @@
         <w:ind w:left="4320" w:hanging="360"/>
       </w:pPr>
       <w:rPr>
-        <w:rFonts w:hint="default" w:ascii="Symbol" w:hAnsi="Symbol"/>
+        <w:rFonts w:ascii="Symbol" w:hAnsi="Symbol" w:hint="default"/>
         <w:sz w:val="20"/>
       </w:rPr>
     </w:lvl>
@@ -8469,7 +8667,7 @@
         <w:ind w:left="5040" w:hanging="360"/>
       </w:pPr>
       <w:rPr>
-        <w:rFonts w:hint="default" w:ascii="Symbol" w:hAnsi="Symbol"/>
+        <w:rFonts w:ascii="Symbol" w:hAnsi="Symbol" w:hint="default"/>
         <w:sz w:val="20"/>
       </w:rPr>
     </w:lvl>
@@ -8485,7 +8683,7 @@
         <w:ind w:left="5760" w:hanging="360"/>
       </w:pPr>
       <w:rPr>
-        <w:rFonts w:hint="default" w:ascii="Symbol" w:hAnsi="Symbol"/>
+        <w:rFonts w:ascii="Symbol" w:hAnsi="Symbol" w:hint="default"/>
         <w:sz w:val="20"/>
       </w:rPr>
     </w:lvl>
@@ -8501,7 +8699,7 @@
         <w:ind w:left="6480" w:hanging="360"/>
       </w:pPr>
       <w:rPr>
-        <w:rFonts w:hint="default" w:ascii="Symbol" w:hAnsi="Symbol"/>
+        <w:rFonts w:ascii="Symbol" w:hAnsi="Symbol" w:hint="default"/>
         <w:sz w:val="20"/>
       </w:rPr>
     </w:lvl>
@@ -8522,7 +8720,7 @@
         <w:ind w:left="720" w:hanging="360"/>
       </w:pPr>
       <w:rPr>
-        <w:rFonts w:hint="default" w:ascii="Symbol" w:hAnsi="Symbol"/>
+        <w:rFonts w:ascii="Symbol" w:hAnsi="Symbol" w:hint="default"/>
         <w:sz w:val="20"/>
       </w:rPr>
     </w:lvl>
@@ -8538,7 +8736,7 @@
         <w:ind w:left="1440" w:hanging="360"/>
       </w:pPr>
       <w:rPr>
-        <w:rFonts w:hint="default" w:ascii="Symbol" w:hAnsi="Symbol"/>
+        <w:rFonts w:ascii="Symbol" w:hAnsi="Symbol" w:hint="default"/>
         <w:sz w:val="20"/>
       </w:rPr>
     </w:lvl>
@@ -8554,7 +8752,7 @@
         <w:ind w:left="2160" w:hanging="360"/>
       </w:pPr>
       <w:rPr>
-        <w:rFonts w:hint="default" w:ascii="Symbol" w:hAnsi="Symbol"/>
+        <w:rFonts w:ascii="Symbol" w:hAnsi="Symbol" w:hint="default"/>
         <w:sz w:val="20"/>
       </w:rPr>
     </w:lvl>
@@ -8570,7 +8768,7 @@
         <w:ind w:left="2880" w:hanging="360"/>
       </w:pPr>
       <w:rPr>
-        <w:rFonts w:hint="default" w:ascii="Symbol" w:hAnsi="Symbol"/>
+        <w:rFonts w:ascii="Symbol" w:hAnsi="Symbol" w:hint="default"/>
         <w:sz w:val="20"/>
       </w:rPr>
     </w:lvl>
@@ -8586,7 +8784,7 @@
         <w:ind w:left="3600" w:hanging="360"/>
       </w:pPr>
       <w:rPr>
-        <w:rFonts w:hint="default" w:ascii="Symbol" w:hAnsi="Symbol"/>
+        <w:rFonts w:ascii="Symbol" w:hAnsi="Symbol" w:hint="default"/>
         <w:sz w:val="20"/>
       </w:rPr>
     </w:lvl>
@@ -8602,7 +8800,7 @@
         <w:ind w:left="4320" w:hanging="360"/>
       </w:pPr>
       <w:rPr>
-        <w:rFonts w:hint="default" w:ascii="Symbol" w:hAnsi="Symbol"/>
+        <w:rFonts w:ascii="Symbol" w:hAnsi="Symbol" w:hint="default"/>
         <w:sz w:val="20"/>
       </w:rPr>
     </w:lvl>
@@ -8618,7 +8816,7 @@
         <w:ind w:left="5040" w:hanging="360"/>
       </w:pPr>
       <w:rPr>
-        <w:rFonts w:hint="default" w:ascii="Symbol" w:hAnsi="Symbol"/>
+        <w:rFonts w:ascii="Symbol" w:hAnsi="Symbol" w:hint="default"/>
         <w:sz w:val="20"/>
       </w:rPr>
     </w:lvl>
@@ -8634,7 +8832,7 @@
         <w:ind w:left="5760" w:hanging="360"/>
       </w:pPr>
       <w:rPr>
-        <w:rFonts w:hint="default" w:ascii="Symbol" w:hAnsi="Symbol"/>
+        <w:rFonts w:ascii="Symbol" w:hAnsi="Symbol" w:hint="default"/>
         <w:sz w:val="20"/>
       </w:rPr>
     </w:lvl>
@@ -8650,7 +8848,7 @@
         <w:ind w:left="6480" w:hanging="360"/>
       </w:pPr>
       <w:rPr>
-        <w:rFonts w:hint="default" w:ascii="Symbol" w:hAnsi="Symbol"/>
+        <w:rFonts w:ascii="Symbol" w:hAnsi="Symbol" w:hint="default"/>
         <w:sz w:val="20"/>
       </w:rPr>
     </w:lvl>
@@ -8671,7 +8869,7 @@
         <w:ind w:left="720" w:hanging="360"/>
       </w:pPr>
       <w:rPr>
-        <w:rFonts w:hint="default" w:ascii="Symbol" w:hAnsi="Symbol"/>
+        <w:rFonts w:ascii="Symbol" w:hAnsi="Symbol" w:hint="default"/>
         <w:sz w:val="20"/>
       </w:rPr>
     </w:lvl>
@@ -8687,7 +8885,7 @@
         <w:ind w:left="1440" w:hanging="360"/>
       </w:pPr>
       <w:rPr>
-        <w:rFonts w:hint="default" w:ascii="Symbol" w:hAnsi="Symbol"/>
+        <w:rFonts w:ascii="Symbol" w:hAnsi="Symbol" w:hint="default"/>
         <w:sz w:val="20"/>
       </w:rPr>
     </w:lvl>
@@ -8703,7 +8901,7 @@
         <w:ind w:left="2160" w:hanging="360"/>
       </w:pPr>
       <w:rPr>
-        <w:rFonts w:hint="default" w:ascii="Symbol" w:hAnsi="Symbol"/>
+        <w:rFonts w:ascii="Symbol" w:hAnsi="Symbol" w:hint="default"/>
         <w:sz w:val="20"/>
       </w:rPr>
     </w:lvl>
@@ -8719,7 +8917,7 @@
         <w:ind w:left="2880" w:hanging="360"/>
       </w:pPr>
       <w:rPr>
-        <w:rFonts w:hint="default" w:ascii="Symbol" w:hAnsi="Symbol"/>
+        <w:rFonts w:ascii="Symbol" w:hAnsi="Symbol" w:hint="default"/>
         <w:sz w:val="20"/>
       </w:rPr>
     </w:lvl>
@@ -8735,7 +8933,7 @@
         <w:ind w:left="3600" w:hanging="360"/>
       </w:pPr>
       <w:rPr>
-        <w:rFonts w:hint="default" w:ascii="Symbol" w:hAnsi="Symbol"/>
+        <w:rFonts w:ascii="Symbol" w:hAnsi="Symbol" w:hint="default"/>
         <w:sz w:val="20"/>
       </w:rPr>
     </w:lvl>
@@ -8751,7 +8949,7 @@
         <w:ind w:left="4320" w:hanging="360"/>
       </w:pPr>
       <w:rPr>
-        <w:rFonts w:hint="default" w:ascii="Symbol" w:hAnsi="Symbol"/>
+        <w:rFonts w:ascii="Symbol" w:hAnsi="Symbol" w:hint="default"/>
         <w:sz w:val="20"/>
       </w:rPr>
     </w:lvl>
@@ -8767,7 +8965,7 @@
         <w:ind w:left="5040" w:hanging="360"/>
       </w:pPr>
       <w:rPr>
-        <w:rFonts w:hint="default" w:ascii="Symbol" w:hAnsi="Symbol"/>
+        <w:rFonts w:ascii="Symbol" w:hAnsi="Symbol" w:hint="default"/>
         <w:sz w:val="20"/>
       </w:rPr>
     </w:lvl>
@@ -8783,7 +8981,7 @@
         <w:ind w:left="5760" w:hanging="360"/>
       </w:pPr>
       <w:rPr>
-        <w:rFonts w:hint="default" w:ascii="Symbol" w:hAnsi="Symbol"/>
+        <w:rFonts w:ascii="Symbol" w:hAnsi="Symbol" w:hint="default"/>
         <w:sz w:val="20"/>
       </w:rPr>
     </w:lvl>
@@ -8799,7 +8997,7 @@
         <w:ind w:left="6480" w:hanging="360"/>
       </w:pPr>
       <w:rPr>
-        <w:rFonts w:hint="default" w:ascii="Symbol" w:hAnsi="Symbol"/>
+        <w:rFonts w:ascii="Symbol" w:hAnsi="Symbol" w:hint="default"/>
         <w:sz w:val="20"/>
       </w:rPr>
     </w:lvl>
@@ -8820,7 +9018,7 @@
         <w:ind w:left="720" w:hanging="360"/>
       </w:pPr>
       <w:rPr>
-        <w:rFonts w:hint="default" w:ascii="Symbol" w:hAnsi="Symbol"/>
+        <w:rFonts w:ascii="Symbol" w:hAnsi="Symbol" w:hint="default"/>
         <w:sz w:val="20"/>
       </w:rPr>
     </w:lvl>
@@ -8836,7 +9034,7 @@
         <w:ind w:left="1440" w:hanging="360"/>
       </w:pPr>
       <w:rPr>
-        <w:rFonts w:hint="default" w:ascii="Symbol" w:hAnsi="Symbol"/>
+        <w:rFonts w:ascii="Symbol" w:hAnsi="Symbol" w:hint="default"/>
         <w:sz w:val="20"/>
       </w:rPr>
     </w:lvl>
@@ -8852,7 +9050,7 @@
         <w:ind w:left="2160" w:hanging="360"/>
       </w:pPr>
       <w:rPr>
-        <w:rFonts w:hint="default" w:ascii="Symbol" w:hAnsi="Symbol"/>
+        <w:rFonts w:ascii="Symbol" w:hAnsi="Symbol" w:hint="default"/>
         <w:sz w:val="20"/>
       </w:rPr>
     </w:lvl>
@@ -8868,7 +9066,7 @@
         <w:ind w:left="2880" w:hanging="360"/>
       </w:pPr>
       <w:rPr>
-        <w:rFonts w:hint="default" w:ascii="Symbol" w:hAnsi="Symbol"/>
+        <w:rFonts w:ascii="Symbol" w:hAnsi="Symbol" w:hint="default"/>
         <w:sz w:val="20"/>
       </w:rPr>
     </w:lvl>
@@ -8884,7 +9082,7 @@
         <w:ind w:left="3600" w:hanging="360"/>
       </w:pPr>
       <w:rPr>
-        <w:rFonts w:hint="default" w:ascii="Symbol" w:hAnsi="Symbol"/>
+        <w:rFonts w:ascii="Symbol" w:hAnsi="Symbol" w:hint="default"/>
         <w:sz w:val="20"/>
       </w:rPr>
     </w:lvl>
@@ -8900,7 +9098,7 @@
         <w:ind w:left="4320" w:hanging="360"/>
       </w:pPr>
       <w:rPr>
-        <w:rFonts w:hint="default" w:ascii="Symbol" w:hAnsi="Symbol"/>
+        <w:rFonts w:ascii="Symbol" w:hAnsi="Symbol" w:hint="default"/>
         <w:sz w:val="20"/>
       </w:rPr>
     </w:lvl>
@@ -8916,7 +9114,7 @@
         <w:ind w:left="5040" w:hanging="360"/>
       </w:pPr>
       <w:rPr>
-        <w:rFonts w:hint="default" w:ascii="Symbol" w:hAnsi="Symbol"/>
+        <w:rFonts w:ascii="Symbol" w:hAnsi="Symbol" w:hint="default"/>
         <w:sz w:val="20"/>
       </w:rPr>
     </w:lvl>
@@ -8932,7 +9130,7 @@
         <w:ind w:left="5760" w:hanging="360"/>
       </w:pPr>
       <w:rPr>
-        <w:rFonts w:hint="default" w:ascii="Symbol" w:hAnsi="Symbol"/>
+        <w:rFonts w:ascii="Symbol" w:hAnsi="Symbol" w:hint="default"/>
         <w:sz w:val="20"/>
       </w:rPr>
     </w:lvl>
@@ -8948,7 +9146,7 @@
         <w:ind w:left="6480" w:hanging="360"/>
       </w:pPr>
       <w:rPr>
-        <w:rFonts w:hint="default" w:ascii="Symbol" w:hAnsi="Symbol"/>
+        <w:rFonts w:ascii="Symbol" w:hAnsi="Symbol" w:hint="default"/>
         <w:sz w:val="20"/>
       </w:rPr>
     </w:lvl>
@@ -8969,7 +9167,7 @@
         <w:ind w:left="720" w:hanging="360"/>
       </w:pPr>
       <w:rPr>
-        <w:rFonts w:hint="default" w:ascii="Symbol" w:hAnsi="Symbol"/>
+        <w:rFonts w:ascii="Symbol" w:hAnsi="Symbol" w:hint="default"/>
         <w:sz w:val="20"/>
       </w:rPr>
     </w:lvl>
@@ -8985,7 +9183,7 @@
         <w:ind w:left="1440" w:hanging="360"/>
       </w:pPr>
       <w:rPr>
-        <w:rFonts w:hint="default" w:ascii="Symbol" w:hAnsi="Symbol"/>
+        <w:rFonts w:ascii="Symbol" w:hAnsi="Symbol" w:hint="default"/>
         <w:sz w:val="20"/>
       </w:rPr>
     </w:lvl>
@@ -9001,7 +9199,7 @@
         <w:ind w:left="2160" w:hanging="360"/>
       </w:pPr>
       <w:rPr>
-        <w:rFonts w:hint="default" w:ascii="Symbol" w:hAnsi="Symbol"/>
+        <w:rFonts w:ascii="Symbol" w:hAnsi="Symbol" w:hint="default"/>
         <w:sz w:val="20"/>
       </w:rPr>
     </w:lvl>
@@ -9017,7 +9215,7 @@
         <w:ind w:left="2880" w:hanging="360"/>
       </w:pPr>
       <w:rPr>
-        <w:rFonts w:hint="default" w:ascii="Symbol" w:hAnsi="Symbol"/>
+        <w:rFonts w:ascii="Symbol" w:hAnsi="Symbol" w:hint="default"/>
         <w:sz w:val="20"/>
       </w:rPr>
     </w:lvl>
@@ -9033,7 +9231,7 @@
         <w:ind w:left="3600" w:hanging="360"/>
       </w:pPr>
       <w:rPr>
-        <w:rFonts w:hint="default" w:ascii="Symbol" w:hAnsi="Symbol"/>
+        <w:rFonts w:ascii="Symbol" w:hAnsi="Symbol" w:hint="default"/>
         <w:sz w:val="20"/>
       </w:rPr>
     </w:lvl>
@@ -9049,7 +9247,7 @@
         <w:ind w:left="4320" w:hanging="360"/>
       </w:pPr>
       <w:rPr>
-        <w:rFonts w:hint="default" w:ascii="Symbol" w:hAnsi="Symbol"/>
+        <w:rFonts w:ascii="Symbol" w:hAnsi="Symbol" w:hint="default"/>
         <w:sz w:val="20"/>
       </w:rPr>
     </w:lvl>
@@ -9065,7 +9263,7 @@
         <w:ind w:left="5040" w:hanging="360"/>
       </w:pPr>
       <w:rPr>
-        <w:rFonts w:hint="default" w:ascii="Symbol" w:hAnsi="Symbol"/>
+        <w:rFonts w:ascii="Symbol" w:hAnsi="Symbol" w:hint="default"/>
         <w:sz w:val="20"/>
       </w:rPr>
     </w:lvl>
@@ -9081,7 +9279,7 @@
         <w:ind w:left="5760" w:hanging="360"/>
       </w:pPr>
       <w:rPr>
-        <w:rFonts w:hint="default" w:ascii="Symbol" w:hAnsi="Symbol"/>
+        <w:rFonts w:ascii="Symbol" w:hAnsi="Symbol" w:hint="default"/>
         <w:sz w:val="20"/>
       </w:rPr>
     </w:lvl>
@@ -9097,7 +9295,7 @@
         <w:ind w:left="6480" w:hanging="360"/>
       </w:pPr>
       <w:rPr>
-        <w:rFonts w:hint="default" w:ascii="Symbol" w:hAnsi="Symbol"/>
+        <w:rFonts w:ascii="Symbol" w:hAnsi="Symbol" w:hint="default"/>
         <w:sz w:val="20"/>
       </w:rPr>
     </w:lvl>
@@ -9118,7 +9316,7 @@
         <w:ind w:left="720" w:hanging="360"/>
       </w:pPr>
       <w:rPr>
-        <w:rFonts w:hint="default" w:ascii="Symbol" w:hAnsi="Symbol"/>
+        <w:rFonts w:ascii="Symbol" w:hAnsi="Symbol" w:hint="default"/>
         <w:sz w:val="20"/>
       </w:rPr>
     </w:lvl>
@@ -9134,7 +9332,7 @@
         <w:ind w:left="1440" w:hanging="360"/>
       </w:pPr>
       <w:rPr>
-        <w:rFonts w:hint="default" w:ascii="Symbol" w:hAnsi="Symbol"/>
+        <w:rFonts w:ascii="Symbol" w:hAnsi="Symbol" w:hint="default"/>
         <w:sz w:val="20"/>
       </w:rPr>
     </w:lvl>
@@ -9150,7 +9348,7 @@
         <w:ind w:left="2160" w:hanging="360"/>
       </w:pPr>
       <w:rPr>
-        <w:rFonts w:hint="default" w:ascii="Symbol" w:hAnsi="Symbol"/>
+        <w:rFonts w:ascii="Symbol" w:hAnsi="Symbol" w:hint="default"/>
         <w:sz w:val="20"/>
       </w:rPr>
     </w:lvl>
@@ -9166,7 +9364,7 @@
         <w:ind w:left="2880" w:hanging="360"/>
       </w:pPr>
       <w:rPr>
-        <w:rFonts w:hint="default" w:ascii="Symbol" w:hAnsi="Symbol"/>
+        <w:rFonts w:ascii="Symbol" w:hAnsi="Symbol" w:hint="default"/>
         <w:sz w:val="20"/>
       </w:rPr>
     </w:lvl>
@@ -9182,7 +9380,7 @@
         <w:ind w:left="3600" w:hanging="360"/>
       </w:pPr>
       <w:rPr>
-        <w:rFonts w:hint="default" w:ascii="Symbol" w:hAnsi="Symbol"/>
+        <w:rFonts w:ascii="Symbol" w:hAnsi="Symbol" w:hint="default"/>
         <w:sz w:val="20"/>
       </w:rPr>
     </w:lvl>
@@ -9198,7 +9396,7 @@
         <w:ind w:left="4320" w:hanging="360"/>
       </w:pPr>
       <w:rPr>
-        <w:rFonts w:hint="default" w:ascii="Symbol" w:hAnsi="Symbol"/>
+        <w:rFonts w:ascii="Symbol" w:hAnsi="Symbol" w:hint="default"/>
         <w:sz w:val="20"/>
       </w:rPr>
     </w:lvl>
@@ -9214,7 +9412,7 @@
         <w:ind w:left="5040" w:hanging="360"/>
       </w:pPr>
       <w:rPr>
-        <w:rFonts w:hint="default" w:ascii="Symbol" w:hAnsi="Symbol"/>
+        <w:rFonts w:ascii="Symbol" w:hAnsi="Symbol" w:hint="default"/>
         <w:sz w:val="20"/>
       </w:rPr>
     </w:lvl>
@@ -9230,7 +9428,7 @@
         <w:ind w:left="5760" w:hanging="360"/>
       </w:pPr>
       <w:rPr>
-        <w:rFonts w:hint="default" w:ascii="Symbol" w:hAnsi="Symbol"/>
+        <w:rFonts w:ascii="Symbol" w:hAnsi="Symbol" w:hint="default"/>
         <w:sz w:val="20"/>
       </w:rPr>
     </w:lvl>
@@ -9246,7 +9444,7 @@
         <w:ind w:left="6480" w:hanging="360"/>
       </w:pPr>
       <w:rPr>
-        <w:rFonts w:hint="default" w:ascii="Symbol" w:hAnsi="Symbol"/>
+        <w:rFonts w:ascii="Symbol" w:hAnsi="Symbol" w:hint="default"/>
         <w:sz w:val="20"/>
       </w:rPr>
     </w:lvl>
@@ -9267,7 +9465,7 @@
         <w:ind w:left="720" w:hanging="360"/>
       </w:pPr>
       <w:rPr>
-        <w:rFonts w:hint="default" w:ascii="Symbol" w:hAnsi="Symbol"/>
+        <w:rFonts w:ascii="Symbol" w:hAnsi="Symbol" w:hint="default"/>
         <w:sz w:val="20"/>
       </w:rPr>
     </w:lvl>
@@ -9283,7 +9481,7 @@
         <w:ind w:left="1440" w:hanging="360"/>
       </w:pPr>
       <w:rPr>
-        <w:rFonts w:hint="default" w:ascii="Courier New" w:hAnsi="Courier New"/>
+        <w:rFonts w:ascii="Courier New" w:hAnsi="Courier New" w:hint="default"/>
         <w:sz w:val="20"/>
       </w:rPr>
     </w:lvl>
@@ -9299,7 +9497,7 @@
         <w:ind w:left="2160" w:hanging="360"/>
       </w:pPr>
       <w:rPr>
-        <w:rFonts w:hint="default" w:ascii="Wingdings" w:hAnsi="Wingdings"/>
+        <w:rFonts w:ascii="Wingdings" w:hAnsi="Wingdings" w:hint="default"/>
         <w:sz w:val="20"/>
       </w:rPr>
     </w:lvl>
@@ -9315,7 +9513,7 @@
         <w:ind w:left="2880" w:hanging="360"/>
       </w:pPr>
       <w:rPr>
-        <w:rFonts w:hint="default" w:ascii="Wingdings" w:hAnsi="Wingdings"/>
+        <w:rFonts w:ascii="Wingdings" w:hAnsi="Wingdings" w:hint="default"/>
         <w:sz w:val="20"/>
       </w:rPr>
     </w:lvl>
@@ -9331,7 +9529,7 @@
         <w:ind w:left="3600" w:hanging="360"/>
       </w:pPr>
       <w:rPr>
-        <w:rFonts w:hint="default" w:ascii="Wingdings" w:hAnsi="Wingdings"/>
+        <w:rFonts w:ascii="Wingdings" w:hAnsi="Wingdings" w:hint="default"/>
         <w:sz w:val="20"/>
       </w:rPr>
     </w:lvl>
@@ -9347,7 +9545,7 @@
         <w:ind w:left="4320" w:hanging="360"/>
       </w:pPr>
       <w:rPr>
-        <w:rFonts w:hint="default" w:ascii="Wingdings" w:hAnsi="Wingdings"/>
+        <w:rFonts w:ascii="Wingdings" w:hAnsi="Wingdings" w:hint="default"/>
         <w:sz w:val="20"/>
       </w:rPr>
     </w:lvl>
@@ -9363,7 +9561,7 @@
         <w:ind w:left="5040" w:hanging="360"/>
       </w:pPr>
       <w:rPr>
-        <w:rFonts w:hint="default" w:ascii="Wingdings" w:hAnsi="Wingdings"/>
+        <w:rFonts w:ascii="Wingdings" w:hAnsi="Wingdings" w:hint="default"/>
         <w:sz w:val="20"/>
       </w:rPr>
     </w:lvl>
@@ -9379,7 +9577,7 @@
         <w:ind w:left="5760" w:hanging="360"/>
       </w:pPr>
       <w:rPr>
-        <w:rFonts w:hint="default" w:ascii="Wingdings" w:hAnsi="Wingdings"/>
+        <w:rFonts w:ascii="Wingdings" w:hAnsi="Wingdings" w:hint="default"/>
         <w:sz w:val="20"/>
       </w:rPr>
     </w:lvl>
@@ -9395,7 +9593,7 @@
         <w:ind w:left="6480" w:hanging="360"/>
       </w:pPr>
       <w:rPr>
-        <w:rFonts w:hint="default" w:ascii="Wingdings" w:hAnsi="Wingdings"/>
+        <w:rFonts w:ascii="Wingdings" w:hAnsi="Wingdings" w:hint="default"/>
         <w:sz w:val="20"/>
       </w:rPr>
     </w:lvl>
@@ -9416,7 +9614,7 @@
         <w:ind w:left="720" w:hanging="360"/>
       </w:pPr>
       <w:rPr>
-        <w:rFonts w:hint="default" w:ascii="Symbol" w:hAnsi="Symbol"/>
+        <w:rFonts w:ascii="Symbol" w:hAnsi="Symbol" w:hint="default"/>
         <w:sz w:val="20"/>
       </w:rPr>
     </w:lvl>
@@ -9432,7 +9630,7 @@
         <w:ind w:left="1440" w:hanging="360"/>
       </w:pPr>
       <w:rPr>
-        <w:rFonts w:hint="default" w:ascii="Courier New" w:hAnsi="Courier New"/>
+        <w:rFonts w:ascii="Courier New" w:hAnsi="Courier New" w:hint="default"/>
         <w:sz w:val="20"/>
       </w:rPr>
     </w:lvl>
@@ -9448,7 +9646,7 @@
         <w:ind w:left="2160" w:hanging="360"/>
       </w:pPr>
       <w:rPr>
-        <w:rFonts w:hint="default" w:ascii="Wingdings" w:hAnsi="Wingdings"/>
+        <w:rFonts w:ascii="Wingdings" w:hAnsi="Wingdings" w:hint="default"/>
         <w:sz w:val="20"/>
       </w:rPr>
     </w:lvl>
@@ -9464,7 +9662,7 @@
         <w:ind w:left="2880" w:hanging="360"/>
       </w:pPr>
       <w:rPr>
-        <w:rFonts w:hint="default" w:ascii="Wingdings" w:hAnsi="Wingdings"/>
+        <w:rFonts w:ascii="Wingdings" w:hAnsi="Wingdings" w:hint="default"/>
         <w:sz w:val="20"/>
       </w:rPr>
     </w:lvl>
@@ -9480,7 +9678,7 @@
         <w:ind w:left="3600" w:hanging="360"/>
       </w:pPr>
       <w:rPr>
-        <w:rFonts w:hint="default" w:ascii="Wingdings" w:hAnsi="Wingdings"/>
+        <w:rFonts w:ascii="Wingdings" w:hAnsi="Wingdings" w:hint="default"/>
         <w:sz w:val="20"/>
       </w:rPr>
     </w:lvl>
@@ -9496,7 +9694,7 @@
         <w:ind w:left="4320" w:hanging="360"/>
       </w:pPr>
       <w:rPr>
-        <w:rFonts w:hint="default" w:ascii="Wingdings" w:hAnsi="Wingdings"/>
+        <w:rFonts w:ascii="Wingdings" w:hAnsi="Wingdings" w:hint="default"/>
         <w:sz w:val="20"/>
       </w:rPr>
     </w:lvl>
@@ -9512,7 +9710,7 @@
         <w:ind w:left="5040" w:hanging="360"/>
       </w:pPr>
       <w:rPr>
-        <w:rFonts w:hint="default" w:ascii="Wingdings" w:hAnsi="Wingdings"/>
+        <w:rFonts w:ascii="Wingdings" w:hAnsi="Wingdings" w:hint="default"/>
         <w:sz w:val="20"/>
       </w:rPr>
     </w:lvl>
@@ -9528,7 +9726,7 @@
         <w:ind w:left="5760" w:hanging="360"/>
       </w:pPr>
       <w:rPr>
-        <w:rFonts w:hint="default" w:ascii="Wingdings" w:hAnsi="Wingdings"/>
+        <w:rFonts w:ascii="Wingdings" w:hAnsi="Wingdings" w:hint="default"/>
         <w:sz w:val="20"/>
       </w:rPr>
     </w:lvl>
@@ -9544,7 +9742,7 @@
         <w:ind w:left="6480" w:hanging="360"/>
       </w:pPr>
       <w:rPr>
-        <w:rFonts w:hint="default" w:ascii="Wingdings" w:hAnsi="Wingdings"/>
+        <w:rFonts w:ascii="Wingdings" w:hAnsi="Wingdings" w:hint="default"/>
         <w:sz w:val="20"/>
       </w:rPr>
     </w:lvl>
@@ -9565,7 +9763,7 @@
         <w:ind w:left="720" w:hanging="360"/>
       </w:pPr>
       <w:rPr>
-        <w:rFonts w:hint="default" w:ascii="Symbol" w:hAnsi="Symbol"/>
+        <w:rFonts w:ascii="Symbol" w:hAnsi="Symbol" w:hint="default"/>
         <w:sz w:val="20"/>
       </w:rPr>
     </w:lvl>
@@ -9581,7 +9779,7 @@
         <w:ind w:left="1440" w:hanging="360"/>
       </w:pPr>
       <w:rPr>
-        <w:rFonts w:hint="default" w:ascii="Courier New" w:hAnsi="Courier New"/>
+        <w:rFonts w:ascii="Courier New" w:hAnsi="Courier New" w:hint="default"/>
         <w:sz w:val="20"/>
       </w:rPr>
     </w:lvl>
@@ -9597,7 +9795,7 @@
         <w:ind w:left="2160" w:hanging="360"/>
       </w:pPr>
       <w:rPr>
-        <w:rFonts w:hint="default" w:ascii="Wingdings" w:hAnsi="Wingdings"/>
+        <w:rFonts w:ascii="Wingdings" w:hAnsi="Wingdings" w:hint="default"/>
         <w:sz w:val="20"/>
       </w:rPr>
     </w:lvl>
@@ -9613,7 +9811,7 @@
         <w:ind w:left="2880" w:hanging="360"/>
       </w:pPr>
       <w:rPr>
-        <w:rFonts w:hint="default" w:ascii="Wingdings" w:hAnsi="Wingdings"/>
+        <w:rFonts w:ascii="Wingdings" w:hAnsi="Wingdings" w:hint="default"/>
         <w:sz w:val="20"/>
       </w:rPr>
     </w:lvl>
@@ -9629,7 +9827,7 @@
         <w:ind w:left="3600" w:hanging="360"/>
       </w:pPr>
       <w:rPr>
-        <w:rFonts w:hint="default" w:ascii="Wingdings" w:hAnsi="Wingdings"/>
+        <w:rFonts w:ascii="Wingdings" w:hAnsi="Wingdings" w:hint="default"/>
         <w:sz w:val="20"/>
       </w:rPr>
     </w:lvl>
@@ -9645,7 +9843,7 @@
         <w:ind w:left="4320" w:hanging="360"/>
       </w:pPr>
       <w:rPr>
-        <w:rFonts w:hint="default" w:ascii="Wingdings" w:hAnsi="Wingdings"/>
+        <w:rFonts w:ascii="Wingdings" w:hAnsi="Wingdings" w:hint="default"/>
         <w:sz w:val="20"/>
       </w:rPr>
     </w:lvl>
@@ -9661,7 +9859,7 @@
         <w:ind w:left="5040" w:hanging="360"/>
       </w:pPr>
       <w:rPr>
-        <w:rFonts w:hint="default" w:ascii="Wingdings" w:hAnsi="Wingdings"/>
+        <w:rFonts w:ascii="Wingdings" w:hAnsi="Wingdings" w:hint="default"/>
         <w:sz w:val="20"/>
       </w:rPr>
     </w:lvl>
@@ -9677,7 +9875,7 @@
         <w:ind w:left="5760" w:hanging="360"/>
       </w:pPr>
       <w:rPr>
-        <w:rFonts w:hint="default" w:ascii="Wingdings" w:hAnsi="Wingdings"/>
+        <w:rFonts w:ascii="Wingdings" w:hAnsi="Wingdings" w:hint="default"/>
         <w:sz w:val="20"/>
       </w:rPr>
     </w:lvl>
@@ -9693,7 +9891,7 @@
         <w:ind w:left="6480" w:hanging="360"/>
       </w:pPr>
       <w:rPr>
-        <w:rFonts w:hint="default" w:ascii="Wingdings" w:hAnsi="Wingdings"/>
+        <w:rFonts w:ascii="Wingdings" w:hAnsi="Wingdings" w:hint="default"/>
         <w:sz w:val="20"/>
       </w:rPr>
     </w:lvl>
@@ -9714,7 +9912,7 @@
         <w:ind w:left="720" w:hanging="360"/>
       </w:pPr>
       <w:rPr>
-        <w:rFonts w:hint="default" w:ascii="Symbol" w:hAnsi="Symbol"/>
+        <w:rFonts w:ascii="Symbol" w:hAnsi="Symbol" w:hint="default"/>
         <w:sz w:val="20"/>
       </w:rPr>
     </w:lvl>
@@ -9730,7 +9928,7 @@
         <w:ind w:left="1440" w:hanging="360"/>
       </w:pPr>
       <w:rPr>
-        <w:rFonts w:hint="default" w:ascii="Symbol" w:hAnsi="Symbol"/>
+        <w:rFonts w:ascii="Symbol" w:hAnsi="Symbol" w:hint="default"/>
         <w:sz w:val="20"/>
       </w:rPr>
     </w:lvl>
@@ -9746,7 +9944,7 @@
         <w:ind w:left="2160" w:hanging="360"/>
       </w:pPr>
       <w:rPr>
-        <w:rFonts w:hint="default" w:ascii="Symbol" w:hAnsi="Symbol"/>
+        <w:rFonts w:ascii="Symbol" w:hAnsi="Symbol" w:hint="default"/>
         <w:sz w:val="20"/>
       </w:rPr>
     </w:lvl>
@@ -9762,7 +9960,7 @@
         <w:ind w:left="2880" w:hanging="360"/>
       </w:pPr>
       <w:rPr>
-        <w:rFonts w:hint="default" w:ascii="Symbol" w:hAnsi="Symbol"/>
+        <w:rFonts w:ascii="Symbol" w:hAnsi="Symbol" w:hint="default"/>
         <w:sz w:val="20"/>
       </w:rPr>
     </w:lvl>
@@ -9778,7 +9976,7 @@
         <w:ind w:left="3600" w:hanging="360"/>
       </w:pPr>
       <w:rPr>
-        <w:rFonts w:hint="default" w:ascii="Symbol" w:hAnsi="Symbol"/>
+        <w:rFonts w:ascii="Symbol" w:hAnsi="Symbol" w:hint="default"/>
         <w:sz w:val="20"/>
       </w:rPr>
     </w:lvl>
@@ -9794,7 +9992,7 @@
         <w:ind w:left="4320" w:hanging="360"/>
       </w:pPr>
       <w:rPr>
-        <w:rFonts w:hint="default" w:ascii="Symbol" w:hAnsi="Symbol"/>
+        <w:rFonts w:ascii="Symbol" w:hAnsi="Symbol" w:hint="default"/>
         <w:sz w:val="20"/>
       </w:rPr>
     </w:lvl>
@@ -9810,7 +10008,7 @@
         <w:ind w:left="5040" w:hanging="360"/>
       </w:pPr>
       <w:rPr>
-        <w:rFonts w:hint="default" w:ascii="Symbol" w:hAnsi="Symbol"/>
+        <w:rFonts w:ascii="Symbol" w:hAnsi="Symbol" w:hint="default"/>
         <w:sz w:val="20"/>
       </w:rPr>
     </w:lvl>
@@ -9826,7 +10024,7 @@
         <w:ind w:left="5760" w:hanging="360"/>
       </w:pPr>
       <w:rPr>
-        <w:rFonts w:hint="default" w:ascii="Symbol" w:hAnsi="Symbol"/>
+        <w:rFonts w:ascii="Symbol" w:hAnsi="Symbol" w:hint="default"/>
         <w:sz w:val="20"/>
       </w:rPr>
     </w:lvl>
@@ -9842,7 +10040,7 @@
         <w:ind w:left="6480" w:hanging="360"/>
       </w:pPr>
       <w:rPr>
-        <w:rFonts w:hint="default" w:ascii="Symbol" w:hAnsi="Symbol"/>
+        <w:rFonts w:ascii="Symbol" w:hAnsi="Symbol" w:hint="default"/>
         <w:sz w:val="20"/>
       </w:rPr>
     </w:lvl>
@@ -9863,7 +10061,7 @@
         <w:ind w:left="720" w:hanging="360"/>
       </w:pPr>
       <w:rPr>
-        <w:rFonts w:hint="default" w:ascii="Symbol" w:hAnsi="Symbol"/>
+        <w:rFonts w:ascii="Symbol" w:hAnsi="Symbol" w:hint="default"/>
         <w:sz w:val="20"/>
       </w:rPr>
     </w:lvl>
@@ -9879,7 +10077,7 @@
         <w:ind w:left="1440" w:hanging="360"/>
       </w:pPr>
       <w:rPr>
-        <w:rFonts w:hint="default" w:ascii="Symbol" w:hAnsi="Symbol"/>
+        <w:rFonts w:ascii="Symbol" w:hAnsi="Symbol" w:hint="default"/>
         <w:sz w:val="20"/>
       </w:rPr>
     </w:lvl>
@@ -9895,7 +10093,7 @@
         <w:ind w:left="2160" w:hanging="360"/>
       </w:pPr>
       <w:rPr>
-        <w:rFonts w:hint="default" w:ascii="Symbol" w:hAnsi="Symbol"/>
+        <w:rFonts w:ascii="Symbol" w:hAnsi="Symbol" w:hint="default"/>
         <w:sz w:val="20"/>
       </w:rPr>
     </w:lvl>
@@ -9911,7 +10109,7 @@
         <w:ind w:left="2880" w:hanging="360"/>
       </w:pPr>
       <w:rPr>
-        <w:rFonts w:hint="default" w:ascii="Symbol" w:hAnsi="Symbol"/>
+        <w:rFonts w:ascii="Symbol" w:hAnsi="Symbol" w:hint="default"/>
         <w:sz w:val="20"/>
       </w:rPr>
     </w:lvl>
@@ -9927,7 +10125,7 @@
         <w:ind w:left="3600" w:hanging="360"/>
       </w:pPr>
       <w:rPr>
-        <w:rFonts w:hint="default" w:ascii="Symbol" w:hAnsi="Symbol"/>
+        <w:rFonts w:ascii="Symbol" w:hAnsi="Symbol" w:hint="default"/>
         <w:sz w:val="20"/>
       </w:rPr>
     </w:lvl>
@@ -9943,7 +10141,7 @@
         <w:ind w:left="4320" w:hanging="360"/>
       </w:pPr>
       <w:rPr>
-        <w:rFonts w:hint="default" w:ascii="Symbol" w:hAnsi="Symbol"/>
+        <w:rFonts w:ascii="Symbol" w:hAnsi="Symbol" w:hint="default"/>
         <w:sz w:val="20"/>
       </w:rPr>
     </w:lvl>
@@ -9959,7 +10157,7 @@
         <w:ind w:left="5040" w:hanging="360"/>
       </w:pPr>
       <w:rPr>
-        <w:rFonts w:hint="default" w:ascii="Symbol" w:hAnsi="Symbol"/>
+        <w:rFonts w:ascii="Symbol" w:hAnsi="Symbol" w:hint="default"/>
         <w:sz w:val="20"/>
       </w:rPr>
     </w:lvl>
@@ -9975,7 +10173,7 @@
         <w:ind w:left="5760" w:hanging="360"/>
       </w:pPr>
       <w:rPr>
-        <w:rFonts w:hint="default" w:ascii="Symbol" w:hAnsi="Symbol"/>
+        <w:rFonts w:ascii="Symbol" w:hAnsi="Symbol" w:hint="default"/>
         <w:sz w:val="20"/>
       </w:rPr>
     </w:lvl>
@@ -9991,7 +10189,7 @@
         <w:ind w:left="6480" w:hanging="360"/>
       </w:pPr>
       <w:rPr>
-        <w:rFonts w:hint="default" w:ascii="Symbol" w:hAnsi="Symbol"/>
+        <w:rFonts w:ascii="Symbol" w:hAnsi="Symbol" w:hint="default"/>
         <w:sz w:val="20"/>
       </w:rPr>
     </w:lvl>
@@ -10012,7 +10210,7 @@
         <w:ind w:left="720" w:hanging="360"/>
       </w:pPr>
       <w:rPr>
-        <w:rFonts w:hint="default" w:ascii="Symbol" w:hAnsi="Symbol"/>
+        <w:rFonts w:ascii="Symbol" w:hAnsi="Symbol" w:hint="default"/>
         <w:sz w:val="20"/>
       </w:rPr>
     </w:lvl>
@@ -10028,7 +10226,7 @@
         <w:ind w:left="1440" w:hanging="360"/>
       </w:pPr>
       <w:rPr>
-        <w:rFonts w:hint="default" w:ascii="Courier New" w:hAnsi="Courier New"/>
+        <w:rFonts w:ascii="Courier New" w:hAnsi="Courier New" w:hint="default"/>
         <w:sz w:val="20"/>
       </w:rPr>
     </w:lvl>
@@ -10044,7 +10242,7 @@
         <w:ind w:left="2160" w:hanging="360"/>
       </w:pPr>
       <w:rPr>
-        <w:rFonts w:hint="default" w:ascii="Wingdings" w:hAnsi="Wingdings"/>
+        <w:rFonts w:ascii="Wingdings" w:hAnsi="Wingdings" w:hint="default"/>
         <w:sz w:val="20"/>
       </w:rPr>
     </w:lvl>
@@ -10060,7 +10258,7 @@
         <w:ind w:left="2880" w:hanging="360"/>
       </w:pPr>
       <w:rPr>
-        <w:rFonts w:hint="default" w:ascii="Wingdings" w:hAnsi="Wingdings"/>
+        <w:rFonts w:ascii="Wingdings" w:hAnsi="Wingdings" w:hint="default"/>
         <w:sz w:val="20"/>
       </w:rPr>
     </w:lvl>
@@ -10076,7 +10274,7 @@
         <w:ind w:left="3600" w:hanging="360"/>
       </w:pPr>
       <w:rPr>
-        <w:rFonts w:hint="default" w:ascii="Wingdings" w:hAnsi="Wingdings"/>
+        <w:rFonts w:ascii="Wingdings" w:hAnsi="Wingdings" w:hint="default"/>
         <w:sz w:val="20"/>
       </w:rPr>
     </w:lvl>
@@ -10092,7 +10290,7 @@
         <w:ind w:left="4320" w:hanging="360"/>
       </w:pPr>
       <w:rPr>
-        <w:rFonts w:hint="default" w:ascii="Wingdings" w:hAnsi="Wingdings"/>
+        <w:rFonts w:ascii="Wingdings" w:hAnsi="Wingdings" w:hint="default"/>
         <w:sz w:val="20"/>
       </w:rPr>
     </w:lvl>
@@ -10108,7 +10306,7 @@
         <w:ind w:left="5040" w:hanging="360"/>
       </w:pPr>
       <w:rPr>
-        <w:rFonts w:hint="default" w:ascii="Wingdings" w:hAnsi="Wingdings"/>
+        <w:rFonts w:ascii="Wingdings" w:hAnsi="Wingdings" w:hint="default"/>
         <w:sz w:val="20"/>
       </w:rPr>
     </w:lvl>
@@ -10124,7 +10322,7 @@
         <w:ind w:left="5760" w:hanging="360"/>
       </w:pPr>
       <w:rPr>
-        <w:rFonts w:hint="default" w:ascii="Wingdings" w:hAnsi="Wingdings"/>
+        <w:rFonts w:ascii="Wingdings" w:hAnsi="Wingdings" w:hint="default"/>
         <w:sz w:val="20"/>
       </w:rPr>
     </w:lvl>
@@ -10140,7 +10338,7 @@
         <w:ind w:left="6480" w:hanging="360"/>
       </w:pPr>
       <w:rPr>
-        <w:rFonts w:hint="default" w:ascii="Wingdings" w:hAnsi="Wingdings"/>
+        <w:rFonts w:ascii="Wingdings" w:hAnsi="Wingdings" w:hint="default"/>
         <w:sz w:val="20"/>
       </w:rPr>
     </w:lvl>
@@ -10295,7 +10493,7 @@
   <w:docDefaults>
     <w:rPrDefault>
       <w:rPr>
-        <w:rFonts w:asciiTheme="minorHAnsi" w:hAnsiTheme="minorHAnsi" w:eastAsiaTheme="minorHAnsi" w:cstheme="minorBidi"/>
+        <w:rFonts w:asciiTheme="minorHAnsi" w:eastAsiaTheme="minorHAnsi" w:hAnsiTheme="minorHAnsi" w:cstheme="minorBidi"/>
         <w:kern w:val="2"/>
         <w:sz w:val="24"/>
         <w:szCs w:val="24"/>
@@ -10312,14 +10510,14 @@
   <w:latentStyles w:defLockedState="0" w:defUIPriority="99" w:defSemiHidden="0" w:defUnhideWhenUsed="0" w:defQFormat="0" w:count="376">
     <w:lsdException w:name="Normal" w:uiPriority="0" w:qFormat="1"/>
     <w:lsdException w:name="heading 1" w:uiPriority="9" w:qFormat="1"/>
-    <w:lsdException w:name="heading 2" w:uiPriority="9" w:semiHidden="1" w:unhideWhenUsed="1" w:qFormat="1"/>
-    <w:lsdException w:name="heading 3" w:uiPriority="9" w:semiHidden="1" w:unhideWhenUsed="1" w:qFormat="1"/>
-    <w:lsdException w:name="heading 4" w:uiPriority="9" w:semiHidden="1" w:unhideWhenUsed="1" w:qFormat="1"/>
-    <w:lsdException w:name="heading 5" w:uiPriority="9" w:semiHidden="1" w:unhideWhenUsed="1" w:qFormat="1"/>
-    <w:lsdException w:name="heading 6" w:uiPriority="9" w:semiHidden="1" w:unhideWhenUsed="1" w:qFormat="1"/>
-    <w:lsdException w:name="heading 7" w:uiPriority="9" w:semiHidden="1" w:unhideWhenUsed="1" w:qFormat="1"/>
-    <w:lsdException w:name="heading 8" w:uiPriority="9" w:semiHidden="1" w:unhideWhenUsed="1" w:qFormat="1"/>
-    <w:lsdException w:name="heading 9" w:uiPriority="9" w:semiHidden="1" w:unhideWhenUsed="1" w:qFormat="1"/>
+    <w:lsdException w:name="heading 2" w:semiHidden="1" w:uiPriority="9" w:unhideWhenUsed="1" w:qFormat="1"/>
+    <w:lsdException w:name="heading 3" w:semiHidden="1" w:uiPriority="9" w:unhideWhenUsed="1" w:qFormat="1"/>
+    <w:lsdException w:name="heading 4" w:semiHidden="1" w:uiPriority="9" w:unhideWhenUsed="1" w:qFormat="1"/>
+    <w:lsdException w:name="heading 5" w:semiHidden="1" w:uiPriority="9" w:unhideWhenUsed="1" w:qFormat="1"/>
+    <w:lsdException w:name="heading 6" w:semiHidden="1" w:uiPriority="9" w:unhideWhenUsed="1" w:qFormat="1"/>
+    <w:lsdException w:name="heading 7" w:semiHidden="1" w:uiPriority="9" w:unhideWhenUsed="1" w:qFormat="1"/>
+    <w:lsdException w:name="heading 8" w:semiHidden="1" w:uiPriority="9" w:unhideWhenUsed="1" w:qFormat="1"/>
+    <w:lsdException w:name="heading 9" w:semiHidden="1" w:uiPriority="9" w:unhideWhenUsed="1" w:qFormat="1"/>
     <w:lsdException w:name="index 1" w:semiHidden="1" w:unhideWhenUsed="1"/>
     <w:lsdException w:name="index 2" w:semiHidden="1" w:unhideWhenUsed="1"/>
     <w:lsdException w:name="index 3" w:semiHidden="1" w:unhideWhenUsed="1"/>
@@ -10329,22 +10527,22 @@
     <w:lsdException w:name="index 7" w:semiHidden="1" w:unhideWhenUsed="1"/>
     <w:lsdException w:name="index 8" w:semiHidden="1" w:unhideWhenUsed="1"/>
     <w:lsdException w:name="index 9" w:semiHidden="1" w:unhideWhenUsed="1"/>
-    <w:lsdException w:name="toc 1" w:uiPriority="39" w:semiHidden="1" w:unhideWhenUsed="1"/>
-    <w:lsdException w:name="toc 2" w:uiPriority="39" w:semiHidden="1" w:unhideWhenUsed="1"/>
-    <w:lsdException w:name="toc 3" w:uiPriority="39" w:semiHidden="1" w:unhideWhenUsed="1"/>
-    <w:lsdException w:name="toc 4" w:uiPriority="39" w:semiHidden="1" w:unhideWhenUsed="1"/>
-    <w:lsdException w:name="toc 5" w:uiPriority="39" w:semiHidden="1" w:unhideWhenUsed="1"/>
-    <w:lsdException w:name="toc 6" w:uiPriority="39" w:semiHidden="1" w:unhideWhenUsed="1"/>
-    <w:lsdException w:name="toc 7" w:uiPriority="39" w:semiHidden="1" w:unhideWhenUsed="1"/>
-    <w:lsdException w:name="toc 8" w:uiPriority="39" w:semiHidden="1" w:unhideWhenUsed="1"/>
-    <w:lsdException w:name="toc 9" w:uiPriority="39" w:semiHidden="1" w:unhideWhenUsed="1"/>
+    <w:lsdException w:name="toc 1" w:semiHidden="1" w:uiPriority="39" w:unhideWhenUsed="1"/>
+    <w:lsdException w:name="toc 2" w:semiHidden="1" w:uiPriority="39" w:unhideWhenUsed="1"/>
+    <w:lsdException w:name="toc 3" w:semiHidden="1" w:uiPriority="39" w:unhideWhenUsed="1"/>
+    <w:lsdException w:name="toc 4" w:semiHidden="1" w:uiPriority="39" w:unhideWhenUsed="1"/>
+    <w:lsdException w:name="toc 5" w:semiHidden="1" w:uiPriority="39" w:unhideWhenUsed="1"/>
+    <w:lsdException w:name="toc 6" w:semiHidden="1" w:uiPriority="39" w:unhideWhenUsed="1"/>
+    <w:lsdException w:name="toc 7" w:semiHidden="1" w:uiPriority="39" w:unhideWhenUsed="1"/>
+    <w:lsdException w:name="toc 8" w:semiHidden="1" w:uiPriority="39" w:unhideWhenUsed="1"/>
+    <w:lsdException w:name="toc 9" w:semiHidden="1" w:uiPriority="39" w:unhideWhenUsed="1"/>
     <w:lsdException w:name="Normal Indent" w:semiHidden="1" w:unhideWhenUsed="1"/>
     <w:lsdException w:name="footnote text" w:semiHidden="1" w:unhideWhenUsed="1"/>
     <w:lsdException w:name="annotation text" w:semiHidden="1" w:unhideWhenUsed="1"/>
     <w:lsdException w:name="header" w:semiHidden="1" w:unhideWhenUsed="1"/>
     <w:lsdException w:name="footer" w:semiHidden="1" w:unhideWhenUsed="1"/>
     <w:lsdException w:name="index heading" w:semiHidden="1" w:unhideWhenUsed="1"/>
-    <w:lsdException w:name="caption" w:uiPriority="35" w:semiHidden="1" w:unhideWhenUsed="1" w:qFormat="1"/>
+    <w:lsdException w:name="caption" w:semiHidden="1" w:uiPriority="35" w:unhideWhenUsed="1" w:qFormat="1"/>
     <w:lsdException w:name="table of figures" w:semiHidden="1" w:unhideWhenUsed="1"/>
     <w:lsdException w:name="envelope address" w:semiHidden="1" w:unhideWhenUsed="1"/>
     <w:lsdException w:name="envelope return" w:semiHidden="1" w:unhideWhenUsed="1"/>
@@ -10375,7 +10573,7 @@
     <w:lsdException w:name="Title" w:uiPriority="10" w:qFormat="1"/>
     <w:lsdException w:name="Closing" w:semiHidden="1" w:unhideWhenUsed="1"/>
     <w:lsdException w:name="Signature" w:semiHidden="1" w:unhideWhenUsed="1"/>
-    <w:lsdException w:name="Default Paragraph Font" w:uiPriority="1" w:semiHidden="1" w:unhideWhenUsed="1"/>
+    <w:lsdException w:name="Default Paragraph Font" w:semiHidden="1" w:uiPriority="1" w:unhideWhenUsed="1"/>
     <w:lsdException w:name="Body Text" w:semiHidden="1" w:unhideWhenUsed="1"/>
     <w:lsdException w:name="Body Text Indent" w:semiHidden="1" w:unhideWhenUsed="1"/>
     <w:lsdException w:name="List Continue" w:semiHidden="1" w:unhideWhenUsed="1"/>
@@ -10575,8 +10773,8 @@
     <w:lsdException w:name="Subtle Reference" w:uiPriority="31" w:qFormat="1"/>
     <w:lsdException w:name="Intense Reference" w:uiPriority="32" w:qFormat="1"/>
     <w:lsdException w:name="Book Title" w:uiPriority="33" w:qFormat="1"/>
-    <w:lsdException w:name="Bibliography" w:uiPriority="37" w:semiHidden="1" w:unhideWhenUsed="1"/>
-    <w:lsdException w:name="TOC Heading" w:uiPriority="39" w:semiHidden="1" w:unhideWhenUsed="1" w:qFormat="1"/>
+    <w:lsdException w:name="Bibliography" w:semiHidden="1" w:uiPriority="37" w:unhideWhenUsed="1"/>
+    <w:lsdException w:name="TOC Heading" w:semiHidden="1" w:uiPriority="39" w:unhideWhenUsed="1" w:qFormat="1"/>
     <w:lsdException w:name="Plain Table 1" w:uiPriority="41"/>
     <w:lsdException w:name="Plain Table 2" w:uiPriority="42"/>
     <w:lsdException w:name="Plain Table 3" w:uiPriority="43"/>
@@ -10687,7 +10885,7 @@
     <w:lsdException w:name="Unresolved Mention" w:semiHidden="1" w:unhideWhenUsed="1"/>
     <w:lsdException w:name="Smart Link" w:semiHidden="1" w:unhideWhenUsed="1"/>
   </w:latentStyles>
-  <w:style w:type="paragraph" w:styleId="Normal" w:default="1">
+  <w:style w:type="paragraph" w:default="1" w:styleId="Normal">
     <w:name w:val="Normal"/>
     <w:qFormat/>
   </w:style>
@@ -10706,7 +10904,7 @@
       <w:outlineLvl w:val="0"/>
     </w:pPr>
     <w:rPr>
-      <w:rFonts w:asciiTheme="majorHAnsi" w:hAnsiTheme="majorHAnsi" w:eastAsiaTheme="majorEastAsia" w:cstheme="majorBidi"/>
+      <w:rFonts w:asciiTheme="majorHAnsi" w:eastAsiaTheme="majorEastAsia" w:hAnsiTheme="majorHAnsi" w:cstheme="majorBidi"/>
       <w:color w:val="0F4761" w:themeColor="accent1" w:themeShade="BF"/>
       <w:sz w:val="40"/>
       <w:szCs w:val="40"/>
@@ -10729,7 +10927,7 @@
       <w:outlineLvl w:val="1"/>
     </w:pPr>
     <w:rPr>
-      <w:rFonts w:asciiTheme="majorHAnsi" w:hAnsiTheme="majorHAnsi" w:eastAsiaTheme="majorEastAsia" w:cstheme="majorBidi"/>
+      <w:rFonts w:asciiTheme="majorHAnsi" w:eastAsiaTheme="majorEastAsia" w:hAnsiTheme="majorHAnsi" w:cstheme="majorBidi"/>
       <w:color w:val="0F4761" w:themeColor="accent1" w:themeShade="BF"/>
       <w:sz w:val="32"/>
       <w:szCs w:val="32"/>
@@ -10890,13 +11088,13 @@
       <w:color w:val="272727" w:themeColor="text1" w:themeTint="D8"/>
     </w:rPr>
   </w:style>
-  <w:style w:type="character" w:styleId="DefaultParagraphFont" w:default="1">
+  <w:style w:type="character" w:default="1" w:styleId="DefaultParagraphFont">
     <w:name w:val="Default Paragraph Font"/>
     <w:uiPriority w:val="1"/>
     <w:semiHidden/>
     <w:unhideWhenUsed/>
   </w:style>
-  <w:style w:type="table" w:styleId="TableNormal" w:default="1">
+  <w:style w:type="table" w:default="1" w:styleId="TableNormal">
     <w:name w:val="Normal Table"/>
     <w:uiPriority w:val="99"/>
     <w:semiHidden/>
@@ -10911,26 +11109,26 @@
       </w:tblCellMar>
     </w:tblPr>
   </w:style>
-  <w:style w:type="numbering" w:styleId="NoList" w:default="1">
+  <w:style w:type="numbering" w:default="1" w:styleId="NoList">
     <w:name w:val="No List"/>
     <w:uiPriority w:val="99"/>
     <w:semiHidden/>
     <w:unhideWhenUsed/>
   </w:style>
-  <w:style w:type="character" w:styleId="Heading1Char" w:customStyle="1">
+  <w:style w:type="character" w:customStyle="1" w:styleId="Heading1Char">
     <w:name w:val="Heading 1 Char"/>
     <w:basedOn w:val="DefaultParagraphFont"/>
     <w:link w:val="Heading1"/>
     <w:uiPriority w:val="9"/>
     <w:rsid w:val="003E6B6B"/>
     <w:rPr>
-      <w:rFonts w:asciiTheme="majorHAnsi" w:hAnsiTheme="majorHAnsi" w:eastAsiaTheme="majorEastAsia" w:cstheme="majorBidi"/>
+      <w:rFonts w:asciiTheme="majorHAnsi" w:eastAsiaTheme="majorEastAsia" w:hAnsiTheme="majorHAnsi" w:cstheme="majorBidi"/>
       <w:color w:val="0F4761" w:themeColor="accent1" w:themeShade="BF"/>
       <w:sz w:val="40"/>
       <w:szCs w:val="40"/>
     </w:rPr>
   </w:style>
-  <w:style w:type="character" w:styleId="Heading2Char" w:customStyle="1">
+  <w:style w:type="character" w:customStyle="1" w:styleId="Heading2Char">
     <w:name w:val="Heading 2 Char"/>
     <w:basedOn w:val="DefaultParagraphFont"/>
     <w:link w:val="Heading2"/>
@@ -10938,13 +11136,13 @@
     <w:semiHidden/>
     <w:rsid w:val="003E6B6B"/>
     <w:rPr>
-      <w:rFonts w:asciiTheme="majorHAnsi" w:hAnsiTheme="majorHAnsi" w:eastAsiaTheme="majorEastAsia" w:cstheme="majorBidi"/>
+      <w:rFonts w:asciiTheme="majorHAnsi" w:eastAsiaTheme="majorEastAsia" w:hAnsiTheme="majorHAnsi" w:cstheme="majorBidi"/>
       <w:color w:val="0F4761" w:themeColor="accent1" w:themeShade="BF"/>
       <w:sz w:val="32"/>
       <w:szCs w:val="32"/>
     </w:rPr>
   </w:style>
-  <w:style w:type="character" w:styleId="Heading3Char" w:customStyle="1">
+  <w:style w:type="character" w:customStyle="1" w:styleId="Heading3Char">
     <w:name w:val="Heading 3 Char"/>
     <w:basedOn w:val="DefaultParagraphFont"/>
     <w:link w:val="Heading3"/>
@@ -10958,7 +11156,7 @@
       <w:szCs w:val="28"/>
     </w:rPr>
   </w:style>
-  <w:style w:type="character" w:styleId="Heading4Char" w:customStyle="1">
+  <w:style w:type="character" w:customStyle="1" w:styleId="Heading4Char">
     <w:name w:val="Heading 4 Char"/>
     <w:basedOn w:val="DefaultParagraphFont"/>
     <w:link w:val="Heading4"/>
@@ -10972,7 +11170,7 @@
       <w:color w:val="0F4761" w:themeColor="accent1" w:themeShade="BF"/>
     </w:rPr>
   </w:style>
-  <w:style w:type="character" w:styleId="Heading5Char" w:customStyle="1">
+  <w:style w:type="character" w:customStyle="1" w:styleId="Heading5Char">
     <w:name w:val="Heading 5 Char"/>
     <w:basedOn w:val="DefaultParagraphFont"/>
     <w:link w:val="Heading5"/>
@@ -10984,7 +11182,7 @@
       <w:color w:val="0F4761" w:themeColor="accent1" w:themeShade="BF"/>
     </w:rPr>
   </w:style>
-  <w:style w:type="character" w:styleId="Heading6Char" w:customStyle="1">
+  <w:style w:type="character" w:customStyle="1" w:styleId="Heading6Char">
     <w:name w:val="Heading 6 Char"/>
     <w:basedOn w:val="DefaultParagraphFont"/>
     <w:link w:val="Heading6"/>
@@ -10998,7 +11196,7 @@
       <w:color w:val="595959" w:themeColor="text1" w:themeTint="A6"/>
     </w:rPr>
   </w:style>
-  <w:style w:type="character" w:styleId="Heading7Char" w:customStyle="1">
+  <w:style w:type="character" w:customStyle="1" w:styleId="Heading7Char">
     <w:name w:val="Heading 7 Char"/>
     <w:basedOn w:val="DefaultParagraphFont"/>
     <w:link w:val="Heading7"/>
@@ -11010,7 +11208,7 @@
       <w:color w:val="595959" w:themeColor="text1" w:themeTint="A6"/>
     </w:rPr>
   </w:style>
-  <w:style w:type="character" w:styleId="Heading8Char" w:customStyle="1">
+  <w:style w:type="character" w:customStyle="1" w:styleId="Heading8Char">
     <w:name w:val="Heading 8 Char"/>
     <w:basedOn w:val="DefaultParagraphFont"/>
     <w:link w:val="Heading8"/>
@@ -11024,7 +11222,7 @@
       <w:color w:val="272727" w:themeColor="text1" w:themeTint="D8"/>
     </w:rPr>
   </w:style>
-  <w:style w:type="character" w:styleId="Heading9Char" w:customStyle="1">
+  <w:style w:type="character" w:customStyle="1" w:styleId="Heading9Char">
     <w:name w:val="Heading 9 Char"/>
     <w:basedOn w:val="DefaultParagraphFont"/>
     <w:link w:val="Heading9"/>
@@ -11049,21 +11247,21 @@
       <w:contextualSpacing/>
     </w:pPr>
     <w:rPr>
-      <w:rFonts w:asciiTheme="majorHAnsi" w:hAnsiTheme="majorHAnsi" w:eastAsiaTheme="majorEastAsia" w:cstheme="majorBidi"/>
+      <w:rFonts w:asciiTheme="majorHAnsi" w:eastAsiaTheme="majorEastAsia" w:hAnsiTheme="majorHAnsi" w:cstheme="majorBidi"/>
       <w:spacing w:val="-10"/>
       <w:kern w:val="28"/>
       <w:sz w:val="56"/>
       <w:szCs w:val="56"/>
     </w:rPr>
   </w:style>
-  <w:style w:type="character" w:styleId="TitleChar" w:customStyle="1">
+  <w:style w:type="character" w:customStyle="1" w:styleId="TitleChar">
     <w:name w:val="Title Char"/>
     <w:basedOn w:val="DefaultParagraphFont"/>
     <w:link w:val="Title"/>
     <w:uiPriority w:val="10"/>
     <w:rsid w:val="003E6B6B"/>
     <w:rPr>
-      <w:rFonts w:asciiTheme="majorHAnsi" w:hAnsiTheme="majorHAnsi" w:eastAsiaTheme="majorEastAsia" w:cstheme="majorBidi"/>
+      <w:rFonts w:asciiTheme="majorHAnsi" w:eastAsiaTheme="majorEastAsia" w:hAnsiTheme="majorHAnsi" w:cstheme="majorBidi"/>
       <w:spacing w:val="-10"/>
       <w:kern w:val="28"/>
       <w:sz w:val="56"/>
@@ -11091,7 +11289,7 @@
       <w:szCs w:val="28"/>
     </w:rPr>
   </w:style>
-  <w:style w:type="character" w:styleId="SubtitleChar" w:customStyle="1">
+  <w:style w:type="character" w:customStyle="1" w:styleId="SubtitleChar">
     <w:name w:val="Subtitle Char"/>
     <w:basedOn w:val="DefaultParagraphFont"/>
     <w:link w:val="Subtitle"/>
@@ -11123,7 +11321,7 @@
       <w:color w:val="404040" w:themeColor="text1" w:themeTint="BF"/>
     </w:rPr>
   </w:style>
-  <w:style w:type="character" w:styleId="QuoteChar" w:customStyle="1">
+  <w:style w:type="character" w:customStyle="1" w:styleId="QuoteChar">
     <w:name w:val="Quote Char"/>
     <w:basedOn w:val="DefaultParagraphFont"/>
     <w:link w:val="Quote"/>
@@ -11168,8 +11366,8 @@
     <w:rsid w:val="003E6B6B"/>
     <w:pPr>
       <w:pBdr>
-        <w:top w:val="single" w:color="0F4761" w:themeColor="accent1" w:themeShade="BF" w:sz="4" w:space="10"/>
-        <w:bottom w:val="single" w:color="0F4761" w:themeColor="accent1" w:themeShade="BF" w:sz="4" w:space="10"/>
+        <w:top w:val="single" w:sz="4" w:space="10" w:color="0F4761" w:themeColor="accent1" w:themeShade="BF"/>
+        <w:bottom w:val="single" w:sz="4" w:space="10" w:color="0F4761" w:themeColor="accent1" w:themeShade="BF"/>
       </w:pBdr>
       <w:spacing w:before="360" w:after="360"/>
       <w:ind w:left="864" w:right="864"/>
@@ -11181,7 +11379,7 @@
       <w:color w:val="0F4761" w:themeColor="accent1" w:themeShade="BF"/>
     </w:rPr>
   </w:style>
-  <w:style w:type="character" w:styleId="IntenseQuoteChar" w:customStyle="1">
+  <w:style w:type="character" w:customStyle="1" w:styleId="IntenseQuoteChar">
     <w:name w:val="Intense Quote Char"/>
     <w:basedOn w:val="DefaultParagraphFont"/>
     <w:link w:val="IntenseQuote"/>
@@ -11217,12 +11415,12 @@
     </w:pPr>
     <w:tblPr>
       <w:tblBorders>
-        <w:top w:val="single" w:color="auto" w:sz="4" w:space="0"/>
-        <w:left w:val="single" w:color="auto" w:sz="4" w:space="0"/>
-        <w:bottom w:val="single" w:color="auto" w:sz="4" w:space="0"/>
-        <w:right w:val="single" w:color="auto" w:sz="4" w:space="0"/>
-        <w:insideH w:val="single" w:color="auto" w:sz="4" w:space="0"/>
-        <w:insideV w:val="single" w:color="auto" w:sz="4" w:space="0"/>
+        <w:top w:val="single" w:sz="4" w:space="0" w:color="auto"/>
+        <w:left w:val="single" w:sz="4" w:space="0" w:color="auto"/>
+        <w:bottom w:val="single" w:sz="4" w:space="0" w:color="auto"/>
+        <w:right w:val="single" w:sz="4" w:space="0" w:color="auto"/>
+        <w:insideH w:val="single" w:sz="4" w:space="0" w:color="auto"/>
+        <w:insideV w:val="single" w:sz="4" w:space="0" w:color="auto"/>
       </w:tblBorders>
     </w:tblPr>
   </w:style>
@@ -11253,7 +11451,7 @@
       <w:szCs w:val="20"/>
     </w:rPr>
   </w:style>
-  <w:style w:type="character" w:styleId="CommentTextChar" w:customStyle="1">
+  <w:style w:type="character" w:customStyle="1" w:styleId="CommentTextChar">
     <w:name w:val="Comment Text Char"/>
     <w:basedOn w:val="DefaultParagraphFont"/>
     <w:link w:val="CommentText"/>
@@ -11278,7 +11476,7 @@
       <w:bCs/>
     </w:rPr>
   </w:style>
-  <w:style w:type="character" w:styleId="CommentSubjectChar" w:customStyle="1">
+  <w:style w:type="character" w:customStyle="1" w:styleId="CommentSubjectChar">
     <w:name w:val="Comment Subject Char"/>
     <w:basedOn w:val="CommentTextChar"/>
     <w:link w:val="CommentSubject"/>
@@ -11296,7 +11494,7 @@
 </file>
 
 <file path=word/theme/theme1.xml><?xml version="1.0" encoding="utf-8"?>
-<a:theme xmlns:a="http://schemas.openxmlformats.org/drawingml/2006/main" xmlns:thm15="http://schemas.microsoft.com/office/thememl/2012/main" name="Office Theme">
+<a:theme xmlns:a="http://schemas.openxmlformats.org/drawingml/2006/main" name="Office Theme">
   <a:themeElements>
     <a:clrScheme name="Office">
       <a:dk1>

</xml_diff>